<commit_message>
docs(G1-03): revise and finalize proposal candidate
</commit_message>
<xml_diff>
--- a/docs/deliverables/01-项目建议书.docx
+++ b/docs/deliverables/01-项目建议书.docx
@@ -9,13 +9,39 @@
     <w:p/>
     <w:p>
       <w:pPr>
+        <w:jc w:val="right"/>
+      </w:pPr>
+      <w:r>
+        <w:rPr>
+          <w:rFonts w:ascii="宋体" w:hAnsi="宋体" w:eastAsia="宋体"/>
+          <w:b w:val="0"/>
+          <w:sz w:val="24"/>
+        </w:rPr>
+        <w:t>文档编号：【待人工确认】    版本号：V0.9</w:t>
+      </w:r>
+    </w:p>
+    <w:p>
+      <w:pPr>
+        <w:jc w:val="right"/>
+      </w:pPr>
+      <w:r>
+        <w:rPr>
+          <w:rFonts w:ascii="宋体" w:hAnsi="宋体" w:eastAsia="宋体"/>
+          <w:b w:val="0"/>
+          <w:sz w:val="24"/>
+        </w:rPr>
+        <w:t>密  级：【待人工确认】</w:t>
+      </w:r>
+    </w:p>
+    <w:p>
+      <w:pPr>
         <w:jc w:val="center"/>
       </w:pPr>
       <w:r>
         <w:rPr>
-          <w:rFonts w:ascii="宋体" w:hAnsi="宋体" w:eastAsia="宋体"/>
+          <w:rFonts w:ascii="黑体" w:hAnsi="黑体" w:eastAsia="黑体"/>
           <w:b/>
-          <w:sz w:val="36"/>
+          <w:sz w:val="44"/>
         </w:rPr>
         <w:t>某自然博物馆智能运营中心建设项目——应急管理子系统</w:t>
       </w:r>
@@ -26,9 +52,9 @@
       </w:pPr>
       <w:r>
         <w:rPr>
-          <w:rFonts w:ascii="宋体" w:hAnsi="宋体" w:eastAsia="宋体"/>
+          <w:rFonts w:ascii="黑体" w:hAnsi="黑体" w:eastAsia="黑体"/>
           <w:b/>
-          <w:sz w:val="48"/>
+          <w:sz w:val="56"/>
         </w:rPr>
         <w:t>项 目 建 议 书</w:t>
       </w:r>
@@ -50,20 +76,7 @@
           <w:b w:val="0"/>
           <w:sz w:val="24"/>
         </w:rPr>
-        <w:t>版本：V0.9</w:t>
-      </w:r>
-    </w:p>
-    <w:p>
-      <w:pPr>
-        <w:jc w:val="center"/>
-      </w:pPr>
-      <w:r>
-        <w:rPr>
-          <w:rFonts w:ascii="宋体" w:hAnsi="宋体" w:eastAsia="宋体"/>
-          <w:b w:val="0"/>
-          <w:sz w:val="24"/>
-        </w:rPr>
-        <w:t>状态：符合性复核前候选稿</w:t>
+        <w:t>编制单位：【待人工确认】</w:t>
       </w:r>
     </w:p>
     <w:p>
@@ -89,7 +102,20 @@
           <w:b w:val="0"/>
           <w:sz w:val="24"/>
         </w:rPr>
-        <w:t>复核：C（符合性复核）</w:t>
+        <w:t>审核：C（符合性复核）</w:t>
+      </w:r>
+    </w:p>
+    <w:p>
+      <w:pPr>
+        <w:jc w:val="center"/>
+      </w:pPr>
+      <w:r>
+        <w:rPr>
+          <w:rFonts w:ascii="宋体" w:hAnsi="宋体" w:eastAsia="宋体"/>
+          <w:b w:val="0"/>
+          <w:sz w:val="24"/>
+        </w:rPr>
+        <w:t>批准：【待人工确认】</w:t>
       </w:r>
     </w:p>
     <w:p>
@@ -103,123 +129,6 @@
           <w:sz w:val="24"/>
         </w:rPr>
         <w:t>编制日期：2026 年 9 月 10 日</w:t>
-      </w:r>
-    </w:p>
-    <w:p>
-      <w:r>
-        <w:br w:type="page"/>
-      </w:r>
-    </w:p>
-    <w:p>
-      <w:pPr>
-        <w:pStyle w:val="Heading1"/>
-      </w:pPr>
-      <w:r>
-        <w:t>目录</w:t>
-      </w:r>
-    </w:p>
-    <w:p>
-      <w:pPr>
-        <w:spacing w:line="360" w:lineRule="auto" w:after="120"/>
-      </w:pPr>
-      <w:r>
-        <w:rPr>
-          <w:rFonts w:ascii="宋体" w:hAnsi="宋体" w:eastAsia="宋体"/>
-          <w:b w:val="0"/>
-          <w:sz w:val="21"/>
-        </w:rPr>
-        <w:t>修订记录</w:t>
-      </w:r>
-    </w:p>
-    <w:p>
-      <w:pPr>
-        <w:spacing w:line="360" w:lineRule="auto" w:after="120"/>
-      </w:pPr>
-      <w:r>
-        <w:rPr>
-          <w:rFonts w:ascii="宋体" w:hAnsi="宋体" w:eastAsia="宋体"/>
-          <w:b w:val="0"/>
-          <w:sz w:val="21"/>
-        </w:rPr>
-        <w:t>1 项目背景与问题理解</w:t>
-      </w:r>
-    </w:p>
-    <w:p>
-      <w:pPr>
-        <w:spacing w:line="360" w:lineRule="auto" w:after="120"/>
-      </w:pPr>
-      <w:r>
-        <w:rPr>
-          <w:rFonts w:ascii="宋体" w:hAnsi="宋体" w:eastAsia="宋体"/>
-          <w:b w:val="0"/>
-          <w:sz w:val="21"/>
-        </w:rPr>
-        <w:t>2 建设目标与建设内容</w:t>
-      </w:r>
-    </w:p>
-    <w:p>
-      <w:pPr>
-        <w:spacing w:line="360" w:lineRule="auto" w:after="120"/>
-      </w:pPr>
-      <w:r>
-        <w:rPr>
-          <w:rFonts w:ascii="宋体" w:hAnsi="宋体" w:eastAsia="宋体"/>
-          <w:b w:val="0"/>
-          <w:sz w:val="21"/>
-        </w:rPr>
-        <w:t>3 初步总体方案</w:t>
-      </w:r>
-    </w:p>
-    <w:p>
-      <w:pPr>
-        <w:spacing w:line="360" w:lineRule="auto" w:after="120"/>
-      </w:pPr>
-      <w:r>
-        <w:rPr>
-          <w:rFonts w:ascii="宋体" w:hAnsi="宋体" w:eastAsia="宋体"/>
-          <w:b w:val="0"/>
-          <w:sz w:val="21"/>
-        </w:rPr>
-        <w:t>4 初步实施思路</w:t>
-      </w:r>
-    </w:p>
-    <w:p>
-      <w:pPr>
-        <w:spacing w:line="360" w:lineRule="auto" w:after="120"/>
-      </w:pPr>
-      <w:r>
-        <w:rPr>
-          <w:rFonts w:ascii="宋体" w:hAnsi="宋体" w:eastAsia="宋体"/>
-          <w:b w:val="0"/>
-          <w:sz w:val="21"/>
-        </w:rPr>
-        <w:t>5 项目价值与可行性分析</w:t>
-      </w:r>
-    </w:p>
-    <w:p>
-      <w:pPr>
-        <w:spacing w:line="360" w:lineRule="auto" w:after="120"/>
-      </w:pPr>
-      <w:r>
-        <w:rPr>
-          <w:rFonts w:ascii="宋体" w:hAnsi="宋体" w:eastAsia="宋体"/>
-          <w:b w:val="0"/>
-          <w:sz w:val="21"/>
-        </w:rPr>
-        <w:t>6 主要风险及应对思路</w:t>
-      </w:r>
-    </w:p>
-    <w:p>
-      <w:pPr>
-        <w:spacing w:line="360" w:lineRule="auto" w:after="120"/>
-      </w:pPr>
-      <w:r>
-        <w:rPr>
-          <w:rFonts w:ascii="宋体" w:hAnsi="宋体" w:eastAsia="宋体"/>
-          <w:b w:val="0"/>
-          <w:sz w:val="21"/>
-        </w:rPr>
-        <w:t>7 结论与建议</w:t>
       </w:r>
     </w:p>
     <w:p>
@@ -251,13 +160,13 @@
         </w:tblBorders>
       </w:tblPr>
       <w:tblGrid>
-        <w:gridCol w:w="4680"/>
-        <w:gridCol w:w="4680"/>
+        <w:gridCol w:w="4513"/>
+        <w:gridCol w:w="4513"/>
       </w:tblGrid>
       <w:tr>
         <w:tc>
           <w:tcPr>
-            <w:tcW w:type="dxa" w:w="4680"/>
+            <w:tcW w:type="dxa" w:w="4513"/>
             <w:vAlign w:val="center"/>
             <w:shd w:fill="1F4E78"/>
           </w:tcPr>
@@ -278,7 +187,7 @@
         </w:tc>
         <w:tc>
           <w:tcPr>
-            <w:tcW w:type="dxa" w:w="4680"/>
+            <w:tcW w:type="dxa" w:w="4513"/>
             <w:vAlign w:val="center"/>
             <w:shd w:fill="1F4E78"/>
           </w:tcPr>
@@ -301,7 +210,7 @@
       <w:tr>
         <w:tc>
           <w:tcPr>
-            <w:tcW w:type="dxa" w:w="4680"/>
+            <w:tcW w:type="dxa" w:w="4513"/>
             <w:vAlign w:val="center"/>
           </w:tcPr>
           <w:p>
@@ -320,7 +229,7 @@
         </w:tc>
         <w:tc>
           <w:tcPr>
-            <w:tcW w:type="dxa" w:w="4680"/>
+            <w:tcW w:type="dxa" w:w="4513"/>
             <w:vAlign w:val="center"/>
           </w:tcPr>
           <w:p>
@@ -341,7 +250,7 @@
       <w:tr>
         <w:tc>
           <w:tcPr>
-            <w:tcW w:type="dxa" w:w="4680"/>
+            <w:tcW w:type="dxa" w:w="4513"/>
             <w:vAlign w:val="center"/>
           </w:tcPr>
           <w:p>
@@ -360,7 +269,7 @@
         </w:tc>
         <w:tc>
           <w:tcPr>
-            <w:tcW w:type="dxa" w:w="4680"/>
+            <w:tcW w:type="dxa" w:w="4513"/>
             <w:vAlign w:val="center"/>
           </w:tcPr>
           <w:p>
@@ -381,7 +290,7 @@
       <w:tr>
         <w:tc>
           <w:tcPr>
-            <w:tcW w:type="dxa" w:w="4680"/>
+            <w:tcW w:type="dxa" w:w="4513"/>
             <w:vAlign w:val="center"/>
           </w:tcPr>
           <w:p>
@@ -400,7 +309,7 @@
         </w:tc>
         <w:tc>
           <w:tcPr>
-            <w:tcW w:type="dxa" w:w="4680"/>
+            <w:tcW w:type="dxa" w:w="4513"/>
             <w:vAlign w:val="center"/>
           </w:tcPr>
           <w:p>
@@ -413,7 +322,7 @@
                 <w:b w:val="0"/>
                 <w:sz w:val="19"/>
               </w:rPr>
-              <w:t>DRAFT</w:t>
+              <w:t>REVIEW（已按 C 复核意见修订，待复验）</w:t>
             </w:r>
           </w:p>
         </w:tc>
@@ -421,7 +330,7 @@
       <w:tr>
         <w:tc>
           <w:tcPr>
-            <w:tcW w:type="dxa" w:w="4680"/>
+            <w:tcW w:type="dxa" w:w="4513"/>
             <w:vAlign w:val="center"/>
           </w:tcPr>
           <w:p>
@@ -440,7 +349,7 @@
         </w:tc>
         <w:tc>
           <w:tcPr>
-            <w:tcW w:type="dxa" w:w="4680"/>
+            <w:tcW w:type="dxa" w:w="4513"/>
             <w:vAlign w:val="center"/>
           </w:tcPr>
           <w:p>
@@ -461,7 +370,7 @@
       <w:tr>
         <w:tc>
           <w:tcPr>
-            <w:tcW w:type="dxa" w:w="4680"/>
+            <w:tcW w:type="dxa" w:w="4513"/>
             <w:vAlign w:val="center"/>
           </w:tcPr>
           <w:p>
@@ -480,7 +389,7 @@
         </w:tc>
         <w:tc>
           <w:tcPr>
-            <w:tcW w:type="dxa" w:w="4680"/>
+            <w:tcW w:type="dxa" w:w="4513"/>
             <w:vAlign w:val="center"/>
           </w:tcPr>
           <w:p>
@@ -501,7 +410,7 @@
       <w:tr>
         <w:tc>
           <w:tcPr>
-            <w:tcW w:type="dxa" w:w="4680"/>
+            <w:tcW w:type="dxa" w:w="4513"/>
             <w:vAlign w:val="center"/>
           </w:tcPr>
           <w:p>
@@ -520,7 +429,7 @@
         </w:tc>
         <w:tc>
           <w:tcPr>
-            <w:tcW w:type="dxa" w:w="4680"/>
+            <w:tcW w:type="dxa" w:w="4513"/>
             <w:vAlign w:val="center"/>
           </w:tcPr>
           <w:p>
@@ -541,7 +450,7 @@
       <w:tr>
         <w:tc>
           <w:tcPr>
-            <w:tcW w:type="dxa" w:w="4680"/>
+            <w:tcW w:type="dxa" w:w="4513"/>
             <w:vAlign w:val="center"/>
           </w:tcPr>
           <w:p>
@@ -560,7 +469,7 @@
         </w:tc>
         <w:tc>
           <w:tcPr>
-            <w:tcW w:type="dxa" w:w="4680"/>
+            <w:tcW w:type="dxa" w:w="4513"/>
             <w:vAlign w:val="center"/>
           </w:tcPr>
           <w:p>
@@ -604,16 +513,16 @@
         </w:tblBorders>
       </w:tblPr>
       <w:tblGrid>
-        <w:gridCol w:w="1872"/>
-        <w:gridCol w:w="1872"/>
-        <w:gridCol w:w="1872"/>
-        <w:gridCol w:w="1872"/>
-        <w:gridCol w:w="1872"/>
+        <w:gridCol w:w="1805"/>
+        <w:gridCol w:w="1805"/>
+        <w:gridCol w:w="1805"/>
+        <w:gridCol w:w="1805"/>
+        <w:gridCol w:w="1805"/>
       </w:tblGrid>
       <w:tr>
         <w:tc>
           <w:tcPr>
-            <w:tcW w:type="dxa" w:w="1872"/>
+            <w:tcW w:type="dxa" w:w="1805"/>
             <w:vAlign w:val="center"/>
             <w:shd w:fill="1F4E78"/>
           </w:tcPr>
@@ -634,7 +543,7 @@
         </w:tc>
         <w:tc>
           <w:tcPr>
-            <w:tcW w:type="dxa" w:w="1872"/>
+            <w:tcW w:type="dxa" w:w="1805"/>
             <w:vAlign w:val="center"/>
             <w:shd w:fill="1F4E78"/>
           </w:tcPr>
@@ -655,7 +564,7 @@
         </w:tc>
         <w:tc>
           <w:tcPr>
-            <w:tcW w:type="dxa" w:w="1872"/>
+            <w:tcW w:type="dxa" w:w="1805"/>
             <w:vAlign w:val="center"/>
             <w:shd w:fill="1F4E78"/>
           </w:tcPr>
@@ -676,7 +585,7 @@
         </w:tc>
         <w:tc>
           <w:tcPr>
-            <w:tcW w:type="dxa" w:w="1872"/>
+            <w:tcW w:type="dxa" w:w="1805"/>
             <w:vAlign w:val="center"/>
             <w:shd w:fill="1F4E78"/>
           </w:tcPr>
@@ -697,7 +606,7 @@
         </w:tc>
         <w:tc>
           <w:tcPr>
-            <w:tcW w:type="dxa" w:w="1872"/>
+            <w:tcW w:type="dxa" w:w="1805"/>
             <w:vAlign w:val="center"/>
             <w:shd w:fill="1F4E78"/>
           </w:tcPr>
@@ -720,7 +629,7 @@
       <w:tr>
         <w:tc>
           <w:tcPr>
-            <w:tcW w:type="dxa" w:w="1872"/>
+            <w:tcW w:type="dxa" w:w="1805"/>
             <w:vAlign w:val="center"/>
           </w:tcPr>
           <w:p>
@@ -739,7 +648,7 @@
         </w:tc>
         <w:tc>
           <w:tcPr>
-            <w:tcW w:type="dxa" w:w="1872"/>
+            <w:tcW w:type="dxa" w:w="1805"/>
             <w:vAlign w:val="center"/>
           </w:tcPr>
           <w:p>
@@ -758,7 +667,7 @@
         </w:tc>
         <w:tc>
           <w:tcPr>
-            <w:tcW w:type="dxa" w:w="1872"/>
+            <w:tcW w:type="dxa" w:w="1805"/>
             <w:vAlign w:val="center"/>
           </w:tcPr>
           <w:p>
@@ -777,7 +686,7 @@
         </w:tc>
         <w:tc>
           <w:tcPr>
-            <w:tcW w:type="dxa" w:w="1872"/>
+            <w:tcW w:type="dxa" w:w="1805"/>
             <w:vAlign w:val="center"/>
           </w:tcPr>
           <w:p>
@@ -796,7 +705,7 @@
         </w:tc>
         <w:tc>
           <w:tcPr>
-            <w:tcW w:type="dxa" w:w="1872"/>
+            <w:tcW w:type="dxa" w:w="1805"/>
             <w:vAlign w:val="center"/>
           </w:tcPr>
           <w:p>
@@ -827,6 +736,8 @@
     <w:p>
       <w:pPr>
         <w:spacing w:line="360" w:lineRule="auto" w:after="120"/>
+        <w:ind w:firstLine="420"/>
+        <w:jc w:val="both"/>
       </w:pPr>
       <w:r>
         <w:rPr>
@@ -840,6 +751,8 @@
     <w:p>
       <w:pPr>
         <w:spacing w:line="360" w:lineRule="auto" w:after="120"/>
+        <w:ind w:firstLine="420"/>
+        <w:jc w:val="both"/>
       </w:pPr>
       <w:r>
         <w:rPr>
@@ -853,6 +766,8 @@
     <w:p>
       <w:pPr>
         <w:spacing w:line="360" w:lineRule="auto" w:after="120"/>
+        <w:ind w:firstLine="420"/>
+        <w:jc w:val="both"/>
       </w:pPr>
       <w:r>
         <w:rPr>
@@ -882,6 +797,8 @@
     <w:p>
       <w:pPr>
         <w:spacing w:line="360" w:lineRule="auto" w:after="120"/>
+        <w:ind w:firstLine="420"/>
+        <w:jc w:val="both"/>
       </w:pPr>
       <w:r>
         <w:rPr>
@@ -895,6 +812,8 @@
     <w:p>
       <w:pPr>
         <w:spacing w:line="360" w:lineRule="auto" w:after="120"/>
+        <w:ind w:firstLine="420"/>
+        <w:jc w:val="both"/>
       </w:pPr>
       <w:r>
         <w:rPr>
@@ -916,6 +835,8 @@
     <w:p>
       <w:pPr>
         <w:spacing w:line="360" w:lineRule="auto" w:after="120"/>
+        <w:ind w:firstLine="420"/>
+        <w:jc w:val="both"/>
       </w:pPr>
       <w:r>
         <w:rPr>
@@ -942,14 +863,14 @@
         </w:tblBorders>
       </w:tblPr>
       <w:tblGrid>
-        <w:gridCol w:w="3120"/>
-        <w:gridCol w:w="3120"/>
-        <w:gridCol w:w="3120"/>
+        <w:gridCol w:w="3009"/>
+        <w:gridCol w:w="3009"/>
+        <w:gridCol w:w="3009"/>
       </w:tblGrid>
       <w:tr>
         <w:tc>
           <w:tcPr>
-            <w:tcW w:type="dxa" w:w="3120"/>
+            <w:tcW w:type="dxa" w:w="3009"/>
             <w:vAlign w:val="center"/>
             <w:shd w:fill="1F4E78"/>
           </w:tcPr>
@@ -970,7 +891,7 @@
         </w:tc>
         <w:tc>
           <w:tcPr>
-            <w:tcW w:type="dxa" w:w="3120"/>
+            <w:tcW w:type="dxa" w:w="3009"/>
             <w:vAlign w:val="center"/>
             <w:shd w:fill="1F4E78"/>
           </w:tcPr>
@@ -991,7 +912,7 @@
         </w:tc>
         <w:tc>
           <w:tcPr>
-            <w:tcW w:type="dxa" w:w="3120"/>
+            <w:tcW w:type="dxa" w:w="3009"/>
             <w:vAlign w:val="center"/>
             <w:shd w:fill="1F4E78"/>
           </w:tcPr>
@@ -1014,7 +935,7 @@
       <w:tr>
         <w:tc>
           <w:tcPr>
-            <w:tcW w:type="dxa" w:w="3120"/>
+            <w:tcW w:type="dxa" w:w="3009"/>
             <w:vAlign w:val="center"/>
           </w:tcPr>
           <w:p>
@@ -1033,7 +954,7 @@
         </w:tc>
         <w:tc>
           <w:tcPr>
-            <w:tcW w:type="dxa" w:w="3120"/>
+            <w:tcW w:type="dxa" w:w="3009"/>
             <w:vAlign w:val="center"/>
           </w:tcPr>
           <w:p>
@@ -1052,7 +973,7 @@
         </w:tc>
         <w:tc>
           <w:tcPr>
-            <w:tcW w:type="dxa" w:w="3120"/>
+            <w:tcW w:type="dxa" w:w="3009"/>
             <w:vAlign w:val="center"/>
           </w:tcPr>
           <w:p>
@@ -1073,7 +994,7 @@
       <w:tr>
         <w:tc>
           <w:tcPr>
-            <w:tcW w:type="dxa" w:w="3120"/>
+            <w:tcW w:type="dxa" w:w="3009"/>
             <w:vAlign w:val="center"/>
           </w:tcPr>
           <w:p>
@@ -1092,7 +1013,7 @@
         </w:tc>
         <w:tc>
           <w:tcPr>
-            <w:tcW w:type="dxa" w:w="3120"/>
+            <w:tcW w:type="dxa" w:w="3009"/>
             <w:vAlign w:val="center"/>
           </w:tcPr>
           <w:p>
@@ -1111,7 +1032,7 @@
         </w:tc>
         <w:tc>
           <w:tcPr>
-            <w:tcW w:type="dxa" w:w="3120"/>
+            <w:tcW w:type="dxa" w:w="3009"/>
             <w:vAlign w:val="center"/>
           </w:tcPr>
           <w:p>
@@ -1132,7 +1053,7 @@
       <w:tr>
         <w:tc>
           <w:tcPr>
-            <w:tcW w:type="dxa" w:w="3120"/>
+            <w:tcW w:type="dxa" w:w="3009"/>
             <w:vAlign w:val="center"/>
           </w:tcPr>
           <w:p>
@@ -1151,7 +1072,7 @@
         </w:tc>
         <w:tc>
           <w:tcPr>
-            <w:tcW w:type="dxa" w:w="3120"/>
+            <w:tcW w:type="dxa" w:w="3009"/>
             <w:vAlign w:val="center"/>
           </w:tcPr>
           <w:p>
@@ -1170,7 +1091,7 @@
         </w:tc>
         <w:tc>
           <w:tcPr>
-            <w:tcW w:type="dxa" w:w="3120"/>
+            <w:tcW w:type="dxa" w:w="3009"/>
             <w:vAlign w:val="center"/>
           </w:tcPr>
           <w:p>
@@ -1191,7 +1112,7 @@
       <w:tr>
         <w:tc>
           <w:tcPr>
-            <w:tcW w:type="dxa" w:w="3120"/>
+            <w:tcW w:type="dxa" w:w="3009"/>
             <w:vAlign w:val="center"/>
           </w:tcPr>
           <w:p>
@@ -1210,7 +1131,7 @@
         </w:tc>
         <w:tc>
           <w:tcPr>
-            <w:tcW w:type="dxa" w:w="3120"/>
+            <w:tcW w:type="dxa" w:w="3009"/>
             <w:vAlign w:val="center"/>
           </w:tcPr>
           <w:p>
@@ -1229,7 +1150,7 @@
         </w:tc>
         <w:tc>
           <w:tcPr>
-            <w:tcW w:type="dxa" w:w="3120"/>
+            <w:tcW w:type="dxa" w:w="3009"/>
             <w:vAlign w:val="center"/>
           </w:tcPr>
           <w:p>
@@ -1250,7 +1171,7 @@
       <w:tr>
         <w:tc>
           <w:tcPr>
-            <w:tcW w:type="dxa" w:w="3120"/>
+            <w:tcW w:type="dxa" w:w="3009"/>
             <w:vAlign w:val="center"/>
           </w:tcPr>
           <w:p>
@@ -1269,7 +1190,7 @@
         </w:tc>
         <w:tc>
           <w:tcPr>
-            <w:tcW w:type="dxa" w:w="3120"/>
+            <w:tcW w:type="dxa" w:w="3009"/>
             <w:vAlign w:val="center"/>
           </w:tcPr>
           <w:p>
@@ -1288,7 +1209,7 @@
         </w:tc>
         <w:tc>
           <w:tcPr>
-            <w:tcW w:type="dxa" w:w="3120"/>
+            <w:tcW w:type="dxa" w:w="3009"/>
             <w:vAlign w:val="center"/>
           </w:tcPr>
           <w:p>
@@ -1309,7 +1230,7 @@
       <w:tr>
         <w:tc>
           <w:tcPr>
-            <w:tcW w:type="dxa" w:w="3120"/>
+            <w:tcW w:type="dxa" w:w="3009"/>
             <w:vAlign w:val="center"/>
           </w:tcPr>
           <w:p>
@@ -1328,7 +1249,7 @@
         </w:tc>
         <w:tc>
           <w:tcPr>
-            <w:tcW w:type="dxa" w:w="3120"/>
+            <w:tcW w:type="dxa" w:w="3009"/>
             <w:vAlign w:val="center"/>
           </w:tcPr>
           <w:p>
@@ -1347,7 +1268,7 @@
         </w:tc>
         <w:tc>
           <w:tcPr>
-            <w:tcW w:type="dxa" w:w="3120"/>
+            <w:tcW w:type="dxa" w:w="3009"/>
             <w:vAlign w:val="center"/>
           </w:tcPr>
           <w:p>
@@ -1368,7 +1289,7 @@
       <w:tr>
         <w:tc>
           <w:tcPr>
-            <w:tcW w:type="dxa" w:w="3120"/>
+            <w:tcW w:type="dxa" w:w="3009"/>
             <w:vAlign w:val="center"/>
           </w:tcPr>
           <w:p>
@@ -1387,7 +1308,7 @@
         </w:tc>
         <w:tc>
           <w:tcPr>
-            <w:tcW w:type="dxa" w:w="3120"/>
+            <w:tcW w:type="dxa" w:w="3009"/>
             <w:vAlign w:val="center"/>
           </w:tcPr>
           <w:p>
@@ -1406,7 +1327,7 @@
         </w:tc>
         <w:tc>
           <w:tcPr>
-            <w:tcW w:type="dxa" w:w="3120"/>
+            <w:tcW w:type="dxa" w:w="3009"/>
             <w:vAlign w:val="center"/>
           </w:tcPr>
           <w:p>
@@ -1427,7 +1348,7 @@
       <w:tr>
         <w:tc>
           <w:tcPr>
-            <w:tcW w:type="dxa" w:w="3120"/>
+            <w:tcW w:type="dxa" w:w="3009"/>
             <w:vAlign w:val="center"/>
           </w:tcPr>
           <w:p>
@@ -1446,7 +1367,7 @@
         </w:tc>
         <w:tc>
           <w:tcPr>
-            <w:tcW w:type="dxa" w:w="3120"/>
+            <w:tcW w:type="dxa" w:w="3009"/>
             <w:vAlign w:val="center"/>
           </w:tcPr>
           <w:p>
@@ -1465,7 +1386,7 @@
         </w:tc>
         <w:tc>
           <w:tcPr>
-            <w:tcW w:type="dxa" w:w="3120"/>
+            <w:tcW w:type="dxa" w:w="3009"/>
             <w:vAlign w:val="center"/>
           </w:tcPr>
           <w:p>
@@ -1486,7 +1407,7 @@
       <w:tr>
         <w:tc>
           <w:tcPr>
-            <w:tcW w:type="dxa" w:w="3120"/>
+            <w:tcW w:type="dxa" w:w="3009"/>
             <w:vAlign w:val="center"/>
           </w:tcPr>
           <w:p>
@@ -1505,7 +1426,7 @@
         </w:tc>
         <w:tc>
           <w:tcPr>
-            <w:tcW w:type="dxa" w:w="3120"/>
+            <w:tcW w:type="dxa" w:w="3009"/>
             <w:vAlign w:val="center"/>
           </w:tcPr>
           <w:p>
@@ -1524,7 +1445,7 @@
         </w:tc>
         <w:tc>
           <w:tcPr>
-            <w:tcW w:type="dxa" w:w="3120"/>
+            <w:tcW w:type="dxa" w:w="3009"/>
             <w:vAlign w:val="center"/>
           </w:tcPr>
           <w:p>
@@ -1545,7 +1466,7 @@
       <w:tr>
         <w:tc>
           <w:tcPr>
-            <w:tcW w:type="dxa" w:w="3120"/>
+            <w:tcW w:type="dxa" w:w="3009"/>
             <w:vAlign w:val="center"/>
           </w:tcPr>
           <w:p>
@@ -1564,7 +1485,7 @@
         </w:tc>
         <w:tc>
           <w:tcPr>
-            <w:tcW w:type="dxa" w:w="3120"/>
+            <w:tcW w:type="dxa" w:w="3009"/>
             <w:vAlign w:val="center"/>
           </w:tcPr>
           <w:p>
@@ -1583,7 +1504,7 @@
         </w:tc>
         <w:tc>
           <w:tcPr>
-            <w:tcW w:type="dxa" w:w="3120"/>
+            <w:tcW w:type="dxa" w:w="3009"/>
             <w:vAlign w:val="center"/>
           </w:tcPr>
           <w:p>
@@ -1604,7 +1525,7 @@
       <w:tr>
         <w:tc>
           <w:tcPr>
-            <w:tcW w:type="dxa" w:w="3120"/>
+            <w:tcW w:type="dxa" w:w="3009"/>
             <w:vAlign w:val="center"/>
           </w:tcPr>
           <w:p>
@@ -1623,7 +1544,7 @@
         </w:tc>
         <w:tc>
           <w:tcPr>
-            <w:tcW w:type="dxa" w:w="3120"/>
+            <w:tcW w:type="dxa" w:w="3009"/>
             <w:vAlign w:val="center"/>
           </w:tcPr>
           <w:p>
@@ -1642,7 +1563,7 @@
         </w:tc>
         <w:tc>
           <w:tcPr>
-            <w:tcW w:type="dxa" w:w="3120"/>
+            <w:tcW w:type="dxa" w:w="3009"/>
             <w:vAlign w:val="center"/>
           </w:tcPr>
           <w:p>
@@ -1665,6 +1586,8 @@
     <w:p>
       <w:pPr>
         <w:spacing w:line="360" w:lineRule="auto" w:after="120"/>
+        <w:ind w:firstLine="420"/>
+        <w:jc w:val="both"/>
       </w:pPr>
       <w:r>
         <w:rPr>
@@ -1686,6 +1609,8 @@
     <w:p>
       <w:pPr>
         <w:spacing w:line="360" w:lineRule="auto" w:after="120"/>
+        <w:ind w:firstLine="420"/>
+        <w:jc w:val="both"/>
       </w:pPr>
       <w:r>
         <w:rPr>
@@ -1699,6 +1624,8 @@
     <w:p>
       <w:pPr>
         <w:spacing w:line="360" w:lineRule="auto" w:after="120"/>
+        <w:ind w:firstLine="420"/>
+        <w:jc w:val="both"/>
       </w:pPr>
       <w:r>
         <w:rPr>
@@ -1728,6 +1655,8 @@
     <w:p>
       <w:pPr>
         <w:spacing w:line="360" w:lineRule="auto" w:after="120"/>
+        <w:ind w:firstLine="420"/>
+        <w:jc w:val="both"/>
       </w:pPr>
       <w:r>
         <w:rPr>
@@ -1735,7 +1664,7 @@
           <w:b w:val="0"/>
           <w:sz w:val="21"/>
         </w:rPr>
-        <w:t>建议采用分层解耦的总体思路，以应急业务闭环为主线组织 Web 与 H5 应用、业务能力、数据接口和运行保障。系统部署于甲方私有环境，支持容器化交付和隔离网络环境安装；对外采用标准 REST API 和 OpenAPI 文档，视频接口遵循 GB/T 28181 等已冻结要求。具体产品、框架、中间件和服务拆分由 G1-04 技术方案论证后确定。[来源：BASELINE-G1-V0.1 §10]</w:t>
+        <w:t>建议采用分层解耦的总体思路，以应急业务闭环为主线组织 Web 与 H5 应用、业务能力、数据接口和运行保障。系统部署于甲方私有环境，支持容器化交付和隔离网络环境安装；对外采用标准 REST API 和 OpenAPI 文档，视频接口遵循 GB/T 28181 等已冻结要求。具体产品、框架、中间件和服务拆分已由 G1-04 V0.6 完成技术论证，本建议书仅引用其稳定结论，不扩展为详细技术设计。[来源：BASELINE-G1-V0.1 §10；G1-04 V0.6]</w:t>
       </w:r>
     </w:p>
     <w:p>
@@ -1749,6 +1678,8 @@
     <w:p>
       <w:pPr>
         <w:spacing w:line="360" w:lineRule="auto" w:after="120"/>
+        <w:ind w:firstLine="420"/>
+        <w:jc w:val="both"/>
       </w:pPr>
       <w:r>
         <w:rPr>
@@ -1762,6 +1693,8 @@
     <w:p>
       <w:pPr>
         <w:spacing w:line="360" w:lineRule="auto" w:after="120"/>
+        <w:ind w:firstLine="420"/>
+        <w:jc w:val="both"/>
       </w:pPr>
       <w:r>
         <w:rPr>
@@ -1839,6 +1772,8 @@
     <w:p>
       <w:pPr>
         <w:spacing w:line="360" w:lineRule="auto" w:after="120"/>
+        <w:ind w:firstLine="420"/>
+        <w:jc w:val="both"/>
       </w:pPr>
       <w:r>
         <w:rPr>
@@ -1846,7 +1781,7 @@
           <w:b w:val="0"/>
           <w:sz w:val="21"/>
         </w:rPr>
-        <w:t>以上仅明确已冻结的业务与责任边界，不构成对具体技术产品或实现方式的预先承诺。[来源：BASELINE-G1-V0.1 §7、§10]</w:t>
+        <w:t>上述 12 项责任澄清属于甲方/招标人（课程模拟）书面裁决，用于解决本课程模拟项目的需求歧义，并作为当前编标 Baseline 的解释依据；其不应被表述为真实甲方正式法律文件。以上仅明确已冻结的业务与责任边界，不构成对具体技术产品或实现方式的预先承诺。[来源：BASELINE-G1-V0.1 §7、§10]</w:t>
       </w:r>
     </w:p>
     <w:p>
@@ -1860,6 +1795,8 @@
     <w:p>
       <w:pPr>
         <w:spacing w:line="360" w:lineRule="auto" w:after="120"/>
+        <w:ind w:firstLine="420"/>
+        <w:jc w:val="both"/>
       </w:pPr>
       <w:r>
         <w:rPr>
@@ -1873,6 +1810,8 @@
     <w:p>
       <w:pPr>
         <w:spacing w:line="360" w:lineRule="auto" w:after="120"/>
+        <w:ind w:firstLine="420"/>
+        <w:jc w:val="both"/>
       </w:pPr>
       <w:r>
         <w:rPr>
@@ -1958,6 +1897,8 @@
     <w:p>
       <w:pPr>
         <w:spacing w:line="360" w:lineRule="auto" w:after="120"/>
+        <w:ind w:firstLine="420"/>
+        <w:jc w:val="both"/>
       </w:pPr>
       <w:r>
         <w:rPr>
@@ -1979,6 +1920,8 @@
     <w:p>
       <w:pPr>
         <w:spacing w:line="360" w:lineRule="auto" w:after="120"/>
+        <w:ind w:firstLine="420"/>
+        <w:jc w:val="both"/>
       </w:pPr>
       <w:r>
         <w:rPr>
@@ -2013,14 +1956,14 @@
         </w:tblBorders>
       </w:tblPr>
       <w:tblGrid>
-        <w:gridCol w:w="3120"/>
-        <w:gridCol w:w="3120"/>
-        <w:gridCol w:w="3120"/>
+        <w:gridCol w:w="3009"/>
+        <w:gridCol w:w="3009"/>
+        <w:gridCol w:w="3009"/>
       </w:tblGrid>
       <w:tr>
         <w:tc>
           <w:tcPr>
-            <w:tcW w:type="dxa" w:w="3120"/>
+            <w:tcW w:type="dxa" w:w="3009"/>
             <w:vAlign w:val="center"/>
             <w:shd w:fill="1F4E78"/>
           </w:tcPr>
@@ -2041,7 +1984,7 @@
         </w:tc>
         <w:tc>
           <w:tcPr>
-            <w:tcW w:type="dxa" w:w="3120"/>
+            <w:tcW w:type="dxa" w:w="3009"/>
             <w:vAlign w:val="center"/>
             <w:shd w:fill="1F4E78"/>
           </w:tcPr>
@@ -2062,7 +2005,7 @@
         </w:tc>
         <w:tc>
           <w:tcPr>
-            <w:tcW w:type="dxa" w:w="3120"/>
+            <w:tcW w:type="dxa" w:w="3009"/>
             <w:vAlign w:val="center"/>
             <w:shd w:fill="1F4E78"/>
           </w:tcPr>
@@ -2085,7 +2028,7 @@
       <w:tr>
         <w:tc>
           <w:tcPr>
-            <w:tcW w:type="dxa" w:w="3120"/>
+            <w:tcW w:type="dxa" w:w="3009"/>
             <w:vAlign w:val="center"/>
           </w:tcPr>
           <w:p>
@@ -2104,7 +2047,7 @@
         </w:tc>
         <w:tc>
           <w:tcPr>
-            <w:tcW w:type="dxa" w:w="3120"/>
+            <w:tcW w:type="dxa" w:w="3009"/>
             <w:vAlign w:val="center"/>
           </w:tcPr>
           <w:p>
@@ -2123,7 +2066,7 @@
         </w:tc>
         <w:tc>
           <w:tcPr>
-            <w:tcW w:type="dxa" w:w="3120"/>
+            <w:tcW w:type="dxa" w:w="3009"/>
             <w:vAlign w:val="center"/>
           </w:tcPr>
           <w:p>
@@ -2144,7 +2087,7 @@
       <w:tr>
         <w:tc>
           <w:tcPr>
-            <w:tcW w:type="dxa" w:w="3120"/>
+            <w:tcW w:type="dxa" w:w="3009"/>
             <w:vAlign w:val="center"/>
           </w:tcPr>
           <w:p>
@@ -2163,7 +2106,7 @@
         </w:tc>
         <w:tc>
           <w:tcPr>
-            <w:tcW w:type="dxa" w:w="3120"/>
+            <w:tcW w:type="dxa" w:w="3009"/>
             <w:vAlign w:val="center"/>
           </w:tcPr>
           <w:p>
@@ -2182,7 +2125,7 @@
         </w:tc>
         <w:tc>
           <w:tcPr>
-            <w:tcW w:type="dxa" w:w="3120"/>
+            <w:tcW w:type="dxa" w:w="3009"/>
             <w:vAlign w:val="center"/>
           </w:tcPr>
           <w:p>
@@ -2203,7 +2146,7 @@
       <w:tr>
         <w:tc>
           <w:tcPr>
-            <w:tcW w:type="dxa" w:w="3120"/>
+            <w:tcW w:type="dxa" w:w="3009"/>
             <w:vAlign w:val="center"/>
           </w:tcPr>
           <w:p>
@@ -2222,7 +2165,7 @@
         </w:tc>
         <w:tc>
           <w:tcPr>
-            <w:tcW w:type="dxa" w:w="3120"/>
+            <w:tcW w:type="dxa" w:w="3009"/>
             <w:vAlign w:val="center"/>
           </w:tcPr>
           <w:p>
@@ -2241,7 +2184,7 @@
         </w:tc>
         <w:tc>
           <w:tcPr>
-            <w:tcW w:type="dxa" w:w="3120"/>
+            <w:tcW w:type="dxa" w:w="3009"/>
             <w:vAlign w:val="center"/>
           </w:tcPr>
           <w:p>
@@ -2262,7 +2205,7 @@
       <w:tr>
         <w:tc>
           <w:tcPr>
-            <w:tcW w:type="dxa" w:w="3120"/>
+            <w:tcW w:type="dxa" w:w="3009"/>
             <w:vAlign w:val="center"/>
           </w:tcPr>
           <w:p>
@@ -2281,7 +2224,7 @@
         </w:tc>
         <w:tc>
           <w:tcPr>
-            <w:tcW w:type="dxa" w:w="3120"/>
+            <w:tcW w:type="dxa" w:w="3009"/>
             <w:vAlign w:val="center"/>
           </w:tcPr>
           <w:p>
@@ -2300,7 +2243,7 @@
         </w:tc>
         <w:tc>
           <w:tcPr>
-            <w:tcW w:type="dxa" w:w="3120"/>
+            <w:tcW w:type="dxa" w:w="3009"/>
             <w:vAlign w:val="center"/>
           </w:tcPr>
           <w:p>
@@ -2323,6 +2266,8 @@
     <w:p>
       <w:pPr>
         <w:spacing w:line="360" w:lineRule="auto" w:after="120"/>
+        <w:ind w:firstLine="420"/>
+        <w:jc w:val="both"/>
       </w:pPr>
       <w:r>
         <w:rPr>
@@ -2344,6 +2289,8 @@
     <w:p>
       <w:pPr>
         <w:spacing w:line="360" w:lineRule="auto" w:after="120"/>
+        <w:ind w:firstLine="420"/>
+        <w:jc w:val="both"/>
       </w:pPr>
       <w:r>
         <w:rPr>
@@ -2351,12 +2298,14 @@
           <w:b w:val="0"/>
           <w:sz w:val="21"/>
         </w:rPr>
-        <w:t>本项目围绕博物馆应急准备、指挥调度、移动处置和事后改进的连续业务链建设软件与接口联动能力，建设范围、范围外边界、关键澄清和甲乙双方责任已由 `BASELINE-G1-V0.1` 冻结。建议以该基线作为后续编标输入，在 G1-04 完成技术方案论证、G1-05 完成逐条合规复核的基础上，继续推进项目计划、风险登记册和技术投标书整合。</w:t>
+        <w:t>本项目围绕博物馆应急准备、指挥调度、移动处置和事后改进的连续业务链建设软件与接口联动能力，建设范围、范围外边界、关键澄清和甲乙双方责任已由 `BASELINE-G1-V0.1` 冻结。建议以该基线及已完成的 G1-04 技术方案作为后续编标输入，在 G1-05 完成逐条合规复核的基础上，继续推进项目计划、风险登记册和技术投标书整合。</w:t>
       </w:r>
     </w:p>
     <w:p>
       <w:pPr>
         <w:spacing w:line="360" w:lineRule="auto" w:after="120"/>
+        <w:ind w:firstLine="420"/>
+        <w:jc w:val="both"/>
       </w:pPr>
       <w:r>
         <w:rPr>
@@ -2370,8 +2319,8 @@
     <w:sectPr>
       <w:headerReference w:type="default" r:id="rId9"/>
       <w:footerReference w:type="default" r:id="rId10"/>
-      <w:pgSz w:w="12240" w:h="15840"/>
-      <w:pgMar w:top="1440" w:right="1440" w:bottom="1247" w:left="1440" w:header="720" w:footer="720" w:gutter="0"/>
+      <w:pgSz w:w="11906" w:h="16838"/>
+      <w:pgMar w:top="1440" w:right="1440" w:bottom="1440" w:left="1440" w:header="720" w:footer="720" w:gutter="0"/>
       <w:cols w:space="720"/>
       <w:docGrid w:linePitch="360"/>
     </w:sectPr>
@@ -2412,16 +2361,8 @@
   <w:p>
     <w:pPr>
       <w:pStyle w:val="Header"/>
-      <w:jc w:val="center"/>
     </w:pPr>
-    <w:r>
-      <w:rPr>
-        <w:rFonts w:ascii="宋体" w:hAnsi="宋体" w:eastAsia="宋体"/>
-        <w:b w:val="0"/>
-        <w:sz w:val="18"/>
-      </w:rPr>
-      <w:t>某自然博物馆智能运营中心建设项目——应急管理子系统  项目建议书</w:t>
-    </w:r>
+    <w:r/>
   </w:p>
 </w:hdr>
 </file>
@@ -2792,7 +2733,7 @@
     <w:rPr>
       <w:rFonts w:ascii="宋体" w:hAnsi="宋体" w:eastAsia="宋体"/>
       <w:b w:val="0"/>
-      <w:sz w:val="21"/>
+      <w:sz w:val="24"/>
     </w:rPr>
   </w:style>
   <w:style w:type="paragraph" w:styleId="Header">
@@ -2858,7 +2799,7 @@
       <w:b/>
       <w:bCs/>
       <w:color w:val="365F91" w:themeColor="accent1" w:themeShade="BF"/>
-      <w:sz w:val="30"/>
+      <w:sz w:val="32"/>
       <w:szCs w:val="28"/>
     </w:rPr>
   </w:style>
@@ -2906,7 +2847,7 @@
       <w:b/>
       <w:bCs/>
       <w:color w:val="4F81BD" w:themeColor="accent1"/>
-      <w:sz w:val="23"/>
+      <w:sz w:val="24"/>
     </w:rPr>
   </w:style>
   <w:style w:type="paragraph" w:styleId="Heading4">

</xml_diff>

<commit_message>
fix(g1): rebuild daily reports and fully align deliverable formats
</commit_message>
<xml_diff>
--- a/docs/deliverables/01-项目建议书.docx
+++ b/docs/deliverables/01-项目建议书.docx
@@ -8,13 +8,7 @@
         <ns0:jc ns0:val="right"/>
       </ns0:pPr>
       <ns0:r>
-        <ns0:rPr>
-          <ns0:rFonts ns0:ascii="Times New Roman" ns0:hAnsi="Times New Roman" ns0:eastAsia="宋体"/>
-          <ns0:b ns0:val="0"/>
-          <ns0:color ns0:val="000000"/>
-          <ns0:sz ns0:val="24"/>
-        </ns0:rPr>
-        <ns0:t>文档编号：01　　版本号：V0.9</ns0:t>
+        <ns0:t>文档编号：01　　版本号：V1.2</ns0:t>
       </ns0:r>
     </ns0:p>
     <ns0:p>
@@ -111,13 +105,7 @@
         <ns0:spacing ns0:after="200"/>
       </ns0:pPr>
       <ns0:r>
-        <ns0:rPr>
-          <ns0:rFonts ns0:ascii="Times New Roman" ns0:hAnsi="Times New Roman" ns0:eastAsia="仿宋"/>
-          <ns0:b ns0:val="0"/>
-          <ns0:color ns0:val="000000"/>
-          <ns0:sz ns0:val="32"/>
-        </ns0:rPr>
-        <ns0:t>文档版本：V0.9</ns0:t>
+        <ns0:t>文档版本：V1.2</ns0:t>
       </ns0:r>
     </ns0:p>
     <ns0:p>
@@ -168,6 +156,38 @@
           <ns0:insideH ns0:val="single" ns0:sz="4" ns0:space="0" ns0:color="7F7F7F"/>
           <ns0:insideV ns0:val="single" ns0:sz="4" ns0:space="0" ns0:color="7F7F7F"/>
         </ns0:tblBorders>
+        <ns0:tblBorders>
+          <ns0:top ns0:val="single" ns0:sz="6" ns0:space="0" ns0:color="7F8C8D"/>
+          <ns0:left ns0:val="single" ns0:sz="6" ns0:space="0" ns0:color="7F8C8D"/>
+          <ns0:bottom ns0:val="single" ns0:sz="6" ns0:space="0" ns0:color="7F8C8D"/>
+          <ns0:right ns0:val="single" ns0:sz="6" ns0:space="0" ns0:color="7F8C8D"/>
+          <ns0:insideH ns0:val="single" ns0:sz="6" ns0:space="0" ns0:color="7F8C8D"/>
+          <ns0:insideV ns0:val="single" ns0:sz="6" ns0:space="0" ns0:color="7F8C8D"/>
+        </ns0:tblBorders>
+        <ns0:tblBorders>
+          <ns0:top ns0:val="single" ns0:sz="6" ns0:space="0" ns0:color="7F8C8D"/>
+          <ns0:left ns0:val="single" ns0:sz="6" ns0:space="0" ns0:color="7F8C8D"/>
+          <ns0:bottom ns0:val="single" ns0:sz="6" ns0:space="0" ns0:color="7F8C8D"/>
+          <ns0:right ns0:val="single" ns0:sz="6" ns0:space="0" ns0:color="7F8C8D"/>
+          <ns0:insideH ns0:val="single" ns0:sz="6" ns0:space="0" ns0:color="7F8C8D"/>
+          <ns0:insideV ns0:val="single" ns0:sz="6" ns0:space="0" ns0:color="7F8C8D"/>
+        </ns0:tblBorders>
+        <ns0:tblBorders>
+          <ns0:top ns0:val="single" ns0:sz="6" ns0:space="0" ns0:color="7F8C8D"/>
+          <ns0:left ns0:val="single" ns0:sz="6" ns0:space="0" ns0:color="7F8C8D"/>
+          <ns0:bottom ns0:val="single" ns0:sz="6" ns0:space="0" ns0:color="7F8C8D"/>
+          <ns0:right ns0:val="single" ns0:sz="6" ns0:space="0" ns0:color="7F8C8D"/>
+          <ns0:insideH ns0:val="single" ns0:sz="6" ns0:space="0" ns0:color="7F8C8D"/>
+          <ns0:insideV ns0:val="single" ns0:sz="6" ns0:space="0" ns0:color="7F8C8D"/>
+        </ns0:tblBorders>
+        <ns0:tblBorders>
+          <ns0:top ns0:val="single" ns0:sz="6" ns0:space="0" ns0:color="7F8C8D"/>
+          <ns0:left ns0:val="single" ns0:sz="6" ns0:space="0" ns0:color="7F8C8D"/>
+          <ns0:bottom ns0:val="single" ns0:sz="6" ns0:space="0" ns0:color="7F8C8D"/>
+          <ns0:right ns0:val="single" ns0:sz="6" ns0:space="0" ns0:color="7F8C8D"/>
+          <ns0:insideH ns0:val="single" ns0:sz="6" ns0:space="0" ns0:color="7F8C8D"/>
+          <ns0:insideV ns0:val="single" ns0:sz="6" ns0:space="0" ns0:color="7F8C8D"/>
+        </ns0:tblBorders>
       </ns0:tblPr>
       <ns0:tblGrid>
         <ns0:gridCol ns0:w="1805"/>
@@ -178,63 +198,126 @@
       </ns0:tblGrid>
       <ns0:tr>
         <ns0:trPr>
+          <ns0:trHeight ns0:hRule="atLeast" ns0:val="442"/>
+          <ns0:tblHeader ns0:val="true"/>
+          <ns0:tblHeader ns0:val="true"/>
+          <ns0:tblHeader ns0:val="true"/>
+          <ns0:tblHeader ns0:val="true"/>
           <ns0:tblHeader ns0:val="true"/>
         </ns0:trPr>
         <ns0:tc>
           <ns0:tcPr>
+            <ns0:tcW ns0:type="dxa" ns0:w="964"/>
+            <ns0:vAlign ns0:val="center"/>
+            <ns0:tcMar>
+              <ns0:top ns0:w="80" ns0:type="dxa"/>
+              <ns0:start ns0:w="80" ns0:type="dxa"/>
+              <ns0:bottom ns0:w="80" ns0:type="dxa"/>
+              <ns0:end ns0:w="80" ns0:type="dxa"/>
+            </ns0:tcMar>
+            <ns0:shd ns0:fill="D9E5F3"/>
+          </ns0:tcPr>
+          <ns0:p>
+            <ns0:pPr>
+              <ns0:spacing ns0:before="0" ns0:after="0" ns0:line="240" ns0:lineRule="auto"/>
+              <ns0:ind ns0:firstLine="0" ns0:left="0" ns0:right="0"/>
+              <ns0:jc ns0:val="center"/>
+            </ns0:pPr>
+            <ns0:r>
+              <ns0:rPr>
+                <ns0:rFonts ns0:ascii="宋体" ns0:hAnsi="宋体" ns0:eastAsia="宋体"/>
+                <ns0:b/>
+                <ns0:color ns0:val="000000"/>
+                <ns0:sz ns0:val="18"/>
+              </ns0:rPr>
+              <ns0:t>版本</ns0:t>
+            </ns0:r>
+          </ns0:p>
+        </ns0:tc>
+        <ns0:tc>
+          <ns0:tcPr>
             <ns0:tcW ns0:type="dxa" ns0:w="1247"/>
             <ns0:vAlign ns0:val="center"/>
             <ns0:tcMar>
-              <ns0:top ns0:w="90" ns0:type="dxa"/>
-              <ns0:start ns0:w="100" ns0:type="dxa"/>
-              <ns0:bottom ns0:w="90" ns0:type="dxa"/>
-              <ns0:end ns0:w="100" ns0:type="dxa"/>
-            </ns0:tcMar>
-            <ns0:shd ns0:fill="D9E2F3"/>
-          </ns0:tcPr>
-          <ns0:p>
-            <ns0:pPr>
-              <ns0:spacing ns0:before="0" ns0:after="0" ns0:line="276" ns0:lineRule="auto"/>
+              <ns0:top ns0:w="80" ns0:type="dxa"/>
+              <ns0:start ns0:w="80" ns0:type="dxa"/>
+              <ns0:bottom ns0:w="80" ns0:type="dxa"/>
+              <ns0:end ns0:w="80" ns0:type="dxa"/>
+            </ns0:tcMar>
+            <ns0:shd ns0:fill="D9E5F3"/>
+          </ns0:tcPr>
+          <ns0:p>
+            <ns0:pPr>
+              <ns0:spacing ns0:before="0" ns0:after="0" ns0:line="240" ns0:lineRule="auto"/>
               <ns0:ind ns0:firstLine="0" ns0:left="0" ns0:right="0"/>
               <ns0:jc ns0:val="center"/>
             </ns0:pPr>
             <ns0:r>
               <ns0:rPr>
-                <ns0:rFonts ns0:ascii="Times New Roman" ns0:hAnsi="Times New Roman" ns0:eastAsia="黑体"/>
+                <ns0:rFonts ns0:ascii="宋体" ns0:hAnsi="宋体" ns0:eastAsia="宋体"/>
                 <ns0:b/>
                 <ns0:color ns0:val="000000"/>
-                <ns0:sz ns0:val="22"/>
-              </ns0:rPr>
-              <ns0:t>版本</ns0:t>
-            </ns0:r>
-          </ns0:p>
-        </ns0:tc>
-        <ns0:tc>
-          <ns0:tcPr>
-            <ns0:tcW ns0:type="dxa" ns0:w="1474"/>
-            <ns0:vAlign ns0:val="center"/>
-            <ns0:tcMar>
-              <ns0:top ns0:w="90" ns0:type="dxa"/>
-              <ns0:start ns0:w="100" ns0:type="dxa"/>
-              <ns0:bottom ns0:w="90" ns0:type="dxa"/>
-              <ns0:end ns0:w="100" ns0:type="dxa"/>
-            </ns0:tcMar>
-            <ns0:shd ns0:fill="D9E2F3"/>
-          </ns0:tcPr>
-          <ns0:p>
-            <ns0:pPr>
-              <ns0:spacing ns0:before="0" ns0:after="0" ns0:line="276" ns0:lineRule="auto"/>
+                <ns0:sz ns0:val="18"/>
+              </ns0:rPr>
+              <ns0:t>日期</ns0:t>
+            </ns0:r>
+          </ns0:p>
+        </ns0:tc>
+        <ns0:tc>
+          <ns0:tcPr>
+            <ns0:tcW ns0:type="dxa" ns0:w="1417"/>
+            <ns0:vAlign ns0:val="center"/>
+            <ns0:tcMar>
+              <ns0:top ns0:w="80" ns0:type="dxa"/>
+              <ns0:start ns0:w="80" ns0:type="dxa"/>
+              <ns0:bottom ns0:w="80" ns0:type="dxa"/>
+              <ns0:end ns0:w="80" ns0:type="dxa"/>
+            </ns0:tcMar>
+            <ns0:shd ns0:fill="D9E5F3"/>
+          </ns0:tcPr>
+          <ns0:p>
+            <ns0:pPr>
+              <ns0:spacing ns0:before="0" ns0:after="0" ns0:line="240" ns0:lineRule="auto"/>
               <ns0:ind ns0:firstLine="0" ns0:left="0" ns0:right="0"/>
               <ns0:jc ns0:val="center"/>
             </ns0:pPr>
             <ns0:r>
               <ns0:rPr>
-                <ns0:rFonts ns0:ascii="Times New Roman" ns0:hAnsi="Times New Roman" ns0:eastAsia="黑体"/>
+                <ns0:rFonts ns0:ascii="宋体" ns0:hAnsi="宋体" ns0:eastAsia="宋体"/>
                 <ns0:b/>
                 <ns0:color ns0:val="000000"/>
-                <ns0:sz ns0:val="22"/>
-              </ns0:rPr>
-              <ns0:t>日期</ns0:t>
+                <ns0:sz ns0:val="18"/>
+              </ns0:rPr>
+              <ns0:t>修订章节</ns0:t>
+            </ns0:r>
+          </ns0:p>
+        </ns0:tc>
+        <ns0:tc>
+          <ns0:tcPr>
+            <ns0:tcW ns0:type="dxa" ns0:w="4535"/>
+            <ns0:vAlign ns0:val="center"/>
+            <ns0:tcMar>
+              <ns0:top ns0:w="80" ns0:type="dxa"/>
+              <ns0:start ns0:w="80" ns0:type="dxa"/>
+              <ns0:bottom ns0:w="80" ns0:type="dxa"/>
+              <ns0:end ns0:w="80" ns0:type="dxa"/>
+            </ns0:tcMar>
+            <ns0:shd ns0:fill="D9E5F3"/>
+          </ns0:tcPr>
+          <ns0:p>
+            <ns0:pPr>
+              <ns0:spacing ns0:before="0" ns0:after="0" ns0:line="240" ns0:lineRule="auto"/>
+              <ns0:ind ns0:firstLine="0" ns0:left="0" ns0:right="0"/>
+              <ns0:jc ns0:val="left"/>
+            </ns0:pPr>
+            <ns0:r>
+              <ns0:rPr>
+                <ns0:rFonts ns0:ascii="宋体" ns0:hAnsi="宋体" ns0:eastAsia="宋体"/>
+                <ns0:b/>
+                <ns0:color ns0:val="000000"/>
+                <ns0:sz ns0:val="18"/>
+              </ns0:rPr>
+              <ns0:t>修订说明</ns0:t>
             </ns0:r>
           </ns0:p>
         </ns0:tc>
@@ -243,83 +326,25 @@
             <ns0:tcW ns0:type="dxa" ns0:w="1531"/>
             <ns0:vAlign ns0:val="center"/>
             <ns0:tcMar>
-              <ns0:top ns0:w="90" ns0:type="dxa"/>
-              <ns0:start ns0:w="100" ns0:type="dxa"/>
-              <ns0:bottom ns0:w="90" ns0:type="dxa"/>
-              <ns0:end ns0:w="100" ns0:type="dxa"/>
-            </ns0:tcMar>
-            <ns0:shd ns0:fill="D9E2F3"/>
-          </ns0:tcPr>
-          <ns0:p>
-            <ns0:pPr>
-              <ns0:spacing ns0:before="0" ns0:after="0" ns0:line="276" ns0:lineRule="auto"/>
+              <ns0:top ns0:w="80" ns0:type="dxa"/>
+              <ns0:start ns0:w="80" ns0:type="dxa"/>
+              <ns0:bottom ns0:w="80" ns0:type="dxa"/>
+              <ns0:end ns0:w="80" ns0:type="dxa"/>
+            </ns0:tcMar>
+            <ns0:shd ns0:fill="D9E5F3"/>
+          </ns0:tcPr>
+          <ns0:p>
+            <ns0:pPr>
+              <ns0:spacing ns0:before="0" ns0:after="0" ns0:line="240" ns0:lineRule="auto"/>
               <ns0:ind ns0:firstLine="0" ns0:left="0" ns0:right="0"/>
               <ns0:jc ns0:val="center"/>
             </ns0:pPr>
             <ns0:r>
               <ns0:rPr>
-                <ns0:rFonts ns0:ascii="Times New Roman" ns0:hAnsi="Times New Roman" ns0:eastAsia="黑体"/>
+                <ns0:rFonts ns0:ascii="宋体" ns0:hAnsi="宋体" ns0:eastAsia="宋体"/>
                 <ns0:b/>
                 <ns0:color ns0:val="000000"/>
-                <ns0:sz ns0:val="22"/>
-              </ns0:rPr>
-              <ns0:t>修订章节</ns0:t>
-            </ns0:r>
-          </ns0:p>
-        </ns0:tc>
-        <ns0:tc>
-          <ns0:tcPr>
-            <ns0:tcW ns0:type="dxa" ns0:w="3118"/>
-            <ns0:vAlign ns0:val="center"/>
-            <ns0:tcMar>
-              <ns0:top ns0:w="90" ns0:type="dxa"/>
-              <ns0:start ns0:w="100" ns0:type="dxa"/>
-              <ns0:bottom ns0:w="90" ns0:type="dxa"/>
-              <ns0:end ns0:w="100" ns0:type="dxa"/>
-            </ns0:tcMar>
-            <ns0:shd ns0:fill="D9E2F3"/>
-          </ns0:tcPr>
-          <ns0:p>
-            <ns0:pPr>
-              <ns0:spacing ns0:before="0" ns0:after="0" ns0:line="276" ns0:lineRule="auto"/>
-              <ns0:ind ns0:firstLine="0" ns0:left="0" ns0:right="0"/>
-              <ns0:jc ns0:val="center"/>
-            </ns0:pPr>
-            <ns0:r>
-              <ns0:rPr>
-                <ns0:rFonts ns0:ascii="Times New Roman" ns0:hAnsi="Times New Roman" ns0:eastAsia="黑体"/>
-                <ns0:b/>
-                <ns0:color ns0:val="000000"/>
-                <ns0:sz ns0:val="22"/>
-              </ns0:rPr>
-              <ns0:t>修订说明</ns0:t>
-            </ns0:r>
-          </ns0:p>
-        </ns0:tc>
-        <ns0:tc>
-          <ns0:tcPr>
-            <ns0:tcW ns0:type="dxa" ns0:w="1655"/>
-            <ns0:vAlign ns0:val="center"/>
-            <ns0:tcMar>
-              <ns0:top ns0:w="90" ns0:type="dxa"/>
-              <ns0:start ns0:w="100" ns0:type="dxa"/>
-              <ns0:bottom ns0:w="90" ns0:type="dxa"/>
-              <ns0:end ns0:w="100" ns0:type="dxa"/>
-            </ns0:tcMar>
-            <ns0:shd ns0:fill="D9E2F3"/>
-          </ns0:tcPr>
-          <ns0:p>
-            <ns0:pPr>
-              <ns0:spacing ns0:before="0" ns0:after="0" ns0:line="276" ns0:lineRule="auto"/>
-              <ns0:ind ns0:firstLine="0" ns0:left="0" ns0:right="0"/>
-              <ns0:jc ns0:val="center"/>
-            </ns0:pPr>
-            <ns0:r>
-              <ns0:rPr>
-                <ns0:rFonts ns0:ascii="Times New Roman" ns0:hAnsi="Times New Roman" ns0:eastAsia="黑体"/>
-                <ns0:b/>
-                <ns0:color ns0:val="000000"/>
-                <ns0:sz ns0:val="22"/>
+                <ns0:sz ns0:val="18"/>
               </ns0:rPr>
               <ns0:t>编制/修订人</ns0:t>
             </ns0:r>
@@ -327,59 +352,118 @@
         </ns0:tc>
       </ns0:tr>
       <ns0:tr>
+        <ns0:trPr>
+          <ns0:trHeight ns0:hRule="atLeast" ns0:val="442"/>
+        </ns0:trPr>
+        <ns0:tc>
+          <ns0:tcPr>
+            <ns0:tcW ns0:type="dxa" ns0:w="964"/>
+            <ns0:vAlign ns0:val="center"/>
+            <ns0:tcMar>
+              <ns0:top ns0:w="80" ns0:type="dxa"/>
+              <ns0:start ns0:w="80" ns0:type="dxa"/>
+              <ns0:bottom ns0:w="80" ns0:type="dxa"/>
+              <ns0:end ns0:w="80" ns0:type="dxa"/>
+            </ns0:tcMar>
+          </ns0:tcPr>
+          <ns0:p>
+            <ns0:pPr>
+              <ns0:spacing ns0:before="0" ns0:after="0" ns0:line="240" ns0:lineRule="auto"/>
+              <ns0:ind ns0:firstLine="0" ns0:left="0" ns0:right="0"/>
+              <ns0:jc ns0:val="center"/>
+            </ns0:pPr>
+            <ns0:r>
+              <ns0:rPr>
+                <ns0:rFonts ns0:ascii="宋体" ns0:hAnsi="宋体" ns0:eastAsia="宋体"/>
+                <ns0:b ns0:val="0"/>
+                <ns0:color ns0:val="000000"/>
+                <ns0:sz ns0:val="18"/>
+              </ns0:rPr>
+              <ns0:t>V0.1</ns0:t>
+            </ns0:r>
+          </ns0:p>
+        </ns0:tc>
         <ns0:tc>
           <ns0:tcPr>
             <ns0:tcW ns0:type="dxa" ns0:w="1247"/>
             <ns0:vAlign ns0:val="center"/>
             <ns0:tcMar>
-              <ns0:top ns0:w="90" ns0:type="dxa"/>
-              <ns0:start ns0:w="100" ns0:type="dxa"/>
-              <ns0:bottom ns0:w="90" ns0:type="dxa"/>
-              <ns0:end ns0:w="100" ns0:type="dxa"/>
-            </ns0:tcMar>
-          </ns0:tcPr>
-          <ns0:p>
-            <ns0:pPr>
-              <ns0:spacing ns0:before="0" ns0:after="0" ns0:line="276" ns0:lineRule="auto"/>
+              <ns0:top ns0:w="80" ns0:type="dxa"/>
+              <ns0:start ns0:w="80" ns0:type="dxa"/>
+              <ns0:bottom ns0:w="80" ns0:type="dxa"/>
+              <ns0:end ns0:w="80" ns0:type="dxa"/>
+            </ns0:tcMar>
+          </ns0:tcPr>
+          <ns0:p>
+            <ns0:pPr>
+              <ns0:spacing ns0:before="0" ns0:after="0" ns0:line="240" ns0:lineRule="auto"/>
               <ns0:ind ns0:firstLine="0" ns0:left="0" ns0:right="0"/>
               <ns0:jc ns0:val="center"/>
             </ns0:pPr>
             <ns0:r>
               <ns0:rPr>
-                <ns0:rFonts ns0:ascii="Times New Roman" ns0:hAnsi="Times New Roman" ns0:eastAsia="宋体"/>
-                <ns0:b ns0:val="0"/>
-                <ns0:color ns0:val="000000"/>
-                <ns0:sz ns0:val="21"/>
-              </ns0:rPr>
-              <ns0:t>V0.1</ns0:t>
-            </ns0:r>
-          </ns0:p>
-        </ns0:tc>
-        <ns0:tc>
-          <ns0:tcPr>
-            <ns0:tcW ns0:type="dxa" ns0:w="1474"/>
-            <ns0:vAlign ns0:val="center"/>
-            <ns0:tcMar>
-              <ns0:top ns0:w="90" ns0:type="dxa"/>
-              <ns0:start ns0:w="100" ns0:type="dxa"/>
-              <ns0:bottom ns0:w="90" ns0:type="dxa"/>
-              <ns0:end ns0:w="100" ns0:type="dxa"/>
-            </ns0:tcMar>
-          </ns0:tcPr>
-          <ns0:p>
-            <ns0:pPr>
-              <ns0:spacing ns0:before="0" ns0:after="0" ns0:line="276" ns0:lineRule="auto"/>
+                <ns0:rFonts ns0:ascii="宋体" ns0:hAnsi="宋体" ns0:eastAsia="宋体"/>
+                <ns0:b ns0:val="0"/>
+                <ns0:color ns0:val="000000"/>
+                <ns0:sz ns0:val="18"/>
+              </ns0:rPr>
+              <ns0:t>2026-09-10</ns0:t>
+            </ns0:r>
+          </ns0:p>
+        </ns0:tc>
+        <ns0:tc>
+          <ns0:tcPr>
+            <ns0:tcW ns0:type="dxa" ns0:w="1417"/>
+            <ns0:vAlign ns0:val="center"/>
+            <ns0:tcMar>
+              <ns0:top ns0:w="80" ns0:type="dxa"/>
+              <ns0:start ns0:w="80" ns0:type="dxa"/>
+              <ns0:bottom ns0:w="80" ns0:type="dxa"/>
+              <ns0:end ns0:w="80" ns0:type="dxa"/>
+            </ns0:tcMar>
+          </ns0:tcPr>
+          <ns0:p>
+            <ns0:pPr>
+              <ns0:spacing ns0:before="0" ns0:after="0" ns0:line="240" ns0:lineRule="auto"/>
+              <ns0:ind ns0:firstLine="0" ns0:left="0" ns0:right="0"/>
+              <ns0:jc ns0:val="center"/>
+            </ns0:pPr>
+            <ns0:r>
+              <ns0:rPr>
+                <ns0:rFonts ns0:ascii="宋体" ns0:hAnsi="宋体" ns0:eastAsia="宋体"/>
+                <ns0:b ns0:val="0"/>
+                <ns0:color ns0:val="000000"/>
+                <ns0:sz ns0:val="18"/>
+              </ns0:rPr>
+              <ns0:t>全部</ns0:t>
+            </ns0:r>
+          </ns0:p>
+        </ns0:tc>
+        <ns0:tc>
+          <ns0:tcPr>
+            <ns0:tcW ns0:type="dxa" ns0:w="4535"/>
+            <ns0:vAlign ns0:val="center"/>
+            <ns0:tcMar>
+              <ns0:top ns0:w="80" ns0:type="dxa"/>
+              <ns0:start ns0:w="80" ns0:type="dxa"/>
+              <ns0:bottom ns0:w="80" ns0:type="dxa"/>
+              <ns0:end ns0:w="80" ns0:type="dxa"/>
+            </ns0:tcMar>
+          </ns0:tcPr>
+          <ns0:p>
+            <ns0:pPr>
+              <ns0:spacing ns0:before="0" ns0:after="0" ns0:line="240" ns0:lineRule="auto"/>
               <ns0:ind ns0:firstLine="0" ns0:left="0" ns0:right="0"/>
               <ns0:jc ns0:val="left"/>
             </ns0:pPr>
             <ns0:r>
               <ns0:rPr>
-                <ns0:rFonts ns0:ascii="Times New Roman" ns0:hAnsi="Times New Roman" ns0:eastAsia="宋体"/>
-                <ns0:b ns0:val="0"/>
-                <ns0:color ns0:val="000000"/>
-                <ns0:sz ns0:val="21"/>
-              </ns0:rPr>
-              <ns0:t>2026-09-10</ns0:t>
+                <ns0:rFonts ns0:ascii="宋体" ns0:hAnsi="宋体" ns0:eastAsia="宋体"/>
+                <ns0:b ns0:val="0"/>
+                <ns0:color ns0:val="000000"/>
+                <ns0:sz ns0:val="18"/>
+              </ns0:rPr>
+              <ns0:t>基于冻结编标输入形成项目建议书工作稿。</ns0:t>
             </ns0:r>
           </ns0:p>
         </ns0:tc>
@@ -388,80 +472,24 @@
             <ns0:tcW ns0:type="dxa" ns0:w="1531"/>
             <ns0:vAlign ns0:val="center"/>
             <ns0:tcMar>
-              <ns0:top ns0:w="90" ns0:type="dxa"/>
-              <ns0:start ns0:w="100" ns0:type="dxa"/>
-              <ns0:bottom ns0:w="90" ns0:type="dxa"/>
-              <ns0:end ns0:w="100" ns0:type="dxa"/>
-            </ns0:tcMar>
-          </ns0:tcPr>
-          <ns0:p>
-            <ns0:pPr>
-              <ns0:spacing ns0:before="0" ns0:after="0" ns0:line="276" ns0:lineRule="auto"/>
-              <ns0:ind ns0:firstLine="0" ns0:left="0" ns0:right="0"/>
-              <ns0:jc ns0:val="left"/>
-            </ns0:pPr>
-            <ns0:r>
-              <ns0:rPr>
-                <ns0:rFonts ns0:ascii="Times New Roman" ns0:hAnsi="Times New Roman" ns0:eastAsia="宋体"/>
-                <ns0:b ns0:val="0"/>
-                <ns0:color ns0:val="000000"/>
-                <ns0:sz ns0:val="21"/>
-              </ns0:rPr>
-              <ns0:t>全部</ns0:t>
-            </ns0:r>
-          </ns0:p>
-        </ns0:tc>
-        <ns0:tc>
-          <ns0:tcPr>
-            <ns0:tcW ns0:type="dxa" ns0:w="3118"/>
-            <ns0:vAlign ns0:val="center"/>
-            <ns0:tcMar>
-              <ns0:top ns0:w="90" ns0:type="dxa"/>
-              <ns0:start ns0:w="100" ns0:type="dxa"/>
-              <ns0:bottom ns0:w="90" ns0:type="dxa"/>
-              <ns0:end ns0:w="100" ns0:type="dxa"/>
-            </ns0:tcMar>
-          </ns0:tcPr>
-          <ns0:p>
-            <ns0:pPr>
-              <ns0:spacing ns0:before="0" ns0:after="0" ns0:line="276" ns0:lineRule="auto"/>
-              <ns0:ind ns0:firstLine="0" ns0:left="0" ns0:right="0"/>
-              <ns0:jc ns0:val="left"/>
-            </ns0:pPr>
-            <ns0:r>
-              <ns0:rPr>
-                <ns0:rFonts ns0:ascii="Times New Roman" ns0:hAnsi="Times New Roman" ns0:eastAsia="宋体"/>
-                <ns0:b ns0:val="0"/>
-                <ns0:color ns0:val="000000"/>
-                <ns0:sz ns0:val="21"/>
-              </ns0:rPr>
-              <ns0:t>基于冻结编标输入形成项目建议书工作稿。</ns0:t>
-            </ns0:r>
-          </ns0:p>
-        </ns0:tc>
-        <ns0:tc>
-          <ns0:tcPr>
-            <ns0:tcW ns0:type="dxa" ns0:w="1655"/>
-            <ns0:vAlign ns0:val="center"/>
-            <ns0:tcMar>
-              <ns0:top ns0:w="90" ns0:type="dxa"/>
-              <ns0:start ns0:w="100" ns0:type="dxa"/>
-              <ns0:bottom ns0:w="90" ns0:type="dxa"/>
-              <ns0:end ns0:w="100" ns0:type="dxa"/>
-            </ns0:tcMar>
-          </ns0:tcPr>
-          <ns0:p>
-            <ns0:pPr>
-              <ns0:spacing ns0:before="0" ns0:after="0" ns0:line="276" ns0:lineRule="auto"/>
-              <ns0:ind ns0:firstLine="0" ns0:left="0" ns0:right="0"/>
-              <ns0:jc ns0:val="left"/>
-            </ns0:pPr>
-            <ns0:r>
-              <ns0:rPr>
-                <ns0:rFonts ns0:ascii="Times New Roman" ns0:hAnsi="Times New Roman" ns0:eastAsia="宋体"/>
-                <ns0:b ns0:val="0"/>
-                <ns0:color ns0:val="000000"/>
-                <ns0:sz ns0:val="21"/>
+              <ns0:top ns0:w="80" ns0:type="dxa"/>
+              <ns0:start ns0:w="80" ns0:type="dxa"/>
+              <ns0:bottom ns0:w="80" ns0:type="dxa"/>
+              <ns0:end ns0:w="80" ns0:type="dxa"/>
+            </ns0:tcMar>
+          </ns0:tcPr>
+          <ns0:p>
+            <ns0:pPr>
+              <ns0:spacing ns0:before="0" ns0:after="0" ns0:line="240" ns0:lineRule="auto"/>
+              <ns0:ind ns0:firstLine="0" ns0:left="0" ns0:right="0"/>
+              <ns0:jc ns0:val="center"/>
+            </ns0:pPr>
+            <ns0:r>
+              <ns0:rPr>
+                <ns0:rFonts ns0:ascii="宋体" ns0:hAnsi="宋体" ns0:eastAsia="宋体"/>
+                <ns0:b ns0:val="0"/>
+                <ns0:color ns0:val="000000"/>
+                <ns0:sz ns0:val="18"/>
               </ns0:rPr>
               <ns0:t>何思源</ns0:t>
             </ns0:r>
@@ -469,59 +497,118 @@
         </ns0:tc>
       </ns0:tr>
       <ns0:tr>
+        <ns0:trPr>
+          <ns0:trHeight ns0:hRule="atLeast" ns0:val="442"/>
+        </ns0:trPr>
+        <ns0:tc>
+          <ns0:tcPr>
+            <ns0:tcW ns0:type="dxa" ns0:w="964"/>
+            <ns0:vAlign ns0:val="center"/>
+            <ns0:tcMar>
+              <ns0:top ns0:w="80" ns0:type="dxa"/>
+              <ns0:start ns0:w="80" ns0:type="dxa"/>
+              <ns0:bottom ns0:w="80" ns0:type="dxa"/>
+              <ns0:end ns0:w="80" ns0:type="dxa"/>
+            </ns0:tcMar>
+          </ns0:tcPr>
+          <ns0:p>
+            <ns0:pPr>
+              <ns0:spacing ns0:before="0" ns0:after="0" ns0:line="240" ns0:lineRule="auto"/>
+              <ns0:ind ns0:firstLine="0" ns0:left="0" ns0:right="0"/>
+              <ns0:jc ns0:val="center"/>
+            </ns0:pPr>
+            <ns0:r>
+              <ns0:rPr>
+                <ns0:rFonts ns0:ascii="宋体" ns0:hAnsi="宋体" ns0:eastAsia="宋体"/>
+                <ns0:b ns0:val="0"/>
+                <ns0:color ns0:val="000000"/>
+                <ns0:sz ns0:val="18"/>
+              </ns0:rPr>
+              <ns0:t>V0.2</ns0:t>
+            </ns0:r>
+          </ns0:p>
+        </ns0:tc>
         <ns0:tc>
           <ns0:tcPr>
             <ns0:tcW ns0:type="dxa" ns0:w="1247"/>
             <ns0:vAlign ns0:val="center"/>
             <ns0:tcMar>
-              <ns0:top ns0:w="90" ns0:type="dxa"/>
-              <ns0:start ns0:w="100" ns0:type="dxa"/>
-              <ns0:bottom ns0:w="90" ns0:type="dxa"/>
-              <ns0:end ns0:w="100" ns0:type="dxa"/>
-            </ns0:tcMar>
-          </ns0:tcPr>
-          <ns0:p>
-            <ns0:pPr>
-              <ns0:spacing ns0:before="0" ns0:after="0" ns0:line="276" ns0:lineRule="auto"/>
+              <ns0:top ns0:w="80" ns0:type="dxa"/>
+              <ns0:start ns0:w="80" ns0:type="dxa"/>
+              <ns0:bottom ns0:w="80" ns0:type="dxa"/>
+              <ns0:end ns0:w="80" ns0:type="dxa"/>
+            </ns0:tcMar>
+          </ns0:tcPr>
+          <ns0:p>
+            <ns0:pPr>
+              <ns0:spacing ns0:before="0" ns0:after="0" ns0:line="240" ns0:lineRule="auto"/>
               <ns0:ind ns0:firstLine="0" ns0:left="0" ns0:right="0"/>
               <ns0:jc ns0:val="center"/>
             </ns0:pPr>
             <ns0:r>
               <ns0:rPr>
-                <ns0:rFonts ns0:ascii="Times New Roman" ns0:hAnsi="Times New Roman" ns0:eastAsia="宋体"/>
-                <ns0:b ns0:val="0"/>
-                <ns0:color ns0:val="000000"/>
-                <ns0:sz ns0:val="21"/>
-              </ns0:rPr>
-              <ns0:t>V0.2</ns0:t>
-            </ns0:r>
-          </ns0:p>
-        </ns0:tc>
-        <ns0:tc>
-          <ns0:tcPr>
-            <ns0:tcW ns0:type="dxa" ns0:w="1474"/>
-            <ns0:vAlign ns0:val="center"/>
-            <ns0:tcMar>
-              <ns0:top ns0:w="90" ns0:type="dxa"/>
-              <ns0:start ns0:w="100" ns0:type="dxa"/>
-              <ns0:bottom ns0:w="90" ns0:type="dxa"/>
-              <ns0:end ns0:w="100" ns0:type="dxa"/>
-            </ns0:tcMar>
-          </ns0:tcPr>
-          <ns0:p>
-            <ns0:pPr>
-              <ns0:spacing ns0:before="0" ns0:after="0" ns0:line="276" ns0:lineRule="auto"/>
+                <ns0:rFonts ns0:ascii="宋体" ns0:hAnsi="宋体" ns0:eastAsia="宋体"/>
+                <ns0:b ns0:val="0"/>
+                <ns0:color ns0:val="000000"/>
+                <ns0:sz ns0:val="18"/>
+              </ns0:rPr>
+              <ns0:t>2026-09-10</ns0:t>
+            </ns0:r>
+          </ns0:p>
+        </ns0:tc>
+        <ns0:tc>
+          <ns0:tcPr>
+            <ns0:tcW ns0:type="dxa" ns0:w="1417"/>
+            <ns0:vAlign ns0:val="center"/>
+            <ns0:tcMar>
+              <ns0:top ns0:w="80" ns0:type="dxa"/>
+              <ns0:start ns0:w="80" ns0:type="dxa"/>
+              <ns0:bottom ns0:w="80" ns0:type="dxa"/>
+              <ns0:end ns0:w="80" ns0:type="dxa"/>
+            </ns0:tcMar>
+          </ns0:tcPr>
+          <ns0:p>
+            <ns0:pPr>
+              <ns0:spacing ns0:before="0" ns0:after="0" ns0:line="240" ns0:lineRule="auto"/>
+              <ns0:ind ns0:firstLine="0" ns0:left="0" ns0:right="0"/>
+              <ns0:jc ns0:val="center"/>
+            </ns0:pPr>
+            <ns0:r>
+              <ns0:rPr>
+                <ns0:rFonts ns0:ascii="宋体" ns0:hAnsi="宋体" ns0:eastAsia="宋体"/>
+                <ns0:b ns0:val="0"/>
+                <ns0:color ns0:val="000000"/>
+                <ns0:sz ns0:val="18"/>
+              </ns0:rPr>
+              <ns0:t>状态、3.1、3.3、7</ns0:t>
+            </ns0:r>
+          </ns0:p>
+        </ns0:tc>
+        <ns0:tc>
+          <ns0:tcPr>
+            <ns0:tcW ns0:type="dxa" ns0:w="4535"/>
+            <ns0:vAlign ns0:val="center"/>
+            <ns0:tcMar>
+              <ns0:top ns0:w="80" ns0:type="dxa"/>
+              <ns0:start ns0:w="80" ns0:type="dxa"/>
+              <ns0:bottom ns0:w="80" ns0:type="dxa"/>
+              <ns0:end ns0:w="80" ns0:type="dxa"/>
+            </ns0:tcMar>
+          </ns0:tcPr>
+          <ns0:p>
+            <ns0:pPr>
+              <ns0:spacing ns0:before="0" ns0:after="0" ns0:line="240" ns0:lineRule="auto"/>
               <ns0:ind ns0:firstLine="0" ns0:left="0" ns0:right="0"/>
               <ns0:jc ns0:val="left"/>
             </ns0:pPr>
             <ns0:r>
               <ns0:rPr>
-                <ns0:rFonts ns0:ascii="Times New Roman" ns0:hAnsi="Times New Roman" ns0:eastAsia="宋体"/>
-                <ns0:b ns0:val="0"/>
-                <ns0:color ns0:val="000000"/>
-                <ns0:sz ns0:val="21"/>
-              </ns0:rPr>
-              <ns0:t>2026-09-10</ns0:t>
+                <ns0:rFonts ns0:ascii="宋体" ns0:hAnsi="宋体" ns0:eastAsia="宋体"/>
+                <ns0:b ns0:val="0"/>
+                <ns0:color ns0:val="000000"/>
+                <ns0:sz ns0:val="18"/>
+              </ns0:rPr>
+              <ns0:t>明确课程模拟澄清边界，采用总体技术方案 V0.6 稳定结论，并按教学样例重新排版。</ns0:t>
             </ns0:r>
           </ns0:p>
         </ns0:tc>
@@ -530,80 +617,429 @@
             <ns0:tcW ns0:type="dxa" ns0:w="1531"/>
             <ns0:vAlign ns0:val="center"/>
             <ns0:tcMar>
-              <ns0:top ns0:w="90" ns0:type="dxa"/>
-              <ns0:start ns0:w="100" ns0:type="dxa"/>
-              <ns0:bottom ns0:w="90" ns0:type="dxa"/>
-              <ns0:end ns0:w="100" ns0:type="dxa"/>
-            </ns0:tcMar>
-          </ns0:tcPr>
-          <ns0:p>
-            <ns0:pPr>
-              <ns0:spacing ns0:before="0" ns0:after="0" ns0:line="276" ns0:lineRule="auto"/>
-              <ns0:ind ns0:firstLine="0" ns0:left="0" ns0:right="0"/>
+              <ns0:top ns0:w="80" ns0:type="dxa"/>
+              <ns0:start ns0:w="80" ns0:type="dxa"/>
+              <ns0:bottom ns0:w="80" ns0:type="dxa"/>
+              <ns0:end ns0:w="80" ns0:type="dxa"/>
+            </ns0:tcMar>
+          </ns0:tcPr>
+          <ns0:p>
+            <ns0:pPr>
+              <ns0:spacing ns0:before="0" ns0:after="0" ns0:line="240" ns0:lineRule="auto"/>
+              <ns0:ind ns0:firstLine="0" ns0:left="0" ns0:right="0"/>
+              <ns0:jc ns0:val="center"/>
+            </ns0:pPr>
+            <ns0:r>
+              <ns0:rPr>
+                <ns0:rFonts ns0:ascii="宋体" ns0:hAnsi="宋体" ns0:eastAsia="宋体"/>
+                <ns0:b ns0:val="0"/>
+                <ns0:color ns0:val="000000"/>
+                <ns0:sz ns0:val="18"/>
+              </ns0:rPr>
+              <ns0:t>何思源</ns0:t>
+            </ns0:r>
+          </ns0:p>
+        </ns0:tc>
+      </ns0:tr>
+      <ns0:tr>
+        <ns0:trPr>
+          <ns0:trHeight ns0:hRule="atLeast" ns0:val="442"/>
+        </ns0:trPr>
+        <ns0:tc>
+          <ns0:tcPr>
+            <ns0:tcW ns0:type="dxa" ns0:w="964"/>
+            <ns0:tcMar>
+              <ns0:top ns0:w="80" ns0:type="dxa"/>
+              <ns0:start ns0:w="80" ns0:type="dxa"/>
+              <ns0:bottom ns0:w="80" ns0:type="dxa"/>
+              <ns0:end ns0:w="80" ns0:type="dxa"/>
+            </ns0:tcMar>
+            <ns0:vAlign ns0:val="center"/>
+          </ns0:tcPr>
+          <ns0:p>
+            <ns0:pPr>
+              <ns0:spacing ns0:before="0" ns0:after="0" ns0:line="240" ns0:lineRule="auto"/>
+              <ns0:jc ns0:val="center"/>
+            </ns0:pPr>
+            <ns0:r>
+              <ns0:rPr>
+                <ns0:rFonts ns0:ascii="宋体" ns0:hAnsi="宋体" ns0:eastAsia="宋体"/>
+                <ns0:b ns0:val="0"/>
+                <ns0:sz ns0:val="18"/>
+              </ns0:rPr>
+              <ns0:t>V1.0</ns0:t>
+            </ns0:r>
+          </ns0:p>
+        </ns0:tc>
+        <ns0:tc>
+          <ns0:tcPr>
+            <ns0:tcW ns0:type="dxa" ns0:w="1247"/>
+            <ns0:tcMar>
+              <ns0:top ns0:w="80" ns0:type="dxa"/>
+              <ns0:start ns0:w="80" ns0:type="dxa"/>
+              <ns0:bottom ns0:w="80" ns0:type="dxa"/>
+              <ns0:end ns0:w="80" ns0:type="dxa"/>
+            </ns0:tcMar>
+            <ns0:vAlign ns0:val="center"/>
+          </ns0:tcPr>
+          <ns0:p>
+            <ns0:pPr>
+              <ns0:spacing ns0:before="0" ns0:after="0" ns0:line="240" ns0:lineRule="auto"/>
+              <ns0:jc ns0:val="center"/>
+            </ns0:pPr>
+            <ns0:r>
+              <ns0:rPr>
+                <ns0:rFonts ns0:ascii="宋体" ns0:hAnsi="宋体" ns0:eastAsia="宋体"/>
+                <ns0:b ns0:val="0"/>
+                <ns0:sz ns0:val="18"/>
+              </ns0:rPr>
+              <ns0:t>2026-09-12</ns0:t>
+            </ns0:r>
+          </ns0:p>
+        </ns0:tc>
+        <ns0:tc>
+          <ns0:tcPr>
+            <ns0:tcW ns0:type="dxa" ns0:w="1417"/>
+            <ns0:tcMar>
+              <ns0:top ns0:w="80" ns0:type="dxa"/>
+              <ns0:start ns0:w="80" ns0:type="dxa"/>
+              <ns0:bottom ns0:w="80" ns0:type="dxa"/>
+              <ns0:end ns0:w="80" ns0:type="dxa"/>
+            </ns0:tcMar>
+            <ns0:vAlign ns0:val="center"/>
+          </ns0:tcPr>
+          <ns0:p>
+            <ns0:pPr>
+              <ns0:spacing ns0:before="0" ns0:after="0" ns0:line="240" ns0:lineRule="auto"/>
+              <ns0:jc ns0:val="center"/>
+            </ns0:pPr>
+            <ns0:r>
+              <ns0:rPr>
+                <ns0:rFonts ns0:ascii="宋体" ns0:hAnsi="宋体" ns0:eastAsia="宋体"/>
+                <ns0:b ns0:val="0"/>
+                <ns0:sz ns0:val="18"/>
+              </ns0:rPr>
+              <ns0:t>全文</ns0:t>
+            </ns0:r>
+          </ns0:p>
+        </ns0:tc>
+        <ns0:tc>
+          <ns0:tcPr>
+            <ns0:tcW ns0:type="dxa" ns0:w="4535"/>
+            <ns0:tcMar>
+              <ns0:top ns0:w="80" ns0:type="dxa"/>
+              <ns0:start ns0:w="80" ns0:type="dxa"/>
+              <ns0:bottom ns0:w="80" ns0:type="dxa"/>
+              <ns0:end ns0:w="80" ns0:type="dxa"/>
+            </ns0:tcMar>
+            <ns0:vAlign ns0:val="center"/>
+          </ns0:tcPr>
+          <ns0:p>
+            <ns0:pPr>
+              <ns0:spacing ns0:before="0" ns0:after="0" ns0:line="240" ns0:lineRule="auto"/>
               <ns0:jc ns0:val="left"/>
             </ns0:pPr>
             <ns0:r>
               <ns0:rPr>
-                <ns0:rFonts ns0:ascii="Times New Roman" ns0:hAnsi="Times New Roman" ns0:eastAsia="宋体"/>
-                <ns0:b ns0:val="0"/>
-                <ns0:color ns0:val="000000"/>
-                <ns0:sz ns0:val="21"/>
-              </ns0:rPr>
-              <ns0:t>状态、3.1、3.3、7</ns0:t>
-            </ns0:r>
-          </ns0:p>
-        </ns0:tc>
-        <ns0:tc>
-          <ns0:tcPr>
-            <ns0:tcW ns0:type="dxa" ns0:w="3118"/>
-            <ns0:vAlign ns0:val="center"/>
-            <ns0:tcMar>
-              <ns0:top ns0:w="90" ns0:type="dxa"/>
-              <ns0:start ns0:w="100" ns0:type="dxa"/>
-              <ns0:bottom ns0:w="90" ns0:type="dxa"/>
-              <ns0:end ns0:w="100" ns0:type="dxa"/>
-            </ns0:tcMar>
-          </ns0:tcPr>
-          <ns0:p>
-            <ns0:pPr>
-              <ns0:spacing ns0:before="0" ns0:after="0" ns0:line="276" ns0:lineRule="auto"/>
-              <ns0:ind ns0:firstLine="0" ns0:left="0" ns0:right="0"/>
+                <ns0:rFonts ns0:ascii="宋体" ns0:hAnsi="宋体" ns0:eastAsia="宋体"/>
+                <ns0:b ns0:val="0"/>
+                <ns0:sz ns0:val="18"/>
+              </ns0:rPr>
+              <ns0:t>完成技术与符合性复核并纳入第一关冻结成果。</ns0:t>
+            </ns0:r>
+          </ns0:p>
+        </ns0:tc>
+        <ns0:tc>
+          <ns0:tcPr>
+            <ns0:tcW ns0:type="dxa" ns0:w="1531"/>
+            <ns0:tcMar>
+              <ns0:top ns0:w="80" ns0:type="dxa"/>
+              <ns0:start ns0:w="80" ns0:type="dxa"/>
+              <ns0:bottom ns0:w="80" ns0:type="dxa"/>
+              <ns0:end ns0:w="80" ns0:type="dxa"/>
+            </ns0:tcMar>
+            <ns0:vAlign ns0:val="center"/>
+          </ns0:tcPr>
+          <ns0:p>
+            <ns0:pPr>
+              <ns0:spacing ns0:before="0" ns0:after="0" ns0:line="240" ns0:lineRule="auto"/>
+              <ns0:jc ns0:val="center"/>
+            </ns0:pPr>
+            <ns0:r>
+              <ns0:rPr>
+                <ns0:rFonts ns0:ascii="宋体" ns0:hAnsi="宋体" ns0:eastAsia="宋体"/>
+                <ns0:b ns0:val="0"/>
+                <ns0:sz ns0:val="18"/>
+              </ns0:rPr>
+              <ns0:t>何思源</ns0:t>
+            </ns0:r>
+          </ns0:p>
+        </ns0:tc>
+      </ns0:tr>
+      <ns0:tr>
+        <ns0:trPr>
+          <ns0:trHeight ns0:hRule="atLeast" ns0:val="442"/>
+        </ns0:trPr>
+        <ns0:tc>
+          <ns0:tcPr>
+            <ns0:tcW ns0:type="dxa" ns0:w="964"/>
+            <ns0:tcMar>
+              <ns0:top ns0:w="80" ns0:type="dxa"/>
+              <ns0:start ns0:w="80" ns0:type="dxa"/>
+              <ns0:bottom ns0:w="80" ns0:type="dxa"/>
+              <ns0:end ns0:w="80" ns0:type="dxa"/>
+            </ns0:tcMar>
+            <ns0:vAlign ns0:val="center"/>
+          </ns0:tcPr>
+          <ns0:p>
+            <ns0:pPr>
+              <ns0:spacing ns0:before="0" ns0:after="0" ns0:line="240" ns0:lineRule="auto"/>
+              <ns0:jc ns0:val="center"/>
+            </ns0:pPr>
+            <ns0:r>
+              <ns0:rPr>
+                <ns0:rFonts ns0:ascii="宋体" ns0:hAnsi="宋体" ns0:eastAsia="宋体"/>
+                <ns0:b ns0:val="0"/>
+                <ns0:sz ns0:val="18"/>
+              </ns0:rPr>
+              <ns0:t>V1.1</ns0:t>
+            </ns0:r>
+          </ns0:p>
+        </ns0:tc>
+        <ns0:tc>
+          <ns0:tcPr>
+            <ns0:tcW ns0:type="dxa" ns0:w="1247"/>
+            <ns0:tcMar>
+              <ns0:top ns0:w="80" ns0:type="dxa"/>
+              <ns0:start ns0:w="80" ns0:type="dxa"/>
+              <ns0:bottom ns0:w="80" ns0:type="dxa"/>
+              <ns0:end ns0:w="80" ns0:type="dxa"/>
+            </ns0:tcMar>
+            <ns0:vAlign ns0:val="center"/>
+          </ns0:tcPr>
+          <ns0:p>
+            <ns0:pPr>
+              <ns0:spacing ns0:before="0" ns0:after="0" ns0:line="240" ns0:lineRule="auto"/>
+              <ns0:jc ns0:val="center"/>
+            </ns0:pPr>
+            <ns0:r>
+              <ns0:rPr>
+                <ns0:rFonts ns0:ascii="宋体" ns0:hAnsi="宋体" ns0:eastAsia="宋体"/>
+                <ns0:b ns0:val="0"/>
+                <ns0:sz ns0:val="18"/>
+              </ns0:rPr>
+              <ns0:t>2026-09-13</ns0:t>
+            </ns0:r>
+          </ns0:p>
+        </ns0:tc>
+        <ns0:tc>
+          <ns0:tcPr>
+            <ns0:tcW ns0:type="dxa" ns0:w="1417"/>
+            <ns0:tcMar>
+              <ns0:top ns0:w="80" ns0:type="dxa"/>
+              <ns0:start ns0:w="80" ns0:type="dxa"/>
+              <ns0:bottom ns0:w="80" ns0:type="dxa"/>
+              <ns0:end ns0:w="80" ns0:type="dxa"/>
+            </ns0:tcMar>
+            <ns0:vAlign ns0:val="center"/>
+          </ns0:tcPr>
+          <ns0:p>
+            <ns0:pPr>
+              <ns0:spacing ns0:before="0" ns0:after="0" ns0:line="240" ns0:lineRule="auto"/>
+              <ns0:jc ns0:val="center"/>
+            </ns0:pPr>
+            <ns0:r>
+              <ns0:rPr>
+                <ns0:rFonts ns0:ascii="宋体" ns0:hAnsi="宋体" ns0:eastAsia="宋体"/>
+                <ns0:b ns0:val="0"/>
+                <ns0:sz ns0:val="18"/>
+              </ns0:rPr>
+              <ns0:t>封面及署名</ns0:t>
+            </ns0:r>
+          </ns0:p>
+        </ns0:tc>
+        <ns0:tc>
+          <ns0:tcPr>
+            <ns0:tcW ns0:type="dxa" ns0:w="4535"/>
+            <ns0:tcMar>
+              <ns0:top ns0:w="80" ns0:type="dxa"/>
+              <ns0:start ns0:w="80" ns0:type="dxa"/>
+              <ns0:bottom ns0:w="80" ns0:type="dxa"/>
+              <ns0:end ns0:w="80" ns0:type="dxa"/>
+            </ns0:tcMar>
+            <ns0:vAlign ns0:val="center"/>
+          </ns0:tcPr>
+          <ns0:p>
+            <ns0:pPr>
+              <ns0:spacing ns0:before="0" ns0:after="0" ns0:line="240" ns0:lineRule="auto"/>
               <ns0:jc ns0:val="left"/>
             </ns0:pPr>
             <ns0:r>
               <ns0:rPr>
-                <ns0:rFonts ns0:ascii="Times New Roman" ns0:hAnsi="Times New Roman" ns0:eastAsia="宋体"/>
-                <ns0:b ns0:val="0"/>
-                <ns0:color ns0:val="000000"/>
-                <ns0:sz ns0:val="21"/>
-              </ns0:rPr>
-              <ns0:t>明确课程模拟澄清边界，采用总体技术方案 V0.6 稳定结论，并按教学样例重新排版。</ns0:t>
-            </ns0:r>
-          </ns0:p>
-        </ns0:tc>
-        <ns0:tc>
-          <ns0:tcPr>
-            <ns0:tcW ns0:type="dxa" ns0:w="1655"/>
-            <ns0:vAlign ns0:val="center"/>
-            <ns0:tcMar>
-              <ns0:top ns0:w="90" ns0:type="dxa"/>
-              <ns0:start ns0:w="100" ns0:type="dxa"/>
-              <ns0:bottom ns0:w="90" ns0:type="dxa"/>
-              <ns0:end ns0:w="100" ns0:type="dxa"/>
-            </ns0:tcMar>
-          </ns0:tcPr>
-          <ns0:p>
-            <ns0:pPr>
-              <ns0:spacing ns0:before="0" ns0:after="0" ns0:line="276" ns0:lineRule="auto"/>
-              <ns0:ind ns0:firstLine="0" ns0:left="0" ns0:right="0"/>
+                <ns0:rFonts ns0:ascii="宋体" ns0:hAnsi="宋体" ns0:eastAsia="宋体"/>
+                <ns0:b ns0:val="0"/>
+                <ns0:sz ns0:val="18"/>
+              </ns0:rPr>
+              <ns0:t>完成正式交付物实名化和首轮格式规范化。</ns0:t>
+            </ns0:r>
+          </ns0:p>
+        </ns0:tc>
+        <ns0:tc>
+          <ns0:tcPr>
+            <ns0:tcW ns0:type="dxa" ns0:w="1531"/>
+            <ns0:tcMar>
+              <ns0:top ns0:w="80" ns0:type="dxa"/>
+              <ns0:start ns0:w="80" ns0:type="dxa"/>
+              <ns0:bottom ns0:w="80" ns0:type="dxa"/>
+              <ns0:end ns0:w="80" ns0:type="dxa"/>
+            </ns0:tcMar>
+            <ns0:vAlign ns0:val="center"/>
+          </ns0:tcPr>
+          <ns0:p>
+            <ns0:pPr>
+              <ns0:spacing ns0:before="0" ns0:after="0" ns0:line="240" ns0:lineRule="auto"/>
+              <ns0:jc ns0:val="center"/>
+            </ns0:pPr>
+            <ns0:r>
+              <ns0:rPr>
+                <ns0:rFonts ns0:ascii="宋体" ns0:hAnsi="宋体" ns0:eastAsia="宋体"/>
+                <ns0:b ns0:val="0"/>
+                <ns0:sz ns0:val="18"/>
+              </ns0:rPr>
+              <ns0:t>何思源</ns0:t>
+            </ns0:r>
+          </ns0:p>
+        </ns0:tc>
+      </ns0:tr>
+      <ns0:tr>
+        <ns0:trPr>
+          <ns0:trHeight ns0:hRule="atLeast" ns0:val="442"/>
+        </ns0:trPr>
+        <ns0:tc>
+          <ns0:tcPr>
+            <ns0:tcW ns0:type="dxa" ns0:w="964"/>
+            <ns0:tcMar>
+              <ns0:top ns0:w="80" ns0:type="dxa"/>
+              <ns0:start ns0:w="80" ns0:type="dxa"/>
+              <ns0:bottom ns0:w="80" ns0:type="dxa"/>
+              <ns0:end ns0:w="80" ns0:type="dxa"/>
+            </ns0:tcMar>
+            <ns0:vAlign ns0:val="center"/>
+          </ns0:tcPr>
+          <ns0:p>
+            <ns0:pPr>
+              <ns0:spacing ns0:before="0" ns0:after="0" ns0:line="240" ns0:lineRule="auto"/>
+              <ns0:jc ns0:val="center"/>
+            </ns0:pPr>
+            <ns0:r>
+              <ns0:rPr>
+                <ns0:rFonts ns0:ascii="宋体" ns0:hAnsi="宋体" ns0:eastAsia="宋体"/>
+                <ns0:b ns0:val="0"/>
+                <ns0:sz ns0:val="18"/>
+              </ns0:rPr>
+              <ns0:t>V1.2</ns0:t>
+            </ns0:r>
+          </ns0:p>
+        </ns0:tc>
+        <ns0:tc>
+          <ns0:tcPr>
+            <ns0:tcW ns0:type="dxa" ns0:w="1247"/>
+            <ns0:tcMar>
+              <ns0:top ns0:w="80" ns0:type="dxa"/>
+              <ns0:start ns0:w="80" ns0:type="dxa"/>
+              <ns0:bottom ns0:w="80" ns0:type="dxa"/>
+              <ns0:end ns0:w="80" ns0:type="dxa"/>
+            </ns0:tcMar>
+            <ns0:vAlign ns0:val="center"/>
+          </ns0:tcPr>
+          <ns0:p>
+            <ns0:pPr>
+              <ns0:spacing ns0:before="0" ns0:after="0" ns0:line="240" ns0:lineRule="auto"/>
+              <ns0:jc ns0:val="center"/>
+            </ns0:pPr>
+            <ns0:r>
+              <ns0:rPr>
+                <ns0:rFonts ns0:ascii="宋体" ns0:hAnsi="宋体" ns0:eastAsia="宋体"/>
+                <ns0:b ns0:val="0"/>
+                <ns0:sz ns0:val="18"/>
+              </ns0:rPr>
+              <ns0:t>2026-09-13</ns0:t>
+            </ns0:r>
+          </ns0:p>
+        </ns0:tc>
+        <ns0:tc>
+          <ns0:tcPr>
+            <ns0:tcW ns0:type="dxa" ns0:w="1417"/>
+            <ns0:tcMar>
+              <ns0:top ns0:w="80" ns0:type="dxa"/>
+              <ns0:start ns0:w="80" ns0:type="dxa"/>
+              <ns0:bottom ns0:w="80" ns0:type="dxa"/>
+              <ns0:end ns0:w="80" ns0:type="dxa"/>
+            </ns0:tcMar>
+            <ns0:vAlign ns0:val="center"/>
+          </ns0:tcPr>
+          <ns0:p>
+            <ns0:pPr>
+              <ns0:spacing ns0:before="0" ns0:after="0" ns0:line="240" ns0:lineRule="auto"/>
+              <ns0:jc ns0:val="center"/>
+            </ns0:pPr>
+            <ns0:r>
+              <ns0:rPr>
+                <ns0:rFonts ns0:ascii="宋体" ns0:hAnsi="宋体" ns0:eastAsia="宋体"/>
+                <ns0:b ns0:val="0"/>
+                <ns0:sz ns0:val="18"/>
+              </ns0:rPr>
+              <ns0:t>版式、图 2-1、图 3-1</ns0:t>
+            </ns0:r>
+          </ns0:p>
+        </ns0:tc>
+        <ns0:tc>
+          <ns0:tcPr>
+            <ns0:tcW ns0:type="dxa" ns0:w="4535"/>
+            <ns0:tcMar>
+              <ns0:top ns0:w="80" ns0:type="dxa"/>
+              <ns0:start ns0:w="80" ns0:type="dxa"/>
+              <ns0:bottom ns0:w="80" ns0:type="dxa"/>
+              <ns0:end ns0:w="80" ns0:type="dxa"/>
+            </ns0:tcMar>
+            <ns0:vAlign ns0:val="center"/>
+          </ns0:tcPr>
+          <ns0:p>
+            <ns0:pPr>
+              <ns0:spacing ns0:before="0" ns0:after="0" ns0:line="240" ns0:lineRule="auto"/>
               <ns0:jc ns0:val="left"/>
             </ns0:pPr>
             <ns0:r>
               <ns0:rPr>
-                <ns0:rFonts ns0:ascii="Times New Roman" ns0:hAnsi="Times New Roman" ns0:eastAsia="宋体"/>
-                <ns0:b ns0:val="0"/>
-                <ns0:color ns0:val="000000"/>
-                <ns0:sz ns0:val="21"/>
+                <ns0:rFonts ns0:ascii="宋体" ns0:hAnsi="宋体" ns0:eastAsia="宋体"/>
+                <ns0:b ns0:val="0"/>
+                <ns0:sz ns0:val="18"/>
+              </ns0:rPr>
+              <ns0:t>按教学样例复核版式并补充业务流程与建设内容分层图。</ns0:t>
+            </ns0:r>
+          </ns0:p>
+        </ns0:tc>
+        <ns0:tc>
+          <ns0:tcPr>
+            <ns0:tcW ns0:type="dxa" ns0:w="1531"/>
+            <ns0:tcMar>
+              <ns0:top ns0:w="80" ns0:type="dxa"/>
+              <ns0:start ns0:w="80" ns0:type="dxa"/>
+              <ns0:bottom ns0:w="80" ns0:type="dxa"/>
+              <ns0:end ns0:w="80" ns0:type="dxa"/>
+            </ns0:tcMar>
+            <ns0:vAlign ns0:val="center"/>
+          </ns0:tcPr>
+          <ns0:p>
+            <ns0:pPr>
+              <ns0:spacing ns0:before="0" ns0:after="0" ns0:line="240" ns0:lineRule="auto"/>
+              <ns0:jc ns0:val="center"/>
+            </ns0:pPr>
+            <ns0:r>
+              <ns0:rPr>
+                <ns0:rFonts ns0:ascii="宋体" ns0:hAnsi="宋体" ns0:eastAsia="宋体"/>
+                <ns0:b ns0:val="0"/>
+                <ns0:sz ns0:val="18"/>
               </ns0:rPr>
               <ns0:t>何思源</ns0:t>
             </ns0:r>
@@ -680,6 +1116,54 @@
       </ns0:pPr>
       <ns0:r>
         <ns0:t>2.1 项目定位与建设目标</ns0:t>
+      </ns0:r>
+    </ns0:p>
+    <ns0:p>
+      <ns0:pPr>
+        <ns0:keepNext/>
+        <ns0:jc ns0:val="center"/>
+      </ns0:pPr>
+      <ns0:r>
+        <ns0:drawing>
+          <wp:inline xmlns:wp="http://schemas.openxmlformats.org/drawingml/2006/wordprocessingDrawing" xmlns:a="http://schemas.openxmlformats.org/drawingml/2006/main" xmlns:pic="http://schemas.openxmlformats.org/drawingml/2006/picture">
+            <wp:extent cx="5760000" cy="2160000"/>
+            <wp:docPr id="1" name="Picture 1"/>
+            <wp:cNvGraphicFramePr>
+              <a:graphicFrameLocks noChangeAspect="1"/>
+            </wp:cNvGraphicFramePr>
+            <a:graphic>
+              <a:graphicData uri="http://schemas.openxmlformats.org/drawingml/2006/picture">
+                <pic:pic>
+                  <pic:nvPicPr>
+                    <pic:cNvPr id="0" name="01-图2-1-应急业务全流程与建设目标.png"/>
+                    <pic:cNvPicPr/>
+                  </pic:nvPicPr>
+                  <pic:blipFill>
+                    <a:blip ns2:embed="rId7"/>
+                    <a:stretch>
+                      <a:fillRect/>
+                    </a:stretch>
+                  </pic:blipFill>
+                  <pic:spPr>
+                    <a:xfrm>
+                      <a:off x="0" y="0"/>
+                      <a:ext cx="5760000" cy="2160000"/>
+                    </a:xfrm>
+                    <a:prstGeom prst="rect"/>
+                  </pic:spPr>
+                </pic:pic>
+              </a:graphicData>
+            </a:graphic>
+          </wp:inline>
+        </ns0:drawing>
+      </ns0:r>
+    </ns0:p>
+    <ns0:p>
+      <ns0:pPr>
+        <ns0:jc ns0:val="center"/>
+      </ns0:pPr>
+      <ns0:r>
+        <ns0:t>图 2-1 应急业务全流程与建设目标</ns0:t>
       </ns0:r>
     </ns0:p>
     <ns0:p>
@@ -1864,6 +2348,54 @@
     </ns0:p>
     <ns0:p>
       <ns0:pPr>
+        <ns0:keepNext/>
+        <ns0:jc ns0:val="center"/>
+      </ns0:pPr>
+      <ns0:r>
+        <ns0:drawing>
+          <wp:inline xmlns:wp="http://schemas.openxmlformats.org/drawingml/2006/wordprocessingDrawing" xmlns:a="http://schemas.openxmlformats.org/drawingml/2006/main" xmlns:pic="http://schemas.openxmlformats.org/drawingml/2006/picture">
+            <wp:extent cx="5760000" cy="2160000"/>
+            <wp:docPr id="2" name="Picture 2"/>
+            <wp:cNvGraphicFramePr>
+              <a:graphicFrameLocks noChangeAspect="1"/>
+            </wp:cNvGraphicFramePr>
+            <a:graphic>
+              <a:graphicData uri="http://schemas.openxmlformats.org/drawingml/2006/picture">
+                <pic:pic>
+                  <pic:nvPicPr>
+                    <pic:cNvPr id="0" name="01-图3-1-建设内容分层结构.png"/>
+                    <pic:cNvPicPr/>
+                  </pic:nvPicPr>
+                  <pic:blipFill>
+                    <a:blip ns2:embed="rId8"/>
+                    <a:stretch>
+                      <a:fillRect/>
+                    </a:stretch>
+                  </pic:blipFill>
+                  <pic:spPr>
+                    <a:xfrm>
+                      <a:off x="0" y="0"/>
+                      <a:ext cx="5760000" cy="2160000"/>
+                    </a:xfrm>
+                    <a:prstGeom prst="rect"/>
+                  </pic:spPr>
+                </pic:pic>
+              </a:graphicData>
+            </a:graphic>
+          </wp:inline>
+        </ns0:drawing>
+      </ns0:r>
+    </ns0:p>
+    <ns0:p>
+      <ns0:pPr>
+        <ns0:jc ns0:val="center"/>
+      </ns0:pPr>
+      <ns0:r>
+        <ns0:t>图 3-1 建设内容分层结构</ns0:t>
+      </ns0:r>
+    </ns0:p>
+    <ns0:p>
+      <ns0:pPr>
         <ns0:widowControl/>
       </ns0:pPr>
       <ns0:r>
@@ -2773,7 +3305,7 @@
     <ns0:sectPr ns0:rsidR="00890094">
       <ns0:footerReference ns0:type="default" ns2:id="rId9"/>
       <ns0:pgSz ns0:w="11906" ns0:h="16838"/>
-      <ns0:pgMar ns0:top="1440" ns0:right="1440" ns0:bottom="1440" ns0:left="1440" ns0:header="709" ns0:footer="709" ns0:gutter="0"/>
+      <ns0:pgMar ns0:top="1440" ns0:right="1440" ns0:bottom="1440" ns0:left="1440" ns0:header="708" ns0:footer="708" ns0:gutter="0"/>
       <ns0:cols ns0:space="720"/>
       <ns0:docGrid ns0:linePitch="360"/>
     </ns0:sectPr>
@@ -3360,35 +3892,22 @@
     <ns0:name ns0:val="Normal"/>
     <ns0:qFormat/>
     <ns0:pPr>
-      <ns0:widowControl/>
-      <ns0:spacing ns0:line="360" ns0:lineRule="auto" ns0:after="100"/>
-      <ns0:ind ns0:firstLine="476"/>
+      <ns0:widowControl ns0:val="0"/>
       <ns0:jc ns0:val="both"/>
     </ns0:pPr>
-    <ns0:rPr>
-      <ns0:rFonts ns0:ascii="Times New Roman" ns0:hAnsi="Times New Roman" ns0:eastAsia="宋体"/>
-      <ns0:b ns0:val="0"/>
-      <ns0:color ns0:val="000000"/>
-      <ns0:sz ns0:val="24"/>
-    </ns0:rPr>
   </ns0:style>
   <ns0:style ns0:type="paragraph" ns0:styleId="1">
     <ns0:name ns0:val="heading 1"/>
     <ns0:uiPriority ns0:val="9"/>
     <ns0:qFormat/>
-    <ns0:pPr>
-      <ns0:keepNext/>
-      <ns0:widowControl/>
-      <ns0:spacing ns0:before="240" ns0:after="160"/>
-      <ns0:outlineLvl ns0:val="0"/>
-    </ns0:pPr>
     <ns0:rPr>
-      <ns0:rFonts ns0:ascii="Arial" ns0:hAnsi="Arial" ns0:eastAsia="黑体"/>
-      <ns0:b/>
       <ns0:color ns0:val="000000"/>
       <ns0:sz ns0:val="32"/>
       <ns0:szCs ns0:val="32"/>
     </ns0:rPr>
+    <ns0:pPr>
+      <ns0:outlineLvl ns0:val="0"/>
+    </ns0:pPr>
   </ns0:style>
   <ns0:style ns0:type="paragraph" ns0:styleId="2">
     <ns0:name ns0:val="heading 2"/>
@@ -3396,19 +3915,14 @@
     <ns0:semiHidden/>
     <ns0:unhideWhenUsed/>
     <ns0:qFormat/>
-    <ns0:pPr>
-      <ns0:keepNext/>
-      <ns0:widowControl/>
-      <ns0:spacing ns0:before="200" ns0:after="120"/>
-      <ns0:outlineLvl ns0:val="1"/>
-    </ns0:pPr>
     <ns0:rPr>
-      <ns0:rFonts ns0:ascii="Arial" ns0:hAnsi="Arial" ns0:eastAsia="黑体"/>
-      <ns0:b/>
       <ns0:color ns0:val="000000"/>
       <ns0:sz ns0:val="26"/>
       <ns0:szCs ns0:val="26"/>
     </ns0:rPr>
+    <ns0:pPr>
+      <ns0:outlineLvl ns0:val="1"/>
+    </ns0:pPr>
   </ns0:style>
   <ns0:style ns0:type="paragraph" ns0:styleId="3">
     <ns0:name ns0:val="heading 3"/>
@@ -3416,19 +3930,14 @@
     <ns0:semiHidden/>
     <ns0:unhideWhenUsed/>
     <ns0:qFormat/>
-    <ns0:pPr>
-      <ns0:keepNext/>
-      <ns0:widowControl/>
-      <ns0:spacing ns0:before="160" ns0:after="80"/>
-      <ns0:outlineLvl ns0:val="2"/>
-    </ns0:pPr>
     <ns0:rPr>
-      <ns0:rFonts ns0:ascii="Arial" ns0:hAnsi="Arial" ns0:eastAsia="黑体"/>
-      <ns0:b/>
       <ns0:color ns0:val="000000"/>
       <ns0:sz ns0:val="24"/>
       <ns0:szCs ns0:val="24"/>
     </ns0:rPr>
+    <ns0:pPr>
+      <ns0:outlineLvl ns0:val="2"/>
+    </ns0:pPr>
   </ns0:style>
   <ns0:style ns0:type="paragraph" ns0:styleId="4">
     <ns0:name ns0:val="heading 4"/>
@@ -3502,13 +4011,7 @@
     <ns0:name ns0:val="Title"/>
     <ns0:uiPriority ns0:val="10"/>
     <ns0:qFormat/>
-    <ns0:pPr>
-      <ns0:spacing ns0:before="520" ns0:after="200"/>
-      <ns0:jc ns0:val="center"/>
-    </ns0:pPr>
     <ns0:rPr>
-      <ns0:rFonts ns0:ascii="Arial" ns0:hAnsi="Arial" ns0:eastAsia="黑体"/>
-      <ns0:b/>
       <ns0:color ns0:val="000000"/>
       <ns0:sz ns0:val="56"/>
       <ns0:szCs ns0:val="56"/>
@@ -3526,15 +4029,8 @@
   <ns0:style ns0:type="paragraph" ns0:styleId="a4">
     <ns0:name ns0:val="List Paragraph"/>
     <ns0:qFormat/>
-    <ns0:pPr>
-      <ns0:spacing ns0:line="360" ns0:lineRule="auto" ns0:after="60"/>
-      <ns0:ind ns0:left="476" ns0:hanging="238"/>
-    </ns0:pPr>
     <ns0:rPr>
-      <ns0:rFonts ns0:ascii="Times New Roman" ns0:hAnsi="Times New Roman" ns0:eastAsia="宋体"/>
-      <ns0:b ns0:val="0"/>
       <ns0:color ns0:val="000000"/>
-      <ns0:sz ns0:val="24"/>
     </ns0:rPr>
   </ns0:style>
   <ns0:style ns0:type="character" ns0:styleId="a5">

</xml_diff>

<commit_message>
fix(docs): exactly align deliverable formatting with references
</commit_message>
<xml_diff>
--- a/docs/deliverables/01-项目建议书.docx
+++ b/docs/deliverables/01-项目建议书.docx
@@ -4,42 +4,47 @@
   <ns0:body>
     <ns0:p>
       <ns0:pPr>
+        <ns0:jc ns0:val="right"/>
         <ns0:spacing ns0:after="80"/>
+      </ns0:pPr>
+      <ns0:r>
+        <ns0:rPr>
+          <ns0:rFonts ns0:eastAsia="宋体"/>
+          <ns0:sz ns0:val="24"/>
+          <ns0:color ns0:val="000000"/>
+        </ns0:rPr>
+        <ns0:t>文档编号：01　　版本号：V1.2</ns0:t>
+      </ns0:r>
+    </ns0:p>
+    <ns0:p>
+      <ns0:pPr>
         <ns0:jc ns0:val="right"/>
-      </ns0:pPr>
-      <ns0:r>
-        <ns0:t>文档编号：01　　版本号：V1.2</ns0:t>
-      </ns0:r>
-    </ns0:p>
-    <ns0:p>
-      <ns0:pPr>
         <ns0:spacing ns0:before="1200"/>
-        <ns0:jc ns0:val="right"/>
-      </ns0:pPr>
-      <ns0:r>
-        <ns0:rPr>
-          <ns0:rFonts ns0:ascii="Times New Roman" ns0:hAnsi="Times New Roman" ns0:eastAsia="宋体"/>
+      </ns0:pPr>
+      <ns0:r>
+        <ns0:rPr>
           <ns0:b ns0:val="0"/>
+          <ns0:rFonts ns0:eastAsia="宋体"/>
+          <ns0:sz ns0:val="24"/>
           <ns0:color ns0:val="000000"/>
-          <ns0:sz ns0:val="24"/>
         </ns0:rPr>
         <ns0:t>文档状态：符合性复核候选稿</ns0:t>
       </ns0:r>
     </ns0:p>
     <ns0:p>
       <ns0:pPr>
-        <ns0:spacing ns0:before="2000" ns0:after="360"/>
-        <ns0:jc ns0:val="center"/>
         <ns0:pBdr>
           <ns0:bottom ns0:val="single" ns0:sz="12" ns0:space="8" ns0:color="000000"/>
         </ns0:pBdr>
-      </ns0:pPr>
-      <ns0:r>
-        <ns0:rPr>
-          <ns0:rFonts ns0:ascii="Arial" ns0:hAnsi="Arial" ns0:eastAsia="黑体"/>
+        <ns0:jc ns0:val="center"/>
+        <ns0:spacing ns0:before="240" ns0:after="360"/>
+      </ns0:pPr>
+      <ns0:r>
+        <ns0:rPr>
           <ns0:b/>
+          <ns0:rFonts ns0:eastAsia="黑体"/>
+          <ns0:sz ns0:val="44"/>
           <ns0:color ns0:val="000000"/>
-          <ns0:sz ns0:val="44"/>
         </ns0:rPr>
         <ns0:t>某自然博物馆智能运营中心建设项目——应急管理子系统</ns0:t>
       </ns0:r>
@@ -47,1005 +52,708 @@
     <ns0:p>
       <ns0:pPr>
         <ns0:pStyle ns0:val="a3"/>
-      </ns0:pPr>
-      <ns0:r>
-        <ns0:rPr>
-          <ns0:rFonts ns0:ascii="Arial" ns0:hAnsi="Arial" ns0:eastAsia="黑体"/>
+        <ns0:jc ns0:val="center"/>
+        <ns0:spacing ns0:before="520" ns0:after="200"/>
+      </ns0:pPr>
+      <ns0:r>
+        <ns0:rPr>
           <ns0:b/>
+          <ns0:rFonts ns0:eastAsia="黑体"/>
+          <ns0:sz ns0:val="56"/>
           <ns0:color ns0:val="000000"/>
-          <ns0:sz ns0:val="56"/>
         </ns0:rPr>
         <ns0:t>项 目 建 议 书</ns0:t>
       </ns0:r>
     </ns0:p>
     <ns0:p>
       <ns0:pPr>
-        <ns0:spacing ns0:before="2240" ns0:after="200"/>
-      </ns0:pPr>
-      <ns0:r>
-        <ns0:rPr>
-          <ns0:rFonts ns0:ascii="Times New Roman" ns0:hAnsi="Times New Roman" ns0:eastAsia="仿宋"/>
+        <ns0:ind ns0:leftChars="1347" ns0:left="2694"/>
+        <ns0:spacing ns0:after="200"/>
+      </ns0:pPr>
+      <ns0:r>
+        <ns0:rPr>
           <ns0:b ns0:val="0"/>
+          <ns0:rFonts ns0:eastAsia="仿宋"/>
+          <ns0:sz ns0:val="32"/>
           <ns0:color ns0:val="000000"/>
+        </ns0:rPr>
+        <ns0:t>编制单位：项目编制组</ns0:t>
+      </ns0:r>
+    </ns0:p>
+    <ns0:p>
+      <ns0:pPr>
+        <ns0:ind ns0:leftChars="1347" ns0:left="2694"/>
+        <ns0:spacing ns0:after="200"/>
+      </ns0:pPr>
+      <ns0:r>
+        <ns0:rPr>
+          <ns0:b ns0:val="0"/>
+          <ns0:rFonts ns0:eastAsia="仿宋"/>
           <ns0:sz ns0:val="32"/>
-        </ns0:rPr>
-        <ns0:t>编制单位：项目编制组</ns0:t>
-      </ns0:r>
-    </ns0:p>
-    <ns0:p>
-      <ns0:pPr>
+          <ns0:color ns0:val="000000"/>
+        </ns0:rPr>
+        <ns0:t>编　　制：何思源（项目经理）</ns0:t>
+      </ns0:r>
+    </ns0:p>
+    <ns0:p>
+      <ns0:pPr>
+        <ns0:ind ns0:leftChars="1347" ns0:left="2694"/>
         <ns0:spacing ns0:after="200"/>
       </ns0:pPr>
       <ns0:r>
         <ns0:rPr>
-          <ns0:rFonts ns0:ascii="Times New Roman" ns0:hAnsi="Times New Roman" ns0:eastAsia="仿宋"/>
           <ns0:b ns0:val="0"/>
+          <ns0:rFonts ns0:eastAsia="仿宋"/>
+          <ns0:sz ns0:val="32"/>
           <ns0:color ns0:val="000000"/>
+        </ns0:rPr>
+        <ns0:t>复　　核：任俊强（符合性复核）</ns0:t>
+      </ns0:r>
+    </ns0:p>
+    <ns0:p>
+      <ns0:pPr>
+        <ns0:jc ns0:val="right"/>
+        <ns0:spacing ns0:before="1200"/>
+      </ns0:pPr>
+      <ns0:r>
+        <ns0:rPr>
+          <ns0:rFonts ns0:eastAsia="宋体"/>
+          <ns0:sz ns0:val="24"/>
+          <ns0:color ns0:val="000000"/>
+        </ns0:rPr>
+        <ns0:t>文档版本：V1.2</ns0:t>
+      </ns0:r>
+    </ns0:p>
+    <ns0:p>
+      <ns0:pPr>
+        <ns0:ind ns0:leftChars="1347" ns0:left="2694"/>
+        <ns0:spacing ns0:before="200" ns0:after="80"/>
+      </ns0:pPr>
+      <ns0:r>
+        <ns0:rPr>
+          <ns0:b ns0:val="0"/>
+          <ns0:rFonts ns0:eastAsia="仿宋"/>
           <ns0:sz ns0:val="32"/>
-        </ns0:rPr>
-        <ns0:t>编　　制：何思源（项目经理）</ns0:t>
-      </ns0:r>
-    </ns0:p>
-    <ns0:p>
-      <ns0:pPr>
-        <ns0:spacing ns0:after="200"/>
-      </ns0:pPr>
-      <ns0:r>
-        <ns0:rPr>
-          <ns0:rFonts ns0:ascii="Times New Roman" ns0:hAnsi="Times New Roman" ns0:eastAsia="仿宋"/>
-          <ns0:b ns0:val="0"/>
           <ns0:color ns0:val="000000"/>
-          <ns0:sz ns0:val="32"/>
-        </ns0:rPr>
-        <ns0:t>复　　核：任俊强（符合性复核）</ns0:t>
-      </ns0:r>
-    </ns0:p>
-    <ns0:p>
-      <ns0:pPr>
-        <ns0:spacing ns0:after="200"/>
-      </ns0:pPr>
-      <ns0:r>
-        <ns0:t>文档版本：V1.2</ns0:t>
-      </ns0:r>
-    </ns0:p>
-    <ns0:p>
-      <ns0:pPr>
-        <ns0:spacing ns0:after="200"/>
-      </ns0:pPr>
-      <ns0:r>
-        <ns0:rPr>
-          <ns0:rFonts ns0:ascii="Times New Roman" ns0:hAnsi="Times New Roman" ns0:eastAsia="仿宋"/>
-          <ns0:b ns0:val="0"/>
+        </ns0:rPr>
+        <ns0:t>编制日期：2026 年 9 月 10 日</ns0:t>
+      </ns0:r>
+    </ns0:p>
+    <ns0:p>
+      <ns0:r>
+        <ns0:br ns0:type="page"/>
+      </ns0:r>
+    </ns0:p>
+    <ns0:p>
+      <ns0:pPr>
+        <ns0:jc ns0:val="center"/>
+        <ns0:spacing ns0:before="120" ns0:after="120"/>
+      </ns0:pPr>
+      <ns0:r>
+        <ns0:rPr>
+          <ns0:b/>
+          <ns0:rFonts ns0:eastAsia="黑体"/>
+          <ns0:sz ns0:val="24"/>
           <ns0:color ns0:val="000000"/>
-          <ns0:sz ns0:val="32"/>
-        </ns0:rPr>
-        <ns0:t>编制日期：2026 年 9 月 10 日</ns0:t>
-      </ns0:r>
-    </ns0:p>
-    <ns0:p>
-      <ns0:r>
-        <ns0:br ns0:type="page"/>
-      </ns0:r>
-    </ns0:p>
-    <ns0:p>
-      <ns0:pPr>
-        <ns0:spacing ns0:before="120" ns0:after="120"/>
+        </ns0:rPr>
+        <ns0:t>修订记录</ns0:t>
+      </ns0:r>
+    </ns0:p>
+    <ns0:tbl>
+      <ns0:tr>
+        <ns0:tc>
+          <ns0:tcPr>
+            <ns0:tcW ns0:w="1020" ns0:type="dxa"/>
+            <ns0:shd ns0:val="clear" ns0:color="auto" ns0:fill="D9E2EC"/>
+          </ns0:tcPr>
+          <ns0:p>
+            <ns0:pPr>
+              <ns0:jc ns0:val="center"/>
+            </ns0:pPr>
+            <ns0:r>
+              <ns0:rPr>
+                <ns0:b/>
+                <ns0:rFonts ns0:eastAsia="黑体"/>
+                <ns0:sz ns0:val="21"/>
+                <ns0:color ns0:val="000000"/>
+              </ns0:rPr>
+              <ns0:t>版本</ns0:t>
+            </ns0:r>
+          </ns0:p>
+        </ns0:tc>
+        <ns0:tc>
+          <ns0:tcPr>
+            <ns0:tcW ns0:w="1474" ns0:type="dxa"/>
+            <ns0:shd ns0:val="clear" ns0:color="auto" ns0:fill="D9E2EC"/>
+          </ns0:tcPr>
+          <ns0:p>
+            <ns0:pPr>
+              <ns0:jc ns0:val="center"/>
+            </ns0:pPr>
+            <ns0:r>
+              <ns0:rPr>
+                <ns0:b/>
+                <ns0:rFonts ns0:eastAsia="黑体"/>
+                <ns0:sz ns0:val="21"/>
+                <ns0:color ns0:val="000000"/>
+              </ns0:rPr>
+              <ns0:t>日期</ns0:t>
+            </ns0:r>
+          </ns0:p>
+        </ns0:tc>
+        <ns0:tc>
+          <ns0:tcPr>
+            <ns0:tcW ns0:w="1814" ns0:type="dxa"/>
+            <ns0:shd ns0:val="clear" ns0:color="auto" ns0:fill="D9E2EC"/>
+          </ns0:tcPr>
+          <ns0:p>
+            <ns0:pPr>
+              <ns0:jc ns0:val="center"/>
+            </ns0:pPr>
+            <ns0:r>
+              <ns0:rPr>
+                <ns0:b/>
+                <ns0:rFonts ns0:eastAsia="黑体"/>
+                <ns0:sz ns0:val="21"/>
+                <ns0:color ns0:val="000000"/>
+              </ns0:rPr>
+              <ns0:t>修订章节</ns0:t>
+            </ns0:r>
+          </ns0:p>
+        </ns0:tc>
+        <ns0:tc>
+          <ns0:tcPr>
+            <ns0:tcW ns0:w="3628" ns0:type="dxa"/>
+            <ns0:shd ns0:val="clear" ns0:color="auto" ns0:fill="D9E2EC"/>
+          </ns0:tcPr>
+          <ns0:p>
+            <ns0:pPr>
+              <ns0:jc ns0:val="center"/>
+            </ns0:pPr>
+            <ns0:r>
+              <ns0:rPr>
+                <ns0:b/>
+                <ns0:rFonts ns0:eastAsia="黑体"/>
+                <ns0:sz ns0:val="21"/>
+                <ns0:color ns0:val="000000"/>
+              </ns0:rPr>
+              <ns0:t>修订说明</ns0:t>
+            </ns0:r>
+          </ns0:p>
+        </ns0:tc>
+        <ns0:tc>
+          <ns0:tcPr>
+            <ns0:tcW ns0:w="1587" ns0:type="dxa"/>
+            <ns0:shd ns0:val="clear" ns0:color="auto" ns0:fill="D9E2EC"/>
+          </ns0:tcPr>
+          <ns0:p>
+            <ns0:pPr>
+              <ns0:jc ns0:val="center"/>
+            </ns0:pPr>
+            <ns0:r>
+              <ns0:rPr>
+                <ns0:b/>
+                <ns0:rFonts ns0:eastAsia="黑体"/>
+                <ns0:sz ns0:val="21"/>
+                <ns0:color ns0:val="000000"/>
+              </ns0:rPr>
+              <ns0:t>编制/修订人</ns0:t>
+            </ns0:r>
+          </ns0:p>
+        </ns0:tc>
+        <ns0:trPr>
+          <ns0:jc ns0:val="center"/>
+        </ns0:trPr>
+      </ns0:tr>
+      <ns0:tr>
+        <ns0:tc>
+          <ns0:tcPr>
+            <ns0:tcW ns0:w="1020" ns0:type="dxa"/>
+          </ns0:tcPr>
+          <ns0:p>
+            <ns0:pPr>
+              <ns0:jc ns0:val="center"/>
+            </ns0:pPr>
+            <ns0:r>
+              <ns0:rPr>
+                <ns0:b ns0:val="0"/>
+                <ns0:rFonts ns0:eastAsia="宋体"/>
+                <ns0:sz ns0:val="21"/>
+                <ns0:color ns0:val="000000"/>
+              </ns0:rPr>
+              <ns0:t>V0.1</ns0:t>
+            </ns0:r>
+          </ns0:p>
+        </ns0:tc>
+        <ns0:tc>
+          <ns0:tcPr>
+            <ns0:tcW ns0:w="1474" ns0:type="dxa"/>
+          </ns0:tcPr>
+          <ns0:p>
+            <ns0:pPr>
+              <ns0:jc ns0:val="center"/>
+            </ns0:pPr>
+            <ns0:r>
+              <ns0:rPr>
+                <ns0:b ns0:val="0"/>
+                <ns0:rFonts ns0:eastAsia="宋体"/>
+                <ns0:sz ns0:val="21"/>
+                <ns0:color ns0:val="000000"/>
+              </ns0:rPr>
+              <ns0:t>2026-09-10</ns0:t>
+            </ns0:r>
+          </ns0:p>
+        </ns0:tc>
+        <ns0:tc>
+          <ns0:tcPr>
+            <ns0:tcW ns0:w="1814" ns0:type="dxa"/>
+          </ns0:tcPr>
+          <ns0:p>
+            <ns0:pPr/>
+            <ns0:r>
+              <ns0:rPr>
+                <ns0:b ns0:val="0"/>
+                <ns0:rFonts ns0:eastAsia="宋体"/>
+                <ns0:sz ns0:val="21"/>
+                <ns0:color ns0:val="000000"/>
+              </ns0:rPr>
+              <ns0:t>全部</ns0:t>
+            </ns0:r>
+          </ns0:p>
+        </ns0:tc>
+        <ns0:tc>
+          <ns0:tcPr>
+            <ns0:tcW ns0:w="3628" ns0:type="dxa"/>
+          </ns0:tcPr>
+          <ns0:p>
+            <ns0:pPr/>
+            <ns0:r>
+              <ns0:rPr>
+                <ns0:b ns0:val="0"/>
+                <ns0:rFonts ns0:eastAsia="宋体"/>
+                <ns0:sz ns0:val="21"/>
+                <ns0:color ns0:val="000000"/>
+              </ns0:rPr>
+              <ns0:t>基于冻结编标输入形成项目建议书工作稿。</ns0:t>
+            </ns0:r>
+          </ns0:p>
+        </ns0:tc>
+        <ns0:tc>
+          <ns0:tcPr>
+            <ns0:tcW ns0:w="1587" ns0:type="dxa"/>
+          </ns0:tcPr>
+          <ns0:p>
+            <ns0:pPr>
+              <ns0:jc ns0:val="center"/>
+            </ns0:pPr>
+            <ns0:r>
+              <ns0:rPr>
+                <ns0:b ns0:val="0"/>
+                <ns0:rFonts ns0:eastAsia="宋体"/>
+                <ns0:sz ns0:val="21"/>
+                <ns0:color ns0:val="000000"/>
+              </ns0:rPr>
+              <ns0:t>何思源</ns0:t>
+            </ns0:r>
+          </ns0:p>
+        </ns0:tc>
+        <ns0:trPr>
+          <ns0:jc ns0:val="center"/>
+        </ns0:trPr>
+      </ns0:tr>
+      <ns0:tr>
+        <ns0:tc>
+          <ns0:tcPr>
+            <ns0:tcW ns0:w="1020" ns0:type="dxa"/>
+          </ns0:tcPr>
+          <ns0:p>
+            <ns0:pPr>
+              <ns0:jc ns0:val="center"/>
+            </ns0:pPr>
+            <ns0:r>
+              <ns0:rPr>
+                <ns0:b ns0:val="0"/>
+                <ns0:rFonts ns0:eastAsia="宋体"/>
+                <ns0:sz ns0:val="21"/>
+                <ns0:color ns0:val="000000"/>
+              </ns0:rPr>
+              <ns0:t>V0.2</ns0:t>
+            </ns0:r>
+          </ns0:p>
+        </ns0:tc>
+        <ns0:tc>
+          <ns0:tcPr>
+            <ns0:tcW ns0:w="1474" ns0:type="dxa"/>
+          </ns0:tcPr>
+          <ns0:p>
+            <ns0:pPr>
+              <ns0:jc ns0:val="center"/>
+            </ns0:pPr>
+            <ns0:r>
+              <ns0:rPr>
+                <ns0:b ns0:val="0"/>
+                <ns0:rFonts ns0:eastAsia="宋体"/>
+                <ns0:sz ns0:val="21"/>
+                <ns0:color ns0:val="000000"/>
+              </ns0:rPr>
+              <ns0:t>2026-09-10</ns0:t>
+            </ns0:r>
+          </ns0:p>
+        </ns0:tc>
+        <ns0:tc>
+          <ns0:tcPr>
+            <ns0:tcW ns0:w="1814" ns0:type="dxa"/>
+          </ns0:tcPr>
+          <ns0:p>
+            <ns0:pPr/>
+            <ns0:r>
+              <ns0:rPr>
+                <ns0:rFonts ns0:ascii="宋体" ns0:hAnsi="宋体" ns0:eastAsia="宋体"/>
+                <ns0:b ns0:val="0"/>
+                <ns0:color ns0:val="000000"/>
+                <ns0:sz ns0:val="18"/>
+              </ns0:rPr>
+              <ns0:t>状态、3.1、3.3、7</ns0:t>
+            </ns0:r>
+          </ns0:p>
+        </ns0:tc>
+        <ns0:tc>
+          <ns0:tcPr>
+            <ns0:tcW ns0:w="3628" ns0:type="dxa"/>
+          </ns0:tcPr>
+          <ns0:p>
+            <ns0:pPr/>
+            <ns0:r>
+              <ns0:rPr>
+                <ns0:rFonts ns0:ascii="宋体" ns0:hAnsi="宋体" ns0:eastAsia="宋体"/>
+                <ns0:b ns0:val="0"/>
+                <ns0:color ns0:val="000000"/>
+                <ns0:sz ns0:val="18"/>
+              </ns0:rPr>
+              <ns0:t>明确课程模拟澄清边界，采用总体技术方案 V0.6 稳定结论，并按教学样例重新排版。</ns0:t>
+            </ns0:r>
+          </ns0:p>
+        </ns0:tc>
+        <ns0:tc>
+          <ns0:tcPr>
+            <ns0:tcW ns0:w="1587" ns0:type="dxa"/>
+          </ns0:tcPr>
+          <ns0:p>
+            <ns0:pPr>
+              <ns0:jc ns0:val="center"/>
+            </ns0:pPr>
+            <ns0:r>
+              <ns0:rPr>
+                <ns0:b ns0:val="0"/>
+                <ns0:rFonts ns0:eastAsia="宋体"/>
+                <ns0:sz ns0:val="21"/>
+                <ns0:color ns0:val="000000"/>
+              </ns0:rPr>
+              <ns0:t>何思源</ns0:t>
+            </ns0:r>
+          </ns0:p>
+        </ns0:tc>
+        <ns0:trPr>
+          <ns0:jc ns0:val="center"/>
+        </ns0:trPr>
+      </ns0:tr>
+      <ns0:tr>
+        <ns0:tc>
+          <ns0:tcPr>
+            <ns0:tcW ns0:w="1805" ns0:type="dxa"/>
+          </ns0:tcPr>
+          <ns0:p>
+            <ns0:pPr>
+              <ns0:jc ns0:val="center"/>
+            </ns0:pPr>
+            <ns0:r>
+              <ns0:rPr>
+                <ns0:rFonts ns0:ascii="宋体" ns0:hAnsi="宋体" ns0:eastAsia="宋体"/>
+                <ns0:b ns0:val="0"/>
+                <ns0:sz ns0:val="18"/>
+              </ns0:rPr>
+              <ns0:t>V1.0</ns0:t>
+            </ns0:r>
+          </ns0:p>
+        </ns0:tc>
+        <ns0:tc>
+          <ns0:tcPr>
+            <ns0:tcW ns0:w="1805" ns0:type="dxa"/>
+          </ns0:tcPr>
+          <ns0:p>
+            <ns0:pPr>
+              <ns0:jc ns0:val="center"/>
+            </ns0:pPr>
+            <ns0:r>
+              <ns0:rPr>
+                <ns0:rFonts ns0:ascii="宋体" ns0:hAnsi="宋体" ns0:eastAsia="宋体"/>
+                <ns0:b ns0:val="0"/>
+                <ns0:sz ns0:val="18"/>
+              </ns0:rPr>
+              <ns0:t>2026-09-12</ns0:t>
+            </ns0:r>
+          </ns0:p>
+        </ns0:tc>
+        <ns0:tc>
+          <ns0:tcPr>
+            <ns0:tcW ns0:w="1805" ns0:type="dxa"/>
+          </ns0:tcPr>
+          <ns0:p>
+            <ns0:pPr/>
+            <ns0:r>
+              <ns0:rPr>
+                <ns0:rFonts ns0:ascii="宋体" ns0:hAnsi="宋体" ns0:eastAsia="宋体"/>
+                <ns0:b ns0:val="0"/>
+                <ns0:sz ns0:val="18"/>
+              </ns0:rPr>
+              <ns0:t>全文</ns0:t>
+            </ns0:r>
+          </ns0:p>
+        </ns0:tc>
+        <ns0:tc>
+          <ns0:tcPr>
+            <ns0:tcW ns0:w="1805" ns0:type="dxa"/>
+          </ns0:tcPr>
+          <ns0:p>
+            <ns0:pPr/>
+            <ns0:r>
+              <ns0:rPr>
+                <ns0:rFonts ns0:ascii="宋体" ns0:hAnsi="宋体" ns0:eastAsia="宋体"/>
+                <ns0:b ns0:val="0"/>
+                <ns0:sz ns0:val="18"/>
+              </ns0:rPr>
+              <ns0:t>完成技术与符合性复核并纳入第一关冻结成果。</ns0:t>
+            </ns0:r>
+          </ns0:p>
+        </ns0:tc>
+        <ns0:tc>
+          <ns0:tcPr>
+            <ns0:tcW ns0:w="1805" ns0:type="dxa"/>
+          </ns0:tcPr>
+          <ns0:p>
+            <ns0:pPr>
+              <ns0:jc ns0:val="center"/>
+            </ns0:pPr>
+            <ns0:r>
+              <ns0:rPr>
+                <ns0:rFonts ns0:ascii="宋体" ns0:hAnsi="宋体" ns0:eastAsia="宋体"/>
+                <ns0:b ns0:val="0"/>
+                <ns0:sz ns0:val="18"/>
+              </ns0:rPr>
+              <ns0:t>何思源</ns0:t>
+            </ns0:r>
+          </ns0:p>
+        </ns0:tc>
+        <ns0:trPr>
+          <ns0:jc ns0:val="center"/>
+        </ns0:trPr>
+      </ns0:tr>
+      <ns0:tr>
+        <ns0:tc>
+          <ns0:tcPr>
+            <ns0:tcW ns0:w="1805" ns0:type="dxa"/>
+          </ns0:tcPr>
+          <ns0:p>
+            <ns0:pPr>
+              <ns0:jc ns0:val="center"/>
+            </ns0:pPr>
+            <ns0:r>
+              <ns0:rPr>
+                <ns0:rFonts ns0:ascii="宋体" ns0:hAnsi="宋体" ns0:eastAsia="宋体"/>
+                <ns0:b ns0:val="0"/>
+                <ns0:sz ns0:val="18"/>
+              </ns0:rPr>
+              <ns0:t>V1.1</ns0:t>
+            </ns0:r>
+          </ns0:p>
+        </ns0:tc>
+        <ns0:tc>
+          <ns0:tcPr>
+            <ns0:tcW ns0:w="1805" ns0:type="dxa"/>
+          </ns0:tcPr>
+          <ns0:p>
+            <ns0:pPr>
+              <ns0:jc ns0:val="center"/>
+            </ns0:pPr>
+            <ns0:r>
+              <ns0:rPr>
+                <ns0:rFonts ns0:ascii="宋体" ns0:hAnsi="宋体" ns0:eastAsia="宋体"/>
+                <ns0:b ns0:val="0"/>
+                <ns0:sz ns0:val="18"/>
+              </ns0:rPr>
+              <ns0:t>2026-09-13</ns0:t>
+            </ns0:r>
+          </ns0:p>
+        </ns0:tc>
+        <ns0:tc>
+          <ns0:tcPr>
+            <ns0:tcW ns0:w="1805" ns0:type="dxa"/>
+          </ns0:tcPr>
+          <ns0:p>
+            <ns0:pPr/>
+            <ns0:r>
+              <ns0:rPr>
+                <ns0:rFonts ns0:ascii="宋体" ns0:hAnsi="宋体" ns0:eastAsia="宋体"/>
+                <ns0:b ns0:val="0"/>
+                <ns0:sz ns0:val="18"/>
+              </ns0:rPr>
+              <ns0:t>封面及署名</ns0:t>
+            </ns0:r>
+          </ns0:p>
+        </ns0:tc>
+        <ns0:tc>
+          <ns0:tcPr>
+            <ns0:tcW ns0:w="1805" ns0:type="dxa"/>
+          </ns0:tcPr>
+          <ns0:p>
+            <ns0:pPr/>
+            <ns0:r>
+              <ns0:rPr>
+                <ns0:rFonts ns0:ascii="宋体" ns0:hAnsi="宋体" ns0:eastAsia="宋体"/>
+                <ns0:b ns0:val="0"/>
+                <ns0:sz ns0:val="18"/>
+              </ns0:rPr>
+              <ns0:t>完成正式交付物实名化和首轮格式规范化。</ns0:t>
+            </ns0:r>
+          </ns0:p>
+        </ns0:tc>
+        <ns0:tc>
+          <ns0:tcPr>
+            <ns0:tcW ns0:w="1805" ns0:type="dxa"/>
+          </ns0:tcPr>
+          <ns0:p>
+            <ns0:pPr>
+              <ns0:jc ns0:val="center"/>
+            </ns0:pPr>
+            <ns0:r>
+              <ns0:rPr>
+                <ns0:rFonts ns0:ascii="宋体" ns0:hAnsi="宋体" ns0:eastAsia="宋体"/>
+                <ns0:b ns0:val="0"/>
+                <ns0:sz ns0:val="18"/>
+              </ns0:rPr>
+              <ns0:t>何思源</ns0:t>
+            </ns0:r>
+          </ns0:p>
+        </ns0:tc>
+        <ns0:trPr>
+          <ns0:jc ns0:val="center"/>
+        </ns0:trPr>
+      </ns0:tr>
+      <ns0:tr>
+        <ns0:tc>
+          <ns0:tcPr>
+            <ns0:tcW ns0:w="1805" ns0:type="dxa"/>
+          </ns0:tcPr>
+          <ns0:p>
+            <ns0:pPr>
+              <ns0:jc ns0:val="center"/>
+            </ns0:pPr>
+            <ns0:r>
+              <ns0:rPr>
+                <ns0:rFonts ns0:ascii="宋体" ns0:hAnsi="宋体" ns0:eastAsia="宋体"/>
+                <ns0:b ns0:val="0"/>
+                <ns0:sz ns0:val="18"/>
+              </ns0:rPr>
+              <ns0:t>V1.2</ns0:t>
+            </ns0:r>
+          </ns0:p>
+        </ns0:tc>
+        <ns0:tc>
+          <ns0:tcPr>
+            <ns0:tcW ns0:w="1805" ns0:type="dxa"/>
+          </ns0:tcPr>
+          <ns0:p>
+            <ns0:pPr>
+              <ns0:jc ns0:val="center"/>
+            </ns0:pPr>
+            <ns0:r>
+              <ns0:rPr>
+                <ns0:rFonts ns0:ascii="宋体" ns0:hAnsi="宋体" ns0:eastAsia="宋体"/>
+                <ns0:b ns0:val="0"/>
+                <ns0:sz ns0:val="18"/>
+              </ns0:rPr>
+              <ns0:t>2026-09-13</ns0:t>
+            </ns0:r>
+          </ns0:p>
+        </ns0:tc>
+        <ns0:tc>
+          <ns0:tcPr>
+            <ns0:tcW ns0:w="1805" ns0:type="dxa"/>
+          </ns0:tcPr>
+          <ns0:p>
+            <ns0:pPr/>
+            <ns0:r>
+              <ns0:rPr>
+                <ns0:rFonts ns0:ascii="宋体" ns0:hAnsi="宋体" ns0:eastAsia="宋体"/>
+                <ns0:b ns0:val="0"/>
+                <ns0:sz ns0:val="18"/>
+              </ns0:rPr>
+              <ns0:t>版式、图 2-1、图 3-1</ns0:t>
+            </ns0:r>
+          </ns0:p>
+        </ns0:tc>
+        <ns0:tc>
+          <ns0:tcPr>
+            <ns0:tcW ns0:w="1805" ns0:type="dxa"/>
+          </ns0:tcPr>
+          <ns0:p>
+            <ns0:pPr/>
+            <ns0:r>
+              <ns0:rPr>
+                <ns0:rFonts ns0:ascii="宋体" ns0:hAnsi="宋体" ns0:eastAsia="宋体"/>
+                <ns0:b ns0:val="0"/>
+                <ns0:sz ns0:val="18"/>
+              </ns0:rPr>
+              <ns0:t>按教学样例复核版式并补充业务流程与建设内容分层图。</ns0:t>
+            </ns0:r>
+          </ns0:p>
+        </ns0:tc>
+        <ns0:tc>
+          <ns0:tcPr>
+            <ns0:tcW ns0:w="1805" ns0:type="dxa"/>
+          </ns0:tcPr>
+          <ns0:p>
+            <ns0:pPr>
+              <ns0:jc ns0:val="center"/>
+            </ns0:pPr>
+            <ns0:r>
+              <ns0:rPr>
+                <ns0:rFonts ns0:ascii="宋体" ns0:hAnsi="宋体" ns0:eastAsia="宋体"/>
+                <ns0:b ns0:val="0"/>
+                <ns0:sz ns0:val="18"/>
+              </ns0:rPr>
+              <ns0:t>何思源</ns0:t>
+            </ns0:r>
+          </ns0:p>
+        </ns0:tc>
+        <ns0:trPr>
+          <ns0:jc ns0:val="center"/>
+        </ns0:trPr>
+      </ns0:tr>
+      <ns0:tblPr>
+        <ns0:tblW ns0:w="0" ns0:type="auto"/>
         <ns0:jc ns0:val="center"/>
-      </ns0:pPr>
-      <ns0:r>
-        <ns0:rPr>
-          <ns0:rFonts ns0:ascii="Arial" ns0:hAnsi="Arial" ns0:eastAsia="黑体"/>
-          <ns0:b/>
-          <ns0:color ns0:val="000000"/>
-          <ns0:sz ns0:val="24"/>
-        </ns0:rPr>
-        <ns0:t>修订记录</ns0:t>
-      </ns0:r>
-    </ns0:p>
-    <ns0:tbl>
-      <ns0:tblPr>
-        <ns0:tblW ns0:type="auto" ns0:w="0"/>
-        <ns0:jc ns0:val="center"/>
-        <ns0:tblLayout ns0:type="fixed"/>
-        <ns0:tblLook ns0:firstColumn="1" ns0:firstRow="1" ns0:lastColumn="0" ns0:lastRow="0" ns0:noHBand="0" ns0:noVBand="1" ns0:val="04A0"/>
         <ns0:tblBorders>
-          <ns0:top ns0:val="single" ns0:sz="4" ns0:space="0" ns0:color="7F7F7F"/>
-          <ns0:left ns0:val="single" ns0:sz="4" ns0:space="0" ns0:color="7F7F7F"/>
-          <ns0:bottom ns0:val="single" ns0:sz="4" ns0:space="0" ns0:color="7F7F7F"/>
-          <ns0:right ns0:val="single" ns0:sz="4" ns0:space="0" ns0:color="7F7F7F"/>
-          <ns0:insideH ns0:val="single" ns0:sz="4" ns0:space="0" ns0:color="7F7F7F"/>
-          <ns0:insideV ns0:val="single" ns0:sz="4" ns0:space="0" ns0:color="7F7F7F"/>
+          <ns0:top ns0:val="single" ns0:sz="4" ns0:space="0" ns0:color="808080"/>
+          <ns0:left ns0:val="single" ns0:sz="4" ns0:space="0" ns0:color="808080"/>
+          <ns0:bottom ns0:val="single" ns0:sz="4" ns0:space="0" ns0:color="808080"/>
+          <ns0:right ns0:val="single" ns0:sz="4" ns0:space="0" ns0:color="808080"/>
+          <ns0:insideH ns0:val="single" ns0:sz="4" ns0:space="0" ns0:color="808080"/>
+          <ns0:insideV ns0:val="single" ns0:sz="4" ns0:space="0" ns0:color="808080"/>
         </ns0:tblBorders>
-        <ns0:tblBorders>
-          <ns0:top ns0:val="single" ns0:sz="6" ns0:space="0" ns0:color="7F8C8D"/>
-          <ns0:left ns0:val="single" ns0:sz="6" ns0:space="0" ns0:color="7F8C8D"/>
-          <ns0:bottom ns0:val="single" ns0:sz="6" ns0:space="0" ns0:color="7F8C8D"/>
-          <ns0:right ns0:val="single" ns0:sz="6" ns0:space="0" ns0:color="7F8C8D"/>
-          <ns0:insideH ns0:val="single" ns0:sz="6" ns0:space="0" ns0:color="7F8C8D"/>
-          <ns0:insideV ns0:val="single" ns0:sz="6" ns0:space="0" ns0:color="7F8C8D"/>
-        </ns0:tblBorders>
-        <ns0:tblBorders>
-          <ns0:top ns0:val="single" ns0:sz="6" ns0:space="0" ns0:color="7F8C8D"/>
-          <ns0:left ns0:val="single" ns0:sz="6" ns0:space="0" ns0:color="7F8C8D"/>
-          <ns0:bottom ns0:val="single" ns0:sz="6" ns0:space="0" ns0:color="7F8C8D"/>
-          <ns0:right ns0:val="single" ns0:sz="6" ns0:space="0" ns0:color="7F8C8D"/>
-          <ns0:insideH ns0:val="single" ns0:sz="6" ns0:space="0" ns0:color="7F8C8D"/>
-          <ns0:insideV ns0:val="single" ns0:sz="6" ns0:space="0" ns0:color="7F8C8D"/>
-        </ns0:tblBorders>
-        <ns0:tblBorders>
-          <ns0:top ns0:val="single" ns0:sz="6" ns0:space="0" ns0:color="7F8C8D"/>
-          <ns0:left ns0:val="single" ns0:sz="6" ns0:space="0" ns0:color="7F8C8D"/>
-          <ns0:bottom ns0:val="single" ns0:sz="6" ns0:space="0" ns0:color="7F8C8D"/>
-          <ns0:right ns0:val="single" ns0:sz="6" ns0:space="0" ns0:color="7F8C8D"/>
-          <ns0:insideH ns0:val="single" ns0:sz="6" ns0:space="0" ns0:color="7F8C8D"/>
-          <ns0:insideV ns0:val="single" ns0:sz="6" ns0:space="0" ns0:color="7F8C8D"/>
-        </ns0:tblBorders>
-        <ns0:tblBorders>
-          <ns0:top ns0:val="single" ns0:sz="6" ns0:space="0" ns0:color="7F8C8D"/>
-          <ns0:left ns0:val="single" ns0:sz="6" ns0:space="0" ns0:color="7F8C8D"/>
-          <ns0:bottom ns0:val="single" ns0:sz="6" ns0:space="0" ns0:color="7F8C8D"/>
-          <ns0:right ns0:val="single" ns0:sz="6" ns0:space="0" ns0:color="7F8C8D"/>
-          <ns0:insideH ns0:val="single" ns0:sz="6" ns0:space="0" ns0:color="7F8C8D"/>
-          <ns0:insideV ns0:val="single" ns0:sz="6" ns0:space="0" ns0:color="7F8C8D"/>
-        </ns0:tblBorders>
+        <ns0:tblCellMar>
+          <ns0:left ns0:w="10" ns0:type="dxa"/>
+          <ns0:right ns0:w="10" ns0:type="dxa"/>
+        </ns0:tblCellMar>
+        <ns0:tblLook ns0:val="04A0" ns0:firstRow="1" ns0:lastRow="0" ns0:firstColumn="1" ns0:lastColumn="0" ns0:noHBand="0" ns0:noVBand="1"/>
       </ns0:tblPr>
       <ns0:tblGrid>
-        <ns0:gridCol ns0:w="1805"/>
-        <ns0:gridCol ns0:w="1805"/>
-        <ns0:gridCol ns0:w="1805"/>
-        <ns0:gridCol ns0:w="1805"/>
-        <ns0:gridCol ns0:w="1805"/>
+        <ns0:gridCol ns0:w="1513"/>
+        <ns0:gridCol ns0:w="1530"/>
+        <ns0:gridCol ns0:w="1497"/>
+        <ns0:gridCol ns0:w="3005"/>
+        <ns0:gridCol ns0:w="1471"/>
       </ns0:tblGrid>
-      <ns0:tr>
-        <ns0:trPr>
-          <ns0:trHeight ns0:hRule="atLeast" ns0:val="442"/>
-          <ns0:tblHeader ns0:val="true"/>
-          <ns0:tblHeader ns0:val="true"/>
-          <ns0:tblHeader ns0:val="true"/>
-          <ns0:tblHeader ns0:val="true"/>
-          <ns0:tblHeader ns0:val="true"/>
-        </ns0:trPr>
-        <ns0:tc>
-          <ns0:tcPr>
-            <ns0:tcW ns0:type="dxa" ns0:w="964"/>
-            <ns0:vAlign ns0:val="center"/>
-            <ns0:tcMar>
-              <ns0:top ns0:w="80" ns0:type="dxa"/>
-              <ns0:start ns0:w="80" ns0:type="dxa"/>
-              <ns0:bottom ns0:w="80" ns0:type="dxa"/>
-              <ns0:end ns0:w="80" ns0:type="dxa"/>
-            </ns0:tcMar>
-            <ns0:shd ns0:fill="D9E5F3"/>
-          </ns0:tcPr>
-          <ns0:p>
-            <ns0:pPr>
-              <ns0:spacing ns0:before="0" ns0:after="0" ns0:line="240" ns0:lineRule="auto"/>
-              <ns0:ind ns0:firstLine="0" ns0:left="0" ns0:right="0"/>
-              <ns0:jc ns0:val="center"/>
-            </ns0:pPr>
-            <ns0:r>
-              <ns0:rPr>
-                <ns0:rFonts ns0:ascii="宋体" ns0:hAnsi="宋体" ns0:eastAsia="宋体"/>
-                <ns0:b/>
-                <ns0:color ns0:val="000000"/>
-                <ns0:sz ns0:val="18"/>
-              </ns0:rPr>
-              <ns0:t>版本</ns0:t>
-            </ns0:r>
-          </ns0:p>
-        </ns0:tc>
-        <ns0:tc>
-          <ns0:tcPr>
-            <ns0:tcW ns0:type="dxa" ns0:w="1247"/>
-            <ns0:vAlign ns0:val="center"/>
-            <ns0:tcMar>
-              <ns0:top ns0:w="80" ns0:type="dxa"/>
-              <ns0:start ns0:w="80" ns0:type="dxa"/>
-              <ns0:bottom ns0:w="80" ns0:type="dxa"/>
-              <ns0:end ns0:w="80" ns0:type="dxa"/>
-            </ns0:tcMar>
-            <ns0:shd ns0:fill="D9E5F3"/>
-          </ns0:tcPr>
-          <ns0:p>
-            <ns0:pPr>
-              <ns0:spacing ns0:before="0" ns0:after="0" ns0:line="240" ns0:lineRule="auto"/>
-              <ns0:ind ns0:firstLine="0" ns0:left="0" ns0:right="0"/>
-              <ns0:jc ns0:val="center"/>
-            </ns0:pPr>
-            <ns0:r>
-              <ns0:rPr>
-                <ns0:rFonts ns0:ascii="宋体" ns0:hAnsi="宋体" ns0:eastAsia="宋体"/>
-                <ns0:b/>
-                <ns0:color ns0:val="000000"/>
-                <ns0:sz ns0:val="18"/>
-              </ns0:rPr>
-              <ns0:t>日期</ns0:t>
-            </ns0:r>
-          </ns0:p>
-        </ns0:tc>
-        <ns0:tc>
-          <ns0:tcPr>
-            <ns0:tcW ns0:type="dxa" ns0:w="1417"/>
-            <ns0:vAlign ns0:val="center"/>
-            <ns0:tcMar>
-              <ns0:top ns0:w="80" ns0:type="dxa"/>
-              <ns0:start ns0:w="80" ns0:type="dxa"/>
-              <ns0:bottom ns0:w="80" ns0:type="dxa"/>
-              <ns0:end ns0:w="80" ns0:type="dxa"/>
-            </ns0:tcMar>
-            <ns0:shd ns0:fill="D9E5F3"/>
-          </ns0:tcPr>
-          <ns0:p>
-            <ns0:pPr>
-              <ns0:spacing ns0:before="0" ns0:after="0" ns0:line="240" ns0:lineRule="auto"/>
-              <ns0:ind ns0:firstLine="0" ns0:left="0" ns0:right="0"/>
-              <ns0:jc ns0:val="center"/>
-            </ns0:pPr>
-            <ns0:r>
-              <ns0:rPr>
-                <ns0:rFonts ns0:ascii="宋体" ns0:hAnsi="宋体" ns0:eastAsia="宋体"/>
-                <ns0:b/>
-                <ns0:color ns0:val="000000"/>
-                <ns0:sz ns0:val="18"/>
-              </ns0:rPr>
-              <ns0:t>修订章节</ns0:t>
-            </ns0:r>
-          </ns0:p>
-        </ns0:tc>
-        <ns0:tc>
-          <ns0:tcPr>
-            <ns0:tcW ns0:type="dxa" ns0:w="4535"/>
-            <ns0:vAlign ns0:val="center"/>
-            <ns0:tcMar>
-              <ns0:top ns0:w="80" ns0:type="dxa"/>
-              <ns0:start ns0:w="80" ns0:type="dxa"/>
-              <ns0:bottom ns0:w="80" ns0:type="dxa"/>
-              <ns0:end ns0:w="80" ns0:type="dxa"/>
-            </ns0:tcMar>
-            <ns0:shd ns0:fill="D9E5F3"/>
-          </ns0:tcPr>
-          <ns0:p>
-            <ns0:pPr>
-              <ns0:spacing ns0:before="0" ns0:after="0" ns0:line="240" ns0:lineRule="auto"/>
-              <ns0:ind ns0:firstLine="0" ns0:left="0" ns0:right="0"/>
-              <ns0:jc ns0:val="left"/>
-            </ns0:pPr>
-            <ns0:r>
-              <ns0:rPr>
-                <ns0:rFonts ns0:ascii="宋体" ns0:hAnsi="宋体" ns0:eastAsia="宋体"/>
-                <ns0:b/>
-                <ns0:color ns0:val="000000"/>
-                <ns0:sz ns0:val="18"/>
-              </ns0:rPr>
-              <ns0:t>修订说明</ns0:t>
-            </ns0:r>
-          </ns0:p>
-        </ns0:tc>
-        <ns0:tc>
-          <ns0:tcPr>
-            <ns0:tcW ns0:type="dxa" ns0:w="1531"/>
-            <ns0:vAlign ns0:val="center"/>
-            <ns0:tcMar>
-              <ns0:top ns0:w="80" ns0:type="dxa"/>
-              <ns0:start ns0:w="80" ns0:type="dxa"/>
-              <ns0:bottom ns0:w="80" ns0:type="dxa"/>
-              <ns0:end ns0:w="80" ns0:type="dxa"/>
-            </ns0:tcMar>
-            <ns0:shd ns0:fill="D9E5F3"/>
-          </ns0:tcPr>
-          <ns0:p>
-            <ns0:pPr>
-              <ns0:spacing ns0:before="0" ns0:after="0" ns0:line="240" ns0:lineRule="auto"/>
-              <ns0:ind ns0:firstLine="0" ns0:left="0" ns0:right="0"/>
-              <ns0:jc ns0:val="center"/>
-            </ns0:pPr>
-            <ns0:r>
-              <ns0:rPr>
-                <ns0:rFonts ns0:ascii="宋体" ns0:hAnsi="宋体" ns0:eastAsia="宋体"/>
-                <ns0:b/>
-                <ns0:color ns0:val="000000"/>
-                <ns0:sz ns0:val="18"/>
-              </ns0:rPr>
-              <ns0:t>编制/修订人</ns0:t>
-            </ns0:r>
-          </ns0:p>
-        </ns0:tc>
-      </ns0:tr>
-      <ns0:tr>
-        <ns0:trPr>
-          <ns0:trHeight ns0:hRule="atLeast" ns0:val="442"/>
-        </ns0:trPr>
-        <ns0:tc>
-          <ns0:tcPr>
-            <ns0:tcW ns0:type="dxa" ns0:w="964"/>
-            <ns0:vAlign ns0:val="center"/>
-            <ns0:tcMar>
-              <ns0:top ns0:w="80" ns0:type="dxa"/>
-              <ns0:start ns0:w="80" ns0:type="dxa"/>
-              <ns0:bottom ns0:w="80" ns0:type="dxa"/>
-              <ns0:end ns0:w="80" ns0:type="dxa"/>
-            </ns0:tcMar>
-          </ns0:tcPr>
-          <ns0:p>
-            <ns0:pPr>
-              <ns0:spacing ns0:before="0" ns0:after="0" ns0:line="240" ns0:lineRule="auto"/>
-              <ns0:ind ns0:firstLine="0" ns0:left="0" ns0:right="0"/>
-              <ns0:jc ns0:val="center"/>
-            </ns0:pPr>
-            <ns0:r>
-              <ns0:rPr>
-                <ns0:rFonts ns0:ascii="宋体" ns0:hAnsi="宋体" ns0:eastAsia="宋体"/>
-                <ns0:b ns0:val="0"/>
-                <ns0:color ns0:val="000000"/>
-                <ns0:sz ns0:val="18"/>
-              </ns0:rPr>
-              <ns0:t>V0.1</ns0:t>
-            </ns0:r>
-          </ns0:p>
-        </ns0:tc>
-        <ns0:tc>
-          <ns0:tcPr>
-            <ns0:tcW ns0:type="dxa" ns0:w="1247"/>
-            <ns0:vAlign ns0:val="center"/>
-            <ns0:tcMar>
-              <ns0:top ns0:w="80" ns0:type="dxa"/>
-              <ns0:start ns0:w="80" ns0:type="dxa"/>
-              <ns0:bottom ns0:w="80" ns0:type="dxa"/>
-              <ns0:end ns0:w="80" ns0:type="dxa"/>
-            </ns0:tcMar>
-          </ns0:tcPr>
-          <ns0:p>
-            <ns0:pPr>
-              <ns0:spacing ns0:before="0" ns0:after="0" ns0:line="240" ns0:lineRule="auto"/>
-              <ns0:ind ns0:firstLine="0" ns0:left="0" ns0:right="0"/>
-              <ns0:jc ns0:val="center"/>
-            </ns0:pPr>
-            <ns0:r>
-              <ns0:rPr>
-                <ns0:rFonts ns0:ascii="宋体" ns0:hAnsi="宋体" ns0:eastAsia="宋体"/>
-                <ns0:b ns0:val="0"/>
-                <ns0:color ns0:val="000000"/>
-                <ns0:sz ns0:val="18"/>
-              </ns0:rPr>
-              <ns0:t>2026-09-10</ns0:t>
-            </ns0:r>
-          </ns0:p>
-        </ns0:tc>
-        <ns0:tc>
-          <ns0:tcPr>
-            <ns0:tcW ns0:type="dxa" ns0:w="1417"/>
-            <ns0:vAlign ns0:val="center"/>
-            <ns0:tcMar>
-              <ns0:top ns0:w="80" ns0:type="dxa"/>
-              <ns0:start ns0:w="80" ns0:type="dxa"/>
-              <ns0:bottom ns0:w="80" ns0:type="dxa"/>
-              <ns0:end ns0:w="80" ns0:type="dxa"/>
-            </ns0:tcMar>
-          </ns0:tcPr>
-          <ns0:p>
-            <ns0:pPr>
-              <ns0:spacing ns0:before="0" ns0:after="0" ns0:line="240" ns0:lineRule="auto"/>
-              <ns0:ind ns0:firstLine="0" ns0:left="0" ns0:right="0"/>
-              <ns0:jc ns0:val="center"/>
-            </ns0:pPr>
-            <ns0:r>
-              <ns0:rPr>
-                <ns0:rFonts ns0:ascii="宋体" ns0:hAnsi="宋体" ns0:eastAsia="宋体"/>
-                <ns0:b ns0:val="0"/>
-                <ns0:color ns0:val="000000"/>
-                <ns0:sz ns0:val="18"/>
-              </ns0:rPr>
-              <ns0:t>全部</ns0:t>
-            </ns0:r>
-          </ns0:p>
-        </ns0:tc>
-        <ns0:tc>
-          <ns0:tcPr>
-            <ns0:tcW ns0:type="dxa" ns0:w="4535"/>
-            <ns0:vAlign ns0:val="center"/>
-            <ns0:tcMar>
-              <ns0:top ns0:w="80" ns0:type="dxa"/>
-              <ns0:start ns0:w="80" ns0:type="dxa"/>
-              <ns0:bottom ns0:w="80" ns0:type="dxa"/>
-              <ns0:end ns0:w="80" ns0:type="dxa"/>
-            </ns0:tcMar>
-          </ns0:tcPr>
-          <ns0:p>
-            <ns0:pPr>
-              <ns0:spacing ns0:before="0" ns0:after="0" ns0:line="240" ns0:lineRule="auto"/>
-              <ns0:ind ns0:firstLine="0" ns0:left="0" ns0:right="0"/>
-              <ns0:jc ns0:val="left"/>
-            </ns0:pPr>
-            <ns0:r>
-              <ns0:rPr>
-                <ns0:rFonts ns0:ascii="宋体" ns0:hAnsi="宋体" ns0:eastAsia="宋体"/>
-                <ns0:b ns0:val="0"/>
-                <ns0:color ns0:val="000000"/>
-                <ns0:sz ns0:val="18"/>
-              </ns0:rPr>
-              <ns0:t>基于冻结编标输入形成项目建议书工作稿。</ns0:t>
-            </ns0:r>
-          </ns0:p>
-        </ns0:tc>
-        <ns0:tc>
-          <ns0:tcPr>
-            <ns0:tcW ns0:type="dxa" ns0:w="1531"/>
-            <ns0:vAlign ns0:val="center"/>
-            <ns0:tcMar>
-              <ns0:top ns0:w="80" ns0:type="dxa"/>
-              <ns0:start ns0:w="80" ns0:type="dxa"/>
-              <ns0:bottom ns0:w="80" ns0:type="dxa"/>
-              <ns0:end ns0:w="80" ns0:type="dxa"/>
-            </ns0:tcMar>
-          </ns0:tcPr>
-          <ns0:p>
-            <ns0:pPr>
-              <ns0:spacing ns0:before="0" ns0:after="0" ns0:line="240" ns0:lineRule="auto"/>
-              <ns0:ind ns0:firstLine="0" ns0:left="0" ns0:right="0"/>
-              <ns0:jc ns0:val="center"/>
-            </ns0:pPr>
-            <ns0:r>
-              <ns0:rPr>
-                <ns0:rFonts ns0:ascii="宋体" ns0:hAnsi="宋体" ns0:eastAsia="宋体"/>
-                <ns0:b ns0:val="0"/>
-                <ns0:color ns0:val="000000"/>
-                <ns0:sz ns0:val="18"/>
-              </ns0:rPr>
-              <ns0:t>何思源</ns0:t>
-            </ns0:r>
-          </ns0:p>
-        </ns0:tc>
-      </ns0:tr>
-      <ns0:tr>
-        <ns0:trPr>
-          <ns0:trHeight ns0:hRule="atLeast" ns0:val="442"/>
-        </ns0:trPr>
-        <ns0:tc>
-          <ns0:tcPr>
-            <ns0:tcW ns0:type="dxa" ns0:w="964"/>
-            <ns0:vAlign ns0:val="center"/>
-            <ns0:tcMar>
-              <ns0:top ns0:w="80" ns0:type="dxa"/>
-              <ns0:start ns0:w="80" ns0:type="dxa"/>
-              <ns0:bottom ns0:w="80" ns0:type="dxa"/>
-              <ns0:end ns0:w="80" ns0:type="dxa"/>
-            </ns0:tcMar>
-          </ns0:tcPr>
-          <ns0:p>
-            <ns0:pPr>
-              <ns0:spacing ns0:before="0" ns0:after="0" ns0:line="240" ns0:lineRule="auto"/>
-              <ns0:ind ns0:firstLine="0" ns0:left="0" ns0:right="0"/>
-              <ns0:jc ns0:val="center"/>
-            </ns0:pPr>
-            <ns0:r>
-              <ns0:rPr>
-                <ns0:rFonts ns0:ascii="宋体" ns0:hAnsi="宋体" ns0:eastAsia="宋体"/>
-                <ns0:b ns0:val="0"/>
-                <ns0:color ns0:val="000000"/>
-                <ns0:sz ns0:val="18"/>
-              </ns0:rPr>
-              <ns0:t>V0.2</ns0:t>
-            </ns0:r>
-          </ns0:p>
-        </ns0:tc>
-        <ns0:tc>
-          <ns0:tcPr>
-            <ns0:tcW ns0:type="dxa" ns0:w="1247"/>
-            <ns0:vAlign ns0:val="center"/>
-            <ns0:tcMar>
-              <ns0:top ns0:w="80" ns0:type="dxa"/>
-              <ns0:start ns0:w="80" ns0:type="dxa"/>
-              <ns0:bottom ns0:w="80" ns0:type="dxa"/>
-              <ns0:end ns0:w="80" ns0:type="dxa"/>
-            </ns0:tcMar>
-          </ns0:tcPr>
-          <ns0:p>
-            <ns0:pPr>
-              <ns0:spacing ns0:before="0" ns0:after="0" ns0:line="240" ns0:lineRule="auto"/>
-              <ns0:ind ns0:firstLine="0" ns0:left="0" ns0:right="0"/>
-              <ns0:jc ns0:val="center"/>
-            </ns0:pPr>
-            <ns0:r>
-              <ns0:rPr>
-                <ns0:rFonts ns0:ascii="宋体" ns0:hAnsi="宋体" ns0:eastAsia="宋体"/>
-                <ns0:b ns0:val="0"/>
-                <ns0:color ns0:val="000000"/>
-                <ns0:sz ns0:val="18"/>
-              </ns0:rPr>
-              <ns0:t>2026-09-10</ns0:t>
-            </ns0:r>
-          </ns0:p>
-        </ns0:tc>
-        <ns0:tc>
-          <ns0:tcPr>
-            <ns0:tcW ns0:type="dxa" ns0:w="1417"/>
-            <ns0:vAlign ns0:val="center"/>
-            <ns0:tcMar>
-              <ns0:top ns0:w="80" ns0:type="dxa"/>
-              <ns0:start ns0:w="80" ns0:type="dxa"/>
-              <ns0:bottom ns0:w="80" ns0:type="dxa"/>
-              <ns0:end ns0:w="80" ns0:type="dxa"/>
-            </ns0:tcMar>
-          </ns0:tcPr>
-          <ns0:p>
-            <ns0:pPr>
-              <ns0:spacing ns0:before="0" ns0:after="0" ns0:line="240" ns0:lineRule="auto"/>
-              <ns0:ind ns0:firstLine="0" ns0:left="0" ns0:right="0"/>
-              <ns0:jc ns0:val="center"/>
-            </ns0:pPr>
-            <ns0:r>
-              <ns0:rPr>
-                <ns0:rFonts ns0:ascii="宋体" ns0:hAnsi="宋体" ns0:eastAsia="宋体"/>
-                <ns0:b ns0:val="0"/>
-                <ns0:color ns0:val="000000"/>
-                <ns0:sz ns0:val="18"/>
-              </ns0:rPr>
-              <ns0:t>状态、3.1、3.3、7</ns0:t>
-            </ns0:r>
-          </ns0:p>
-        </ns0:tc>
-        <ns0:tc>
-          <ns0:tcPr>
-            <ns0:tcW ns0:type="dxa" ns0:w="4535"/>
-            <ns0:vAlign ns0:val="center"/>
-            <ns0:tcMar>
-              <ns0:top ns0:w="80" ns0:type="dxa"/>
-              <ns0:start ns0:w="80" ns0:type="dxa"/>
-              <ns0:bottom ns0:w="80" ns0:type="dxa"/>
-              <ns0:end ns0:w="80" ns0:type="dxa"/>
-            </ns0:tcMar>
-          </ns0:tcPr>
-          <ns0:p>
-            <ns0:pPr>
-              <ns0:spacing ns0:before="0" ns0:after="0" ns0:line="240" ns0:lineRule="auto"/>
-              <ns0:ind ns0:firstLine="0" ns0:left="0" ns0:right="0"/>
-              <ns0:jc ns0:val="left"/>
-            </ns0:pPr>
-            <ns0:r>
-              <ns0:rPr>
-                <ns0:rFonts ns0:ascii="宋体" ns0:hAnsi="宋体" ns0:eastAsia="宋体"/>
-                <ns0:b ns0:val="0"/>
-                <ns0:color ns0:val="000000"/>
-                <ns0:sz ns0:val="18"/>
-              </ns0:rPr>
-              <ns0:t>明确课程模拟澄清边界，采用总体技术方案 V0.6 稳定结论，并按教学样例重新排版。</ns0:t>
-            </ns0:r>
-          </ns0:p>
-        </ns0:tc>
-        <ns0:tc>
-          <ns0:tcPr>
-            <ns0:tcW ns0:type="dxa" ns0:w="1531"/>
-            <ns0:vAlign ns0:val="center"/>
-            <ns0:tcMar>
-              <ns0:top ns0:w="80" ns0:type="dxa"/>
-              <ns0:start ns0:w="80" ns0:type="dxa"/>
-              <ns0:bottom ns0:w="80" ns0:type="dxa"/>
-              <ns0:end ns0:w="80" ns0:type="dxa"/>
-            </ns0:tcMar>
-          </ns0:tcPr>
-          <ns0:p>
-            <ns0:pPr>
-              <ns0:spacing ns0:before="0" ns0:after="0" ns0:line="240" ns0:lineRule="auto"/>
-              <ns0:ind ns0:firstLine="0" ns0:left="0" ns0:right="0"/>
-              <ns0:jc ns0:val="center"/>
-            </ns0:pPr>
-            <ns0:r>
-              <ns0:rPr>
-                <ns0:rFonts ns0:ascii="宋体" ns0:hAnsi="宋体" ns0:eastAsia="宋体"/>
-                <ns0:b ns0:val="0"/>
-                <ns0:color ns0:val="000000"/>
-                <ns0:sz ns0:val="18"/>
-              </ns0:rPr>
-              <ns0:t>何思源</ns0:t>
-            </ns0:r>
-          </ns0:p>
-        </ns0:tc>
-      </ns0:tr>
-      <ns0:tr>
-        <ns0:trPr>
-          <ns0:trHeight ns0:hRule="atLeast" ns0:val="442"/>
-        </ns0:trPr>
-        <ns0:tc>
-          <ns0:tcPr>
-            <ns0:tcW ns0:type="dxa" ns0:w="964"/>
-            <ns0:tcMar>
-              <ns0:top ns0:w="80" ns0:type="dxa"/>
-              <ns0:start ns0:w="80" ns0:type="dxa"/>
-              <ns0:bottom ns0:w="80" ns0:type="dxa"/>
-              <ns0:end ns0:w="80" ns0:type="dxa"/>
-            </ns0:tcMar>
-            <ns0:vAlign ns0:val="center"/>
-          </ns0:tcPr>
-          <ns0:p>
-            <ns0:pPr>
-              <ns0:spacing ns0:before="0" ns0:after="0" ns0:line="240" ns0:lineRule="auto"/>
-              <ns0:jc ns0:val="center"/>
-            </ns0:pPr>
-            <ns0:r>
-              <ns0:rPr>
-                <ns0:rFonts ns0:ascii="宋体" ns0:hAnsi="宋体" ns0:eastAsia="宋体"/>
-                <ns0:b ns0:val="0"/>
-                <ns0:sz ns0:val="18"/>
-              </ns0:rPr>
-              <ns0:t>V1.0</ns0:t>
-            </ns0:r>
-          </ns0:p>
-        </ns0:tc>
-        <ns0:tc>
-          <ns0:tcPr>
-            <ns0:tcW ns0:type="dxa" ns0:w="1247"/>
-            <ns0:tcMar>
-              <ns0:top ns0:w="80" ns0:type="dxa"/>
-              <ns0:start ns0:w="80" ns0:type="dxa"/>
-              <ns0:bottom ns0:w="80" ns0:type="dxa"/>
-              <ns0:end ns0:w="80" ns0:type="dxa"/>
-            </ns0:tcMar>
-            <ns0:vAlign ns0:val="center"/>
-          </ns0:tcPr>
-          <ns0:p>
-            <ns0:pPr>
-              <ns0:spacing ns0:before="0" ns0:after="0" ns0:line="240" ns0:lineRule="auto"/>
-              <ns0:jc ns0:val="center"/>
-            </ns0:pPr>
-            <ns0:r>
-              <ns0:rPr>
-                <ns0:rFonts ns0:ascii="宋体" ns0:hAnsi="宋体" ns0:eastAsia="宋体"/>
-                <ns0:b ns0:val="0"/>
-                <ns0:sz ns0:val="18"/>
-              </ns0:rPr>
-              <ns0:t>2026-09-12</ns0:t>
-            </ns0:r>
-          </ns0:p>
-        </ns0:tc>
-        <ns0:tc>
-          <ns0:tcPr>
-            <ns0:tcW ns0:type="dxa" ns0:w="1417"/>
-            <ns0:tcMar>
-              <ns0:top ns0:w="80" ns0:type="dxa"/>
-              <ns0:start ns0:w="80" ns0:type="dxa"/>
-              <ns0:bottom ns0:w="80" ns0:type="dxa"/>
-              <ns0:end ns0:w="80" ns0:type="dxa"/>
-            </ns0:tcMar>
-            <ns0:vAlign ns0:val="center"/>
-          </ns0:tcPr>
-          <ns0:p>
-            <ns0:pPr>
-              <ns0:spacing ns0:before="0" ns0:after="0" ns0:line="240" ns0:lineRule="auto"/>
-              <ns0:jc ns0:val="center"/>
-            </ns0:pPr>
-            <ns0:r>
-              <ns0:rPr>
-                <ns0:rFonts ns0:ascii="宋体" ns0:hAnsi="宋体" ns0:eastAsia="宋体"/>
-                <ns0:b ns0:val="0"/>
-                <ns0:sz ns0:val="18"/>
-              </ns0:rPr>
-              <ns0:t>全文</ns0:t>
-            </ns0:r>
-          </ns0:p>
-        </ns0:tc>
-        <ns0:tc>
-          <ns0:tcPr>
-            <ns0:tcW ns0:type="dxa" ns0:w="4535"/>
-            <ns0:tcMar>
-              <ns0:top ns0:w="80" ns0:type="dxa"/>
-              <ns0:start ns0:w="80" ns0:type="dxa"/>
-              <ns0:bottom ns0:w="80" ns0:type="dxa"/>
-              <ns0:end ns0:w="80" ns0:type="dxa"/>
-            </ns0:tcMar>
-            <ns0:vAlign ns0:val="center"/>
-          </ns0:tcPr>
-          <ns0:p>
-            <ns0:pPr>
-              <ns0:spacing ns0:before="0" ns0:after="0" ns0:line="240" ns0:lineRule="auto"/>
-              <ns0:jc ns0:val="left"/>
-            </ns0:pPr>
-            <ns0:r>
-              <ns0:rPr>
-                <ns0:rFonts ns0:ascii="宋体" ns0:hAnsi="宋体" ns0:eastAsia="宋体"/>
-                <ns0:b ns0:val="0"/>
-                <ns0:sz ns0:val="18"/>
-              </ns0:rPr>
-              <ns0:t>完成技术与符合性复核并纳入第一关冻结成果。</ns0:t>
-            </ns0:r>
-          </ns0:p>
-        </ns0:tc>
-        <ns0:tc>
-          <ns0:tcPr>
-            <ns0:tcW ns0:type="dxa" ns0:w="1531"/>
-            <ns0:tcMar>
-              <ns0:top ns0:w="80" ns0:type="dxa"/>
-              <ns0:start ns0:w="80" ns0:type="dxa"/>
-              <ns0:bottom ns0:w="80" ns0:type="dxa"/>
-              <ns0:end ns0:w="80" ns0:type="dxa"/>
-            </ns0:tcMar>
-            <ns0:vAlign ns0:val="center"/>
-          </ns0:tcPr>
-          <ns0:p>
-            <ns0:pPr>
-              <ns0:spacing ns0:before="0" ns0:after="0" ns0:line="240" ns0:lineRule="auto"/>
-              <ns0:jc ns0:val="center"/>
-            </ns0:pPr>
-            <ns0:r>
-              <ns0:rPr>
-                <ns0:rFonts ns0:ascii="宋体" ns0:hAnsi="宋体" ns0:eastAsia="宋体"/>
-                <ns0:b ns0:val="0"/>
-                <ns0:sz ns0:val="18"/>
-              </ns0:rPr>
-              <ns0:t>何思源</ns0:t>
-            </ns0:r>
-          </ns0:p>
-        </ns0:tc>
-      </ns0:tr>
-      <ns0:tr>
-        <ns0:trPr>
-          <ns0:trHeight ns0:hRule="atLeast" ns0:val="442"/>
-        </ns0:trPr>
-        <ns0:tc>
-          <ns0:tcPr>
-            <ns0:tcW ns0:type="dxa" ns0:w="964"/>
-            <ns0:tcMar>
-              <ns0:top ns0:w="80" ns0:type="dxa"/>
-              <ns0:start ns0:w="80" ns0:type="dxa"/>
-              <ns0:bottom ns0:w="80" ns0:type="dxa"/>
-              <ns0:end ns0:w="80" ns0:type="dxa"/>
-            </ns0:tcMar>
-            <ns0:vAlign ns0:val="center"/>
-          </ns0:tcPr>
-          <ns0:p>
-            <ns0:pPr>
-              <ns0:spacing ns0:before="0" ns0:after="0" ns0:line="240" ns0:lineRule="auto"/>
-              <ns0:jc ns0:val="center"/>
-            </ns0:pPr>
-            <ns0:r>
-              <ns0:rPr>
-                <ns0:rFonts ns0:ascii="宋体" ns0:hAnsi="宋体" ns0:eastAsia="宋体"/>
-                <ns0:b ns0:val="0"/>
-                <ns0:sz ns0:val="18"/>
-              </ns0:rPr>
-              <ns0:t>V1.1</ns0:t>
-            </ns0:r>
-          </ns0:p>
-        </ns0:tc>
-        <ns0:tc>
-          <ns0:tcPr>
-            <ns0:tcW ns0:type="dxa" ns0:w="1247"/>
-            <ns0:tcMar>
-              <ns0:top ns0:w="80" ns0:type="dxa"/>
-              <ns0:start ns0:w="80" ns0:type="dxa"/>
-              <ns0:bottom ns0:w="80" ns0:type="dxa"/>
-              <ns0:end ns0:w="80" ns0:type="dxa"/>
-            </ns0:tcMar>
-            <ns0:vAlign ns0:val="center"/>
-          </ns0:tcPr>
-          <ns0:p>
-            <ns0:pPr>
-              <ns0:spacing ns0:before="0" ns0:after="0" ns0:line="240" ns0:lineRule="auto"/>
-              <ns0:jc ns0:val="center"/>
-            </ns0:pPr>
-            <ns0:r>
-              <ns0:rPr>
-                <ns0:rFonts ns0:ascii="宋体" ns0:hAnsi="宋体" ns0:eastAsia="宋体"/>
-                <ns0:b ns0:val="0"/>
-                <ns0:sz ns0:val="18"/>
-              </ns0:rPr>
-              <ns0:t>2026-09-13</ns0:t>
-            </ns0:r>
-          </ns0:p>
-        </ns0:tc>
-        <ns0:tc>
-          <ns0:tcPr>
-            <ns0:tcW ns0:type="dxa" ns0:w="1417"/>
-            <ns0:tcMar>
-              <ns0:top ns0:w="80" ns0:type="dxa"/>
-              <ns0:start ns0:w="80" ns0:type="dxa"/>
-              <ns0:bottom ns0:w="80" ns0:type="dxa"/>
-              <ns0:end ns0:w="80" ns0:type="dxa"/>
-            </ns0:tcMar>
-            <ns0:vAlign ns0:val="center"/>
-          </ns0:tcPr>
-          <ns0:p>
-            <ns0:pPr>
-              <ns0:spacing ns0:before="0" ns0:after="0" ns0:line="240" ns0:lineRule="auto"/>
-              <ns0:jc ns0:val="center"/>
-            </ns0:pPr>
-            <ns0:r>
-              <ns0:rPr>
-                <ns0:rFonts ns0:ascii="宋体" ns0:hAnsi="宋体" ns0:eastAsia="宋体"/>
-                <ns0:b ns0:val="0"/>
-                <ns0:sz ns0:val="18"/>
-              </ns0:rPr>
-              <ns0:t>封面及署名</ns0:t>
-            </ns0:r>
-          </ns0:p>
-        </ns0:tc>
-        <ns0:tc>
-          <ns0:tcPr>
-            <ns0:tcW ns0:type="dxa" ns0:w="4535"/>
-            <ns0:tcMar>
-              <ns0:top ns0:w="80" ns0:type="dxa"/>
-              <ns0:start ns0:w="80" ns0:type="dxa"/>
-              <ns0:bottom ns0:w="80" ns0:type="dxa"/>
-              <ns0:end ns0:w="80" ns0:type="dxa"/>
-            </ns0:tcMar>
-            <ns0:vAlign ns0:val="center"/>
-          </ns0:tcPr>
-          <ns0:p>
-            <ns0:pPr>
-              <ns0:spacing ns0:before="0" ns0:after="0" ns0:line="240" ns0:lineRule="auto"/>
-              <ns0:jc ns0:val="left"/>
-            </ns0:pPr>
-            <ns0:r>
-              <ns0:rPr>
-                <ns0:rFonts ns0:ascii="宋体" ns0:hAnsi="宋体" ns0:eastAsia="宋体"/>
-                <ns0:b ns0:val="0"/>
-                <ns0:sz ns0:val="18"/>
-              </ns0:rPr>
-              <ns0:t>完成正式交付物实名化和首轮格式规范化。</ns0:t>
-            </ns0:r>
-          </ns0:p>
-        </ns0:tc>
-        <ns0:tc>
-          <ns0:tcPr>
-            <ns0:tcW ns0:type="dxa" ns0:w="1531"/>
-            <ns0:tcMar>
-              <ns0:top ns0:w="80" ns0:type="dxa"/>
-              <ns0:start ns0:w="80" ns0:type="dxa"/>
-              <ns0:bottom ns0:w="80" ns0:type="dxa"/>
-              <ns0:end ns0:w="80" ns0:type="dxa"/>
-            </ns0:tcMar>
-            <ns0:vAlign ns0:val="center"/>
-          </ns0:tcPr>
-          <ns0:p>
-            <ns0:pPr>
-              <ns0:spacing ns0:before="0" ns0:after="0" ns0:line="240" ns0:lineRule="auto"/>
-              <ns0:jc ns0:val="center"/>
-            </ns0:pPr>
-            <ns0:r>
-              <ns0:rPr>
-                <ns0:rFonts ns0:ascii="宋体" ns0:hAnsi="宋体" ns0:eastAsia="宋体"/>
-                <ns0:b ns0:val="0"/>
-                <ns0:sz ns0:val="18"/>
-              </ns0:rPr>
-              <ns0:t>何思源</ns0:t>
-            </ns0:r>
-          </ns0:p>
-        </ns0:tc>
-      </ns0:tr>
-      <ns0:tr>
-        <ns0:trPr>
-          <ns0:trHeight ns0:hRule="atLeast" ns0:val="442"/>
-        </ns0:trPr>
-        <ns0:tc>
-          <ns0:tcPr>
-            <ns0:tcW ns0:type="dxa" ns0:w="964"/>
-            <ns0:tcMar>
-              <ns0:top ns0:w="80" ns0:type="dxa"/>
-              <ns0:start ns0:w="80" ns0:type="dxa"/>
-              <ns0:bottom ns0:w="80" ns0:type="dxa"/>
-              <ns0:end ns0:w="80" ns0:type="dxa"/>
-            </ns0:tcMar>
-            <ns0:vAlign ns0:val="center"/>
-          </ns0:tcPr>
-          <ns0:p>
-            <ns0:pPr>
-              <ns0:spacing ns0:before="0" ns0:after="0" ns0:line="240" ns0:lineRule="auto"/>
-              <ns0:jc ns0:val="center"/>
-            </ns0:pPr>
-            <ns0:r>
-              <ns0:rPr>
-                <ns0:rFonts ns0:ascii="宋体" ns0:hAnsi="宋体" ns0:eastAsia="宋体"/>
-                <ns0:b ns0:val="0"/>
-                <ns0:sz ns0:val="18"/>
-              </ns0:rPr>
-              <ns0:t>V1.2</ns0:t>
-            </ns0:r>
-          </ns0:p>
-        </ns0:tc>
-        <ns0:tc>
-          <ns0:tcPr>
-            <ns0:tcW ns0:type="dxa" ns0:w="1247"/>
-            <ns0:tcMar>
-              <ns0:top ns0:w="80" ns0:type="dxa"/>
-              <ns0:start ns0:w="80" ns0:type="dxa"/>
-              <ns0:bottom ns0:w="80" ns0:type="dxa"/>
-              <ns0:end ns0:w="80" ns0:type="dxa"/>
-            </ns0:tcMar>
-            <ns0:vAlign ns0:val="center"/>
-          </ns0:tcPr>
-          <ns0:p>
-            <ns0:pPr>
-              <ns0:spacing ns0:before="0" ns0:after="0" ns0:line="240" ns0:lineRule="auto"/>
-              <ns0:jc ns0:val="center"/>
-            </ns0:pPr>
-            <ns0:r>
-              <ns0:rPr>
-                <ns0:rFonts ns0:ascii="宋体" ns0:hAnsi="宋体" ns0:eastAsia="宋体"/>
-                <ns0:b ns0:val="0"/>
-                <ns0:sz ns0:val="18"/>
-              </ns0:rPr>
-              <ns0:t>2026-09-13</ns0:t>
-            </ns0:r>
-          </ns0:p>
-        </ns0:tc>
-        <ns0:tc>
-          <ns0:tcPr>
-            <ns0:tcW ns0:type="dxa" ns0:w="1417"/>
-            <ns0:tcMar>
-              <ns0:top ns0:w="80" ns0:type="dxa"/>
-              <ns0:start ns0:w="80" ns0:type="dxa"/>
-              <ns0:bottom ns0:w="80" ns0:type="dxa"/>
-              <ns0:end ns0:w="80" ns0:type="dxa"/>
-            </ns0:tcMar>
-            <ns0:vAlign ns0:val="center"/>
-          </ns0:tcPr>
-          <ns0:p>
-            <ns0:pPr>
-              <ns0:spacing ns0:before="0" ns0:after="0" ns0:line="240" ns0:lineRule="auto"/>
-              <ns0:jc ns0:val="center"/>
-            </ns0:pPr>
-            <ns0:r>
-              <ns0:rPr>
-                <ns0:rFonts ns0:ascii="宋体" ns0:hAnsi="宋体" ns0:eastAsia="宋体"/>
-                <ns0:b ns0:val="0"/>
-                <ns0:sz ns0:val="18"/>
-              </ns0:rPr>
-              <ns0:t>版式、图 2-1、图 3-1</ns0:t>
-            </ns0:r>
-          </ns0:p>
-        </ns0:tc>
-        <ns0:tc>
-          <ns0:tcPr>
-            <ns0:tcW ns0:type="dxa" ns0:w="4535"/>
-            <ns0:tcMar>
-              <ns0:top ns0:w="80" ns0:type="dxa"/>
-              <ns0:start ns0:w="80" ns0:type="dxa"/>
-              <ns0:bottom ns0:w="80" ns0:type="dxa"/>
-              <ns0:end ns0:w="80" ns0:type="dxa"/>
-            </ns0:tcMar>
-            <ns0:vAlign ns0:val="center"/>
-          </ns0:tcPr>
-          <ns0:p>
-            <ns0:pPr>
-              <ns0:spacing ns0:before="0" ns0:after="0" ns0:line="240" ns0:lineRule="auto"/>
-              <ns0:jc ns0:val="left"/>
-            </ns0:pPr>
-            <ns0:r>
-              <ns0:rPr>
-                <ns0:rFonts ns0:ascii="宋体" ns0:hAnsi="宋体" ns0:eastAsia="宋体"/>
-                <ns0:b ns0:val="0"/>
-                <ns0:sz ns0:val="18"/>
-              </ns0:rPr>
-              <ns0:t>按教学样例复核版式并补充业务流程与建设内容分层图。</ns0:t>
-            </ns0:r>
-          </ns0:p>
-        </ns0:tc>
-        <ns0:tc>
-          <ns0:tcPr>
-            <ns0:tcW ns0:type="dxa" ns0:w="1531"/>
-            <ns0:tcMar>
-              <ns0:top ns0:w="80" ns0:type="dxa"/>
-              <ns0:start ns0:w="80" ns0:type="dxa"/>
-              <ns0:bottom ns0:w="80" ns0:type="dxa"/>
-              <ns0:end ns0:w="80" ns0:type="dxa"/>
-            </ns0:tcMar>
-            <ns0:vAlign ns0:val="center"/>
-          </ns0:tcPr>
-          <ns0:p>
-            <ns0:pPr>
-              <ns0:spacing ns0:before="0" ns0:after="0" ns0:line="240" ns0:lineRule="auto"/>
-              <ns0:jc ns0:val="center"/>
-            </ns0:pPr>
-            <ns0:r>
-              <ns0:rPr>
-                <ns0:rFonts ns0:ascii="宋体" ns0:hAnsi="宋体" ns0:eastAsia="宋体"/>
-                <ns0:b ns0:val="0"/>
-                <ns0:sz ns0:val="18"/>
-              </ns0:rPr>
-              <ns0:t>何思源</ns0:t>
-            </ns0:r>
-          </ns0:p>
-        </ns0:tc>
-      </ns0:tr>
     </ns0:tbl>
     <ns0:p>
       <ns0:r>
@@ -1055,49 +763,59 @@
     <ns0:p>
       <ns0:pPr>
         <ns0:pStyle ns0:val="1"/>
-      </ns0:pPr>
-      <ns0:r>
+        <ns0:spacing ns0:before="240" ns0:after="160"/>
+      </ns0:pPr>
+      <ns0:r>
+        <ns0:rPr>
+          <ns0:rFonts ns0:eastAsia="黑体"/>
+        </ns0:rPr>
         <ns0:t>1 项目背景与问题理解</ns0:t>
       </ns0:r>
     </ns0:p>
     <ns0:p>
       <ns0:pPr>
-        <ns0:widowControl/>
-      </ns0:pPr>
-      <ns0:r>
-        <ns0:rPr>
-          <ns0:rFonts ns0:ascii="Times New Roman" ns0:hAnsi="Times New Roman" ns0:eastAsia="宋体"/>
+        <ns0:ind ns0:firstLine="475"/>
+        <ns0:spacing ns0:after="100" ns0:line="360" ns0:lineRule="auto"/>
+      </ns0:pPr>
+      <ns0:r>
+        <ns0:rPr>
           <ns0:b ns0:val="0"/>
+          <ns0:rFonts ns0:eastAsia="宋体"/>
+          <ns0:sz ns0:val="24"/>
+          <ns0:szCs ns0:val="24"/>
           <ns0:color ns0:val="000000"/>
-          <ns0:sz ns0:val="24"/>
         </ns0:rPr>
         <ns0:t>某自然博物馆具有展厅、藏品库房、公共区域及配套功能区，是兼具观众人员密集与不可再生文物藏品保护责任的公共场所。随着免费开放和节假日、暑期客流增加，社会安全、自然灾害、火灾及运行事故等复合型突发事件的预防与处置，对应急管理的及时性、协同性和可追溯性提出了更高要求。</ns0:t>
       </ns0:r>
     </ns0:p>
     <ns0:p>
       <ns0:pPr>
-        <ns0:widowControl/>
-      </ns0:pPr>
-      <ns0:r>
-        <ns0:rPr>
-          <ns0:rFonts ns0:ascii="Times New Roman" ns0:hAnsi="Times New Roman" ns0:eastAsia="宋体"/>
+        <ns0:ind ns0:firstLine="475"/>
+        <ns0:spacing ns0:after="100" ns0:line="360" ns0:lineRule="auto"/>
+      </ns0:pPr>
+      <ns0:r>
+        <ns0:rPr>
           <ns0:b ns0:val="0"/>
+          <ns0:rFonts ns0:eastAsia="宋体"/>
+          <ns0:sz ns0:val="24"/>
+          <ns0:szCs ns0:val="24"/>
           <ns0:color ns0:val="000000"/>
-          <ns0:sz ns0:val="24"/>
         </ns0:rPr>
         <ns0:t>需求书明确指出，当前预案以纸质或分散电子文件为主，启动依赖人工判断与电话通知；现场人员位置、视频和物资等态势难以集中呈现；资源、演练和值班缺少系统化支撑；事件接报、核实、处置、关闭、评估和调查尚未形成全过程闭环。</ns0:t>
       </ns0:r>
     </ns0:p>
     <ns0:p>
       <ns0:pPr>
-        <ns0:widowControl/>
-      </ns0:pPr>
-      <ns0:r>
-        <ns0:rPr>
-          <ns0:rFonts ns0:ascii="Times New Roman" ns0:hAnsi="Times New Roman" ns0:eastAsia="宋体"/>
+        <ns0:ind ns0:firstLine="475"/>
+        <ns0:spacing ns0:after="100" ns0:line="360" ns0:lineRule="auto"/>
+      </ns0:pPr>
+      <ns0:r>
+        <ns0:rPr>
           <ns0:b ns0:val="0"/>
+          <ns0:rFonts ns0:eastAsia="宋体"/>
+          <ns0:sz ns0:val="24"/>
+          <ns0:szCs ns0:val="24"/>
           <ns0:color ns0:val="000000"/>
-          <ns0:sz ns0:val="24"/>
         </ns0:rPr>
         <ns0:t>因此，本项目的重点不是重建馆内视频、门禁、消防或物联网等既有基础系统，而是把其已具备的感知、信息与控制能力通过接口纳入应急业务闭环，使日常预案、资源、演练和值班管理能够在突发事件发生时转化为可调用的处置基础。</ns0:t>
       </ns0:r>
@@ -1105,8 +823,12 @@
     <ns0:p>
       <ns0:pPr>
         <ns0:pStyle ns0:val="1"/>
-      </ns0:pPr>
-      <ns0:r>
+        <ns0:spacing ns0:before="240" ns0:after="160"/>
+      </ns0:pPr>
+      <ns0:r>
+        <ns0:rPr>
+          <ns0:rFonts ns0:eastAsia="黑体"/>
+        </ns0:rPr>
         <ns0:t>2 建设目标与建设内容</ns0:t>
       </ns0:r>
     </ns0:p>
@@ -1126,7 +848,7 @@
       <ns0:r>
         <ns0:drawing>
           <wp:inline xmlns:wp="http://schemas.openxmlformats.org/drawingml/2006/wordprocessingDrawing" xmlns:a="http://schemas.openxmlformats.org/drawingml/2006/main" xmlns:pic="http://schemas.openxmlformats.org/drawingml/2006/picture">
-            <wp:extent cx="5760000" cy="2160000"/>
+            <wp:extent cx="5580000" cy="2092500"/>
             <wp:docPr id="1" name="Picture 1"/>
             <wp:cNvGraphicFramePr>
               <a:graphicFrameLocks noChangeAspect="1"/>
@@ -1147,7 +869,7 @@
                   <pic:spPr>
                     <a:xfrm>
                       <a:off x="0" y="0"/>
-                      <a:ext cx="5760000" cy="2160000"/>
+                      <a:ext cx="5580000" cy="2092500"/>
                     </a:xfrm>
                     <a:prstGeom prst="rect"/>
                   </pic:spPr>
@@ -1163,33 +885,42 @@
         <ns0:jc ns0:val="center"/>
       </ns0:pPr>
       <ns0:r>
+        <ns0:rPr>
+          <ns0:rFonts ns0:eastAsia="黑体"/>
+          <ns0:sz ns0:val="18"/>
+          <ns0:color ns0:val="000000"/>
+        </ns0:rPr>
         <ns0:t>图 2-1 应急业务全流程与建设目标</ns0:t>
       </ns0:r>
     </ns0:p>
     <ns0:p>
       <ns0:pPr>
-        <ns0:widowControl/>
-      </ns0:pPr>
-      <ns0:r>
-        <ns0:rPr>
-          <ns0:rFonts ns0:ascii="Times New Roman" ns0:hAnsi="Times New Roman" ns0:eastAsia="宋体"/>
+        <ns0:ind ns0:firstLine="475"/>
+        <ns0:spacing ns0:after="100" ns0:line="360" ns0:lineRule="auto"/>
+      </ns0:pPr>
+      <ns0:r>
+        <ns0:rPr>
           <ns0:b ns0:val="0"/>
+          <ns0:rFonts ns0:eastAsia="宋体"/>
+          <ns0:sz ns0:val="24"/>
+          <ns0:szCs ns0:val="24"/>
           <ns0:color ns0:val="000000"/>
-          <ns0:sz ns0:val="24"/>
         </ns0:rPr>
         <ns0:t>项目建设以数字化应急预案为核心、应急指挥中心为枢纽、移动处置为延伸，并与馆内既有安防、视频、物联网及运营中台联动的应急管理子系统，实现事前准备、事发预警、事中处置和事后改进的全流程闭环。</ns0:t>
       </ns0:r>
     </ns0:p>
     <ns0:p>
       <ns0:pPr>
-        <ns0:widowControl/>
-      </ns0:pPr>
-      <ns0:r>
-        <ns0:rPr>
-          <ns0:rFonts ns0:ascii="Times New Roman" ns0:hAnsi="Times New Roman" ns0:eastAsia="宋体"/>
+        <ns0:ind ns0:firstLine="475"/>
+        <ns0:spacing ns0:after="100" ns0:line="360" ns0:lineRule="auto"/>
+      </ns0:pPr>
+      <ns0:r>
+        <ns0:rPr>
           <ns0:b ns0:val="0"/>
+          <ns0:rFonts ns0:eastAsia="宋体"/>
+          <ns0:sz ns0:val="24"/>
+          <ns0:szCs ns0:val="24"/>
           <ns0:color ns0:val="000000"/>
-          <ns0:sz ns0:val="24"/>
         </ns0:rPr>
         <ns0:t>建设目标是形成覆盖全馆的应急预案、应急资源、应急演练、应急事件、应急值班线上闭环管理能力，支撑统一指挥、移动处置、全过程留痕与跨系统协同；以实用实效、平战结合、融合联动、标准规范、安全可靠、开放可扩展六项原则约束建设与交付。</ns0:t>
       </ns0:r>
@@ -1204,21 +935,23 @@
     </ns0:p>
     <ns0:p>
       <ns0:pPr>
-        <ns0:widowControl/>
-      </ns0:pPr>
-      <ns0:r>
-        <ns0:rPr>
-          <ns0:rFonts ns0:ascii="Times New Roman" ns0:hAnsi="Times New Roman" ns0:eastAsia="宋体"/>
+        <ns0:ind ns0:firstLine="475"/>
+        <ns0:spacing ns0:after="100" ns0:line="360" ns0:lineRule="auto"/>
+      </ns0:pPr>
+      <ns0:r>
+        <ns0:rPr>
           <ns0:b ns0:val="0"/>
+          <ns0:rFonts ns0:eastAsia="宋体"/>
+          <ns0:sz ns0:val="24"/>
+          <ns0:szCs ns0:val="24"/>
           <ns0:color ns0:val="000000"/>
-          <ns0:sz ns0:val="24"/>
         </ns0:rPr>
         <ns0:t>本项目覆盖以下十一项功能域：</ns0:t>
       </ns0:r>
     </ns0:p>
     <ns0:tbl>
       <ns0:tblPr>
-        <ns0:tblW ns0:type="auto" ns0:w="0"/>
+        <ns0:tblW ns0:type="dxa" ns0:w="9026"/>
         <ns0:jc ns0:val="center"/>
         <ns0:tblLayout ns0:type="fixed"/>
         <ns0:tblLook ns0:firstColumn="1" ns0:firstRow="1" ns0:lastColumn="0" ns0:lastRow="0" ns0:noHBand="0" ns0:noVBand="1" ns0:val="04A0"/>
@@ -1300,7 +1033,7 @@
         </ns0:tc>
         <ns0:tc>
           <ns0:tcPr>
-            <ns0:tcW ns0:type="dxa" ns0:w="6134"/>
+            <ns0:tcW ns0:type="dxa" ns0:w="6131"/>
             <ns0:vAlign ns0:val="center"/>
             <ns0:tcMar>
               <ns0:top ns0:w="90" ns0:type="dxa"/>
@@ -1387,7 +1120,7 @@
         </ns0:tc>
         <ns0:tc>
           <ns0:tcPr>
-            <ns0:tcW ns0:type="dxa" ns0:w="6134"/>
+            <ns0:tcW ns0:type="dxa" ns0:w="6131"/>
             <ns0:vAlign ns0:val="center"/>
             <ns0:tcMar>
               <ns0:top ns0:w="90" ns0:type="dxa"/>
@@ -1473,7 +1206,7 @@
         </ns0:tc>
         <ns0:tc>
           <ns0:tcPr>
-            <ns0:tcW ns0:type="dxa" ns0:w="6134"/>
+            <ns0:tcW ns0:type="dxa" ns0:w="6131"/>
             <ns0:vAlign ns0:val="center"/>
             <ns0:tcMar>
               <ns0:top ns0:w="90" ns0:type="dxa"/>
@@ -1559,7 +1292,7 @@
         </ns0:tc>
         <ns0:tc>
           <ns0:tcPr>
-            <ns0:tcW ns0:type="dxa" ns0:w="6134"/>
+            <ns0:tcW ns0:type="dxa" ns0:w="6131"/>
             <ns0:vAlign ns0:val="center"/>
             <ns0:tcMar>
               <ns0:top ns0:w="90" ns0:type="dxa"/>
@@ -1645,7 +1378,7 @@
         </ns0:tc>
         <ns0:tc>
           <ns0:tcPr>
-            <ns0:tcW ns0:type="dxa" ns0:w="6134"/>
+            <ns0:tcW ns0:type="dxa" ns0:w="6131"/>
             <ns0:vAlign ns0:val="center"/>
             <ns0:tcMar>
               <ns0:top ns0:w="90" ns0:type="dxa"/>
@@ -1731,7 +1464,7 @@
         </ns0:tc>
         <ns0:tc>
           <ns0:tcPr>
-            <ns0:tcW ns0:type="dxa" ns0:w="6134"/>
+            <ns0:tcW ns0:type="dxa" ns0:w="6131"/>
             <ns0:vAlign ns0:val="center"/>
             <ns0:tcMar>
               <ns0:top ns0:w="90" ns0:type="dxa"/>
@@ -1817,7 +1550,7 @@
         </ns0:tc>
         <ns0:tc>
           <ns0:tcPr>
-            <ns0:tcW ns0:type="dxa" ns0:w="6134"/>
+            <ns0:tcW ns0:type="dxa" ns0:w="6131"/>
             <ns0:vAlign ns0:val="center"/>
             <ns0:tcMar>
               <ns0:top ns0:w="90" ns0:type="dxa"/>
@@ -1903,7 +1636,7 @@
         </ns0:tc>
         <ns0:tc>
           <ns0:tcPr>
-            <ns0:tcW ns0:type="dxa" ns0:w="6134"/>
+            <ns0:tcW ns0:type="dxa" ns0:w="6131"/>
             <ns0:vAlign ns0:val="center"/>
             <ns0:tcMar>
               <ns0:top ns0:w="90" ns0:type="dxa"/>
@@ -1989,7 +1722,7 @@
         </ns0:tc>
         <ns0:tc>
           <ns0:tcPr>
-            <ns0:tcW ns0:type="dxa" ns0:w="6134"/>
+            <ns0:tcW ns0:type="dxa" ns0:w="6131"/>
             <ns0:vAlign ns0:val="center"/>
             <ns0:tcMar>
               <ns0:top ns0:w="90" ns0:type="dxa"/>
@@ -2075,7 +1808,7 @@
         </ns0:tc>
         <ns0:tc>
           <ns0:tcPr>
-            <ns0:tcW ns0:type="dxa" ns0:w="6134"/>
+            <ns0:tcW ns0:type="dxa" ns0:w="6131"/>
             <ns0:vAlign ns0:val="center"/>
             <ns0:tcMar>
               <ns0:top ns0:w="90" ns0:type="dxa"/>
@@ -2161,7 +1894,7 @@
         </ns0:tc>
         <ns0:tc>
           <ns0:tcPr>
-            <ns0:tcW ns0:type="dxa" ns0:w="6134"/>
+            <ns0:tcW ns0:type="dxa" ns0:w="6131"/>
             <ns0:vAlign ns0:val="center"/>
             <ns0:tcMar>
               <ns0:top ns0:w="90" ns0:type="dxa"/>
@@ -2247,7 +1980,7 @@
         </ns0:tc>
         <ns0:tc>
           <ns0:tcPr>
-            <ns0:tcW ns0:type="dxa" ns0:w="6134"/>
+            <ns0:tcW ns0:type="dxa" ns0:w="6131"/>
             <ns0:vAlign ns0:val="center"/>
             <ns0:tcMar>
               <ns0:top ns0:w="90" ns0:type="dxa"/>
@@ -2282,14 +2015,16 @@
     </ns0:p>
     <ns0:p>
       <ns0:pPr>
-        <ns0:widowControl/>
-      </ns0:pPr>
-      <ns0:r>
-        <ns0:rPr>
-          <ns0:rFonts ns0:ascii="Times New Roman" ns0:hAnsi="Times New Roman" ns0:eastAsia="宋体"/>
+        <ns0:ind ns0:firstLine="475"/>
+        <ns0:spacing ns0:after="100" ns0:line="360" ns0:lineRule="auto"/>
+      </ns0:pPr>
+      <ns0:r>
+        <ns0:rPr>
           <ns0:b ns0:val="0"/>
+          <ns0:rFonts ns0:eastAsia="宋体"/>
+          <ns0:sz ns0:val="24"/>
+          <ns0:szCs ns0:val="24"/>
           <ns0:color ns0:val="000000"/>
-          <ns0:sz ns0:val="24"/>
         </ns0:rPr>
         <ns0:t>交付范围包括 Web 端、H5 移动端、数据接口、配套部署、数据初始化、测试、文档、培训、试运行和服务。移动端固定采用 H5 嵌入甲方现有智慧管理 APP：乙方负责 H5 应用、H5 包、业务接口与必要适配，甲方负责宿主 APP、签名与发布。</ns0:t>
       </ns0:r>
@@ -2304,28 +2039,32 @@
     </ns0:p>
     <ns0:p>
       <ns0:pPr>
-        <ns0:widowControl/>
-      </ns0:pPr>
-      <ns0:r>
-        <ns0:rPr>
-          <ns0:rFonts ns0:ascii="Times New Roman" ns0:hAnsi="Times New Roman" ns0:eastAsia="宋体"/>
+        <ns0:ind ns0:firstLine="475"/>
+        <ns0:spacing ns0:after="100" ns0:line="360" ns0:lineRule="auto"/>
+      </ns0:pPr>
+      <ns0:r>
+        <ns0:rPr>
           <ns0:b ns0:val="0"/>
+          <ns0:rFonts ns0:eastAsia="宋体"/>
+          <ns0:sz ns0:val="24"/>
+          <ns0:szCs ns0:val="24"/>
           <ns0:color ns0:val="000000"/>
-          <ns0:sz ns0:val="24"/>
         </ns0:rPr>
         <ns0:t>视频监控、入侵报警、出入口控制、消防报警、广播、客流统计等既有系统自身建设或改造，以及其前端硬件；应急物资、安防终端、定位基站等实体物资；机房、服务器、网络等基础硬件采购；与政府应急平台的专线联网工程，均不属于本项目建设范围。重新测绘、从零制作三维场景、购买基础地图版权，以及正式第三方等级保护测评服务采购，也不计入默认范围。</ns0:t>
       </ns0:r>
     </ns0:p>
     <ns0:p>
       <ns0:pPr>
-        <ns0:widowControl/>
-      </ns0:pPr>
-      <ns0:r>
-        <ns0:rPr>
-          <ns0:rFonts ns0:ascii="Times New Roman" ns0:hAnsi="Times New Roman" ns0:eastAsia="宋体"/>
+        <ns0:ind ns0:firstLine="475"/>
+        <ns0:spacing ns0:after="100" ns0:line="360" ns0:lineRule="auto"/>
+      </ns0:pPr>
+      <ns0:r>
+        <ns0:rPr>
           <ns0:b ns0:val="0"/>
+          <ns0:rFonts ns0:eastAsia="宋体"/>
+          <ns0:sz ns0:val="24"/>
+          <ns0:szCs ns0:val="24"/>
           <ns0:color ns0:val="000000"/>
-          <ns0:sz ns0:val="24"/>
         </ns0:rPr>
         <ns0:t>范围外不等于不集成。本项目仍负责既有系统在本系统范围内的接口适配、联调、容错、验证和软件交付；例如视频历史回放为强制响应项，但录像产生、存储和不低于 30 天保存由既有视频系统负责。</ns0:t>
       </ns0:r>
@@ -2333,8 +2072,12 @@
     <ns0:p>
       <ns0:pPr>
         <ns0:pStyle ns0:val="1"/>
-      </ns0:pPr>
-      <ns0:r>
+        <ns0:spacing ns0:before="240" ns0:after="160"/>
+      </ns0:pPr>
+      <ns0:r>
+        <ns0:rPr>
+          <ns0:rFonts ns0:eastAsia="黑体"/>
+        </ns0:rPr>
         <ns0:t>3 初步总体方案</ns0:t>
       </ns0:r>
     </ns0:p>
@@ -2354,7 +2097,7 @@
       <ns0:r>
         <ns0:drawing>
           <wp:inline xmlns:wp="http://schemas.openxmlformats.org/drawingml/2006/wordprocessingDrawing" xmlns:a="http://schemas.openxmlformats.org/drawingml/2006/main" xmlns:pic="http://schemas.openxmlformats.org/drawingml/2006/picture">
-            <wp:extent cx="5760000" cy="2160000"/>
+            <wp:extent cx="5580000" cy="2092500"/>
             <wp:docPr id="2" name="Picture 2"/>
             <wp:cNvGraphicFramePr>
               <a:graphicFrameLocks noChangeAspect="1"/>
@@ -2375,7 +2118,7 @@
                   <pic:spPr>
                     <a:xfrm>
                       <a:off x="0" y="0"/>
-                      <a:ext cx="5760000" cy="2160000"/>
+                      <a:ext cx="5580000" cy="2092500"/>
                     </a:xfrm>
                     <a:prstGeom prst="rect"/>
                   </pic:spPr>
@@ -2391,19 +2134,26 @@
         <ns0:jc ns0:val="center"/>
       </ns0:pPr>
       <ns0:r>
+        <ns0:rPr>
+          <ns0:rFonts ns0:eastAsia="黑体"/>
+          <ns0:sz ns0:val="18"/>
+          <ns0:color ns0:val="000000"/>
+        </ns0:rPr>
         <ns0:t>图 3-1 建设内容分层结构</ns0:t>
       </ns0:r>
     </ns0:p>
     <ns0:p>
       <ns0:pPr>
-        <ns0:widowControl/>
-      </ns0:pPr>
-      <ns0:r>
-        <ns0:rPr>
-          <ns0:rFonts ns0:ascii="Times New Roman" ns0:hAnsi="Times New Roman" ns0:eastAsia="宋体"/>
+        <ns0:ind ns0:firstLine="475"/>
+        <ns0:spacing ns0:after="100" ns0:line="360" ns0:lineRule="auto"/>
+      </ns0:pPr>
+      <ns0:r>
+        <ns0:rPr>
           <ns0:b ns0:val="0"/>
+          <ns0:rFonts ns0:eastAsia="宋体"/>
+          <ns0:sz ns0:val="24"/>
+          <ns0:szCs ns0:val="24"/>
           <ns0:color ns0:val="000000"/>
-          <ns0:sz ns0:val="24"/>
         </ns0:rPr>
         <ns0:t>依据已完成的 总体技术方案 V0.6 稳定结论，初步总体方案采用展现与接入、应急应用服务、支撑与数据、甲方既有系统与环境之间的分层结构，以应急业务闭环组织 Web、H5、指挥大屏、业务服务、数据能力和外部系统适配。系统部署于甲方私有环境，支持容器化交付和隔离网络环境安装；对外采用标准 REST API 并交付 OpenAPI 3.0 文档，视频接口遵循 GB/T 28181 等已冻结要求。逻辑分层不强制采用大量微服务，具体部署形态应结合甲方资源与运维能力确定，同时保持业务边界、适配边界和数据责任不变。</ns0:t>
       </ns0:r>
@@ -2418,28 +2168,32 @@
     </ns0:p>
     <ns0:p>
       <ns0:pPr>
-        <ns0:widowControl/>
-      </ns0:pPr>
-      <ns0:r>
-        <ns0:rPr>
-          <ns0:rFonts ns0:ascii="Times New Roman" ns0:hAnsi="Times New Roman" ns0:eastAsia="宋体"/>
+        <ns0:ind ns0:firstLine="475"/>
+        <ns0:spacing ns0:after="100" ns0:line="360" ns0:lineRule="auto"/>
+      </ns0:pPr>
+      <ns0:r>
+        <ns0:rPr>
           <ns0:b ns0:val="0"/>
+          <ns0:rFonts ns0:eastAsia="宋体"/>
+          <ns0:sz ns0:val="24"/>
+          <ns0:szCs ns0:val="24"/>
           <ns0:color ns0:val="000000"/>
-          <ns0:sz ns0:val="24"/>
         </ns0:rPr>
         <ns0:t>事件发现或上报 → 核实审批 → 预案启动 → 通知与任务下发 → 指挥调度 → 移动处置与反馈 → 事件关闭、评估与调查，构成本项目的核心业务闭环。预案、人员、物资、值班、演练、视频、地图与消息能力为该闭环提供日常数据和协同支撑。</ns0:t>
       </ns0:r>
     </ns0:p>
     <ns0:p>
       <ns0:pPr>
-        <ns0:widowControl/>
-      </ns0:pPr>
-      <ns0:r>
-        <ns0:rPr>
-          <ns0:rFonts ns0:ascii="Times New Roman" ns0:hAnsi="Times New Roman" ns0:eastAsia="宋体"/>
+        <ns0:ind ns0:firstLine="475"/>
+        <ns0:spacing ns0:after="100" ns0:line="360" ns0:lineRule="auto"/>
+      </ns0:pPr>
+      <ns0:r>
+        <ns0:rPr>
           <ns0:b ns0:val="0"/>
+          <ns0:rFonts ns0:eastAsia="宋体"/>
+          <ns0:sz ns0:val="24"/>
+          <ns0:szCs ns0:val="24"/>
           <ns0:color ns0:val="000000"/>
-          <ns0:sz ns0:val="24"/>
         </ns0:rPr>
         <ns0:t>既有视频、人员定位、信息发布、入侵报警、出入口控制、消防报警、物联网平台、统一业务运行中台、统一消息/短信平台、地图与空间数据、服务器网络和基础业务数据均由甲方按冻结责任边界提供基础能力、资料、账号、环境或协调窗口；乙方负责本系统的软件建设及逐接口适配、联调、容错、降级、验证与交付。</ns0:t>
       </ns0:r>
@@ -2455,358 +2209,382 @@
     <ns0:p>
       <ns0:pPr>
         <ns0:pStyle ns0:val="a4"/>
-        <ns0:widowControl/>
-      </ns0:pPr>
-      <ns0:r>
-        <ns0:rPr>
-          <ns0:rFonts ns0:ascii="Times New Roman" ns0:hAnsi="Times New Roman" ns0:eastAsia="宋体"/>
+        <ns0:spacing ns0:after="60" ns0:line="360" ns0:lineRule="auto"/>
+      </ns0:pPr>
+      <ns0:r>
+        <ns0:rPr>
           <ns0:b ns0:val="0"/>
+          <ns0:rFonts ns0:eastAsia="宋体"/>
+          <ns0:sz ns0:val="24"/>
+          <ns0:szCs ns0:val="24"/>
+        </ns0:rPr>
+        <ns0:t xml:space="preserve">• </ns0:t>
+      </ns0:r>
+      <ns0:r>
+        <ns0:rPr>
+          <ns0:b ns0:val="0"/>
+          <ns0:rFonts ns0:eastAsia="宋体"/>
+          <ns0:sz ns0:val="24"/>
+          <ns0:szCs ns0:val="24"/>
+        </ns0:rPr>
+        <ns0:t>视频历史回放按强制要求响应，乙方不新建录像存储系统。</ns0:t>
+      </ns0:r>
+    </ns0:p>
+    <ns0:p>
+      <ns0:pPr>
+        <ns0:pStyle ns0:val="a4"/>
+        <ns0:spacing ns0:after="60" ns0:line="360" ns0:lineRule="auto"/>
+      </ns0:pPr>
+      <ns0:r>
+        <ns0:rPr>
+          <ns0:b ns0:val="0"/>
+          <ns0:rFonts ns0:eastAsia="宋体"/>
+          <ns0:sz ns0:val="24"/>
+          <ns0:szCs ns0:val="24"/>
+        </ns0:rPr>
+        <ns0:t xml:space="preserve">• </ns0:t>
+      </ns0:r>
+      <ns0:r>
+        <ns0:rPr>
+          <ns0:b ns0:val="0"/>
+          <ns0:rFonts ns0:eastAsia="宋体"/>
+          <ns0:sz ns0:val="24"/>
+          <ns0:szCs ns0:val="24"/>
+        </ns0:rPr>
+        <ns0:t>人员定位由甲方提供源数据和验收能力，乙方负责接入、关联、映射、展示和刷新，不降低源精度。</ns0:t>
+      </ns0:r>
+    </ns0:p>
+    <ns0:p>
+      <ns0:pPr>
+        <ns0:pStyle ns0:val="a4"/>
+        <ns0:spacing ns0:after="60" ns0:line="360" ns0:lineRule="auto"/>
+      </ns0:pPr>
+      <ns0:r>
+        <ns0:rPr>
+          <ns0:b ns0:val="0"/>
+          <ns0:rFonts ns0:eastAsia="宋体"/>
+          <ns0:sz ns0:val="24"/>
+          <ns0:szCs ns0:val="24"/>
+        </ns0:rPr>
+        <ns0:t xml:space="preserve">• </ns0:t>
+      </ns0:r>
+      <ns0:r>
+        <ns0:rPr>
+          <ns0:b ns0:val="0"/>
+          <ns0:rFonts ns0:eastAsia="宋体"/>
+          <ns0:sz ns0:val="24"/>
+          <ns0:szCs ns0:val="24"/>
+        </ns0:rPr>
+        <ns0:t>疏散门禁联动按“应支持”响应，由授权人员确认后执行，服从既有安全联锁；失败时告警并转人工处置或降级。</ns0:t>
+      </ns0:r>
+    </ns0:p>
+    <ns0:p>
+      <ns0:pPr>
+        <ns0:pStyle ns0:val="a4"/>
+        <ns0:spacing ns0:after="60" ns0:line="360" ns0:lineRule="auto"/>
+      </ns0:pPr>
+      <ns0:r>
+        <ns0:rPr>
+          <ns0:b ns0:val="0"/>
+          <ns0:rFonts ns0:eastAsia="宋体"/>
+          <ns0:sz ns0:val="24"/>
+          <ns0:szCs ns0:val="24"/>
+        </ns0:rPr>
+        <ns0:t xml:space="preserve">• </ns0:t>
+      </ns0:r>
+      <ns0:r>
+        <ns0:rPr>
+          <ns0:b ns0:val="0"/>
+          <ns0:rFonts ns0:eastAsia="宋体"/>
+          <ns0:sz ns0:val="24"/>
+          <ns0:szCs ns0:val="24"/>
+        </ns0:rPr>
+        <ns0:t>统一中台的身份、组织、权限、消息、工作流、文件、门户和数据汇聚等通用能力由甲方既有平台提供，乙方不重复建设。</ns0:t>
+      </ns0:r>
+    </ns0:p>
+    <ns0:p>
+      <ns0:pPr>
+        <ns0:ind ns0:firstLine="475"/>
+        <ns0:spacing ns0:after="100" ns0:line="360" ns0:lineRule="auto"/>
+      </ns0:pPr>
+      <ns0:r>
+        <ns0:rPr>
+          <ns0:b ns0:val="0"/>
+          <ns0:rFonts ns0:eastAsia="宋体"/>
+          <ns0:sz ns0:val="24"/>
+          <ns0:szCs ns0:val="24"/>
           <ns0:color ns0:val="000000"/>
-          <ns0:sz ns0:val="24"/>
+        </ns0:rPr>
+        <ns0:t>本建议书所称 12 项澄清，均为甲方/招标人（课程模拟）就本课程模拟项目形成的书面裁决。其作用是解决课程模拟中的需求歧义，并作为当前编标基线 的解释依据；这些裁决不代表真实甲方出具的正式法律文件。</ns0:t>
+      </ns0:r>
+    </ns0:p>
+    <ns0:p>
+      <ns0:pPr>
+        <ns0:ind ns0:firstLine="475"/>
+        <ns0:spacing ns0:after="100" ns0:line="360" ns0:lineRule="auto"/>
+      </ns0:pPr>
+      <ns0:r>
+        <ns0:rPr>
+          <ns0:b ns0:val="0"/>
+          <ns0:rFonts ns0:eastAsia="宋体"/>
+          <ns0:sz ns0:val="24"/>
+          <ns0:szCs ns0:val="24"/>
+          <ns0:color ns0:val="000000"/>
+        </ns0:rPr>
+        <ns0:t>以上仅明确已冻结的业务与责任边界，不构成对具体技术产品或实现方式的预先承诺。</ns0:t>
+      </ns0:r>
+    </ns0:p>
+    <ns0:p>
+      <ns0:pPr>
+        <ns0:pStyle ns0:val="1"/>
+        <ns0:spacing ns0:before="240" ns0:after="160"/>
+      </ns0:pPr>
+      <ns0:r>
+        <ns0:rPr>
+          <ns0:rFonts ns0:eastAsia="黑体"/>
+        </ns0:rPr>
+        <ns0:t>4 初步实施思路</ns0:t>
+      </ns0:r>
+    </ns0:p>
+    <ns0:p>
+      <ns0:pPr>
+        <ns0:ind ns0:firstLine="475"/>
+        <ns0:spacing ns0:after="100" ns0:line="360" ns0:lineRule="auto"/>
+      </ns0:pPr>
+      <ns0:r>
+        <ns0:rPr>
+          <ns0:b ns0:val="0"/>
+          <ns0:rFonts ns0:eastAsia="宋体"/>
+          <ns0:sz ns0:val="24"/>
+          <ns0:szCs ns0:val="24"/>
+          <ns0:color ns0:val="000000"/>
+        </ns0:rPr>
+        <ns0:t>项目按原始用户需求书的 M1 需求确认、M2 设计评审、M3 初验、M4 试运行、M5 竣工验收等正式里程碑执行，具体 WBS、资源安排与内部排期由 后续项目计划 展开。</ns0:t>
+      </ns0:r>
+    </ns0:p>
+    <ns0:p>
+      <ns0:pPr>
+        <ns0:ind ns0:firstLine="475"/>
+        <ns0:spacing ns0:after="100" ns0:line="360" ns0:lineRule="auto"/>
+      </ns0:pPr>
+      <ns0:r>
+        <ns0:rPr>
+          <ns0:b ns0:val="0"/>
+          <ns0:rFonts ns0:eastAsia="宋体"/>
+          <ns0:sz ns0:val="24"/>
+          <ns0:szCs ns0:val="24"/>
+          <ns0:color ns0:val="000000"/>
+        </ns0:rPr>
+        <ns0:t>建议在需求确认和设计阶段同步落实接口资料、测试账号、联调环境、地图与基础数据、部署条件等前置资源。视频监控和统一消息通道须在 M2 设计评审前完成连通性验证。数据初始化由甲方提供并确认真实业务源数据，乙方完成模板、映射、清洗、转换、导入和技术校验，最终成果由双方确认。</ns0:t>
+      </ns0:r>
+    </ns0:p>
+    <ns0:p>
+      <ns0:pPr>
+        <ns0:pStyle ns0:val="1"/>
+        <ns0:spacing ns0:before="240" ns0:after="160"/>
+      </ns0:pPr>
+      <ns0:r>
+        <ns0:rPr>
+          <ns0:rFonts ns0:eastAsia="黑体"/>
+        </ns0:rPr>
+        <ns0:t>5 项目价值与可行性分析</ns0:t>
+      </ns0:r>
+    </ns0:p>
+    <ns0:p>
+      <ns0:pPr>
+        <ns0:pStyle ns0:val="2"/>
+      </ns0:pPr>
+      <ns0:r>
+        <ns0:t>5.1 预期业务价值</ns0:t>
+      </ns0:r>
+    </ns0:p>
+    <ns0:p>
+      <ns0:pPr>
+        <ns0:pStyle ns0:val="a4"/>
+        <ns0:spacing ns0:after="60" ns0:line="360" ns0:lineRule="auto"/>
+      </ns0:pPr>
+      <ns0:r>
+        <ns0:rPr>
+          <ns0:b ns0:val="0"/>
+          <ns0:rFonts ns0:eastAsia="宋体"/>
+          <ns0:sz ns0:val="24"/>
+          <ns0:szCs ns0:val="24"/>
         </ns0:rPr>
         <ns0:t xml:space="preserve">• </ns0:t>
       </ns0:r>
       <ns0:r>
         <ns0:rPr>
-          <ns0:rFonts ns0:ascii="Times New Roman" ns0:hAnsi="Times New Roman" ns0:eastAsia="宋体"/>
+          <ns0:b/>
+          <ns0:rFonts ns0:eastAsia="宋体"/>
+          <ns0:sz ns0:val="24"/>
+          <ns0:szCs ns0:val="24"/>
+        </ns0:rPr>
+        <ns0:t>应急响应价值。</ns0:t>
+      </ns0:r>
+      <ns0:r>
+        <ns0:rPr>
           <ns0:b ns0:val="0"/>
+          <ns0:rFonts ns0:eastAsia="宋体"/>
+          <ns0:sz ns0:val="24"/>
+          <ns0:szCs ns0:val="24"/>
+        </ns0:rPr>
+        <ns0:t xml:space="preserve"> 将预案启动、通知、任务下发、现场反馈和关闭评估连成可追踪的流程，降低依赖分散记录和逐级电话协调带来的信息断点。</ns0:t>
+      </ns0:r>
+    </ns0:p>
+    <ns0:p>
+      <ns0:pPr>
+        <ns0:pStyle ns0:val="a4"/>
+        <ns0:spacing ns0:after="60" ns0:line="360" ns0:lineRule="auto"/>
+      </ns0:pPr>
+      <ns0:r>
+        <ns0:rPr>
+          <ns0:b ns0:val="0"/>
+          <ns0:rFonts ns0:eastAsia="宋体"/>
+          <ns0:sz ns0:val="24"/>
+          <ns0:szCs ns0:val="24"/>
+        </ns0:rPr>
+        <ns0:t xml:space="preserve">• </ns0:t>
+      </ns0:r>
+      <ns0:r>
+        <ns0:rPr>
+          <ns0:b/>
+          <ns0:rFonts ns0:eastAsia="宋体"/>
+          <ns0:sz ns0:val="24"/>
+          <ns0:szCs ns0:val="24"/>
+        </ns0:rPr>
+        <ns0:t>指挥协同价值。</ns0:t>
+      </ns0:r>
+      <ns0:r>
+        <ns0:rPr>
+          <ns0:b ns0:val="0"/>
+          <ns0:rFonts ns0:eastAsia="宋体"/>
+          <ns0:sz ns0:val="24"/>
+          <ns0:szCs ns0:val="24"/>
+        </ns0:rPr>
+        <ns0:t xml:space="preserve"> 围绕事件发生地汇聚人员、视频、物资和任务进展，为指挥人员提供统一态势入口，而不改变既有安防系统的建设责任。</ns0:t>
+      </ns0:r>
+    </ns0:p>
+    <ns0:p>
+      <ns0:pPr>
+        <ns0:pStyle ns0:val="a4"/>
+        <ns0:spacing ns0:after="60" ns0:line="360" ns0:lineRule="auto"/>
+      </ns0:pPr>
+      <ns0:r>
+        <ns0:rPr>
+          <ns0:b ns0:val="0"/>
+          <ns0:rFonts ns0:eastAsia="宋体"/>
+          <ns0:sz ns0:val="24"/>
+          <ns0:szCs ns0:val="24"/>
+        </ns0:rPr>
+        <ns0:t xml:space="preserve">• </ns0:t>
+      </ns0:r>
+      <ns0:r>
+        <ns0:rPr>
+          <ns0:b/>
+          <ns0:rFonts ns0:eastAsia="宋体"/>
+          <ns0:sz ns0:val="24"/>
+          <ns0:szCs ns0:val="24"/>
+        </ns0:rPr>
+        <ns0:t>平战结合价值。</ns0:t>
+      </ns0:r>
+      <ns0:r>
+        <ns0:rPr>
+          <ns0:b ns0:val="0"/>
+          <ns0:rFonts ns0:eastAsia="宋体"/>
+          <ns0:sz ns0:val="24"/>
+          <ns0:szCs ns0:val="24"/>
+        </ns0:rPr>
+        <ns0:t xml:space="preserve"> 预案维护、资源台账、值班打卡、演练评估等日常工作持续积累可用于事件处置的基础数据和经验。</ns0:t>
+      </ns0:r>
+    </ns0:p>
+    <ns0:p>
+      <ns0:pPr>
+        <ns0:pStyle ns0:val="a4"/>
+        <ns0:spacing ns0:after="60" ns0:line="360" ns0:lineRule="auto"/>
+      </ns0:pPr>
+      <ns0:r>
+        <ns0:rPr>
+          <ns0:b ns0:val="0"/>
+          <ns0:rFonts ns0:eastAsia="宋体"/>
+          <ns0:sz ns0:val="24"/>
+          <ns0:szCs ns0:val="24"/>
+        </ns0:rPr>
+        <ns0:t xml:space="preserve">• </ns0:t>
+      </ns0:r>
+      <ns0:r>
+        <ns0:rPr>
+          <ns0:b/>
+          <ns0:rFonts ns0:eastAsia="宋体"/>
+          <ns0:sz ns0:val="24"/>
+          <ns0:szCs ns0:val="24"/>
+        </ns0:rPr>
+        <ns0:t>管理规范与留痕价值。</ns0:t>
+      </ns0:r>
+      <ns0:r>
+        <ns0:rPr>
+          <ns0:b ns0:val="0"/>
+          <ns0:rFonts ns0:eastAsia="宋体"/>
+          <ns0:sz ns0:val="24"/>
+          <ns0:szCs ns0:val="24"/>
+        </ns0:rPr>
+        <ns0:t xml:space="preserve"> 事件、任务、审批、反馈、演练、评估与调查的结构化记录，有助于事后复盘、预案修订和持续改进。</ns0:t>
+      </ns0:r>
+    </ns0:p>
+    <ns0:p>
+      <ns0:pPr>
+        <ns0:ind ns0:firstLine="475"/>
+        <ns0:spacing ns0:after="100" ns0:line="360" ns0:lineRule="auto"/>
+      </ns0:pPr>
+      <ns0:r>
+        <ns0:rPr>
+          <ns0:b ns0:val="0"/>
+          <ns0:rFonts ns0:eastAsia="宋体"/>
+          <ns0:sz ns0:val="24"/>
+          <ns0:szCs ns0:val="24"/>
           <ns0:color ns0:val="000000"/>
-          <ns0:sz ns0:val="24"/>
-        </ns0:rPr>
-        <ns0:t>视频历史回放按强制要求响应，乙方不新建录像存储系统。</ns0:t>
-      </ns0:r>
-    </ns0:p>
-    <ns0:p>
-      <ns0:pPr>
-        <ns0:pStyle ns0:val="a4"/>
-        <ns0:widowControl/>
-      </ns0:pPr>
-      <ns0:r>
-        <ns0:rPr>
-          <ns0:rFonts ns0:ascii="Times New Roman" ns0:hAnsi="Times New Roman" ns0:eastAsia="宋体"/>
+        </ns0:rPr>
+        <ns0:t>本建议书不作无来源的成本节约、效率提升或收益比例承诺。</ns0:t>
+      </ns0:r>
+    </ns0:p>
+    <ns0:p>
+      <ns0:pPr>
+        <ns0:pStyle ns0:val="2"/>
+      </ns0:pPr>
+      <ns0:r>
+        <ns0:t>5.2 可行性基础</ns0:t>
+      </ns0:r>
+    </ns0:p>
+    <ns0:p>
+      <ns0:pPr>
+        <ns0:ind ns0:firstLine="475"/>
+        <ns0:spacing ns0:after="100" ns0:line="360" ns0:lineRule="auto"/>
+      </ns0:pPr>
+      <ns0:r>
+        <ns0:rPr>
           <ns0:b ns0:val="0"/>
+          <ns0:rFonts ns0:eastAsia="宋体"/>
+          <ns0:sz ns0:val="24"/>
+          <ns0:szCs ns0:val="24"/>
           <ns0:color ns0:val="000000"/>
-          <ns0:sz ns0:val="24"/>
-        </ns0:rPr>
-        <ns0:t xml:space="preserve">• </ns0:t>
-      </ns0:r>
-      <ns0:r>
-        <ns0:rPr>
-          <ns0:rFonts ns0:ascii="Times New Roman" ns0:hAnsi="Times New Roman" ns0:eastAsia="宋体"/>
-          <ns0:b ns0:val="0"/>
-          <ns0:color ns0:val="000000"/>
-          <ns0:sz ns0:val="24"/>
-        </ns0:rPr>
-        <ns0:t>人员定位由甲方提供源数据和验收能力，乙方负责接入、关联、映射、展示和刷新，不降低源精度。</ns0:t>
-      </ns0:r>
-    </ns0:p>
-    <ns0:p>
-      <ns0:pPr>
-        <ns0:pStyle ns0:val="a4"/>
-        <ns0:widowControl/>
-      </ns0:pPr>
-      <ns0:r>
-        <ns0:rPr>
-          <ns0:rFonts ns0:ascii="Times New Roman" ns0:hAnsi="Times New Roman" ns0:eastAsia="宋体"/>
-          <ns0:b ns0:val="0"/>
-          <ns0:color ns0:val="000000"/>
-          <ns0:sz ns0:val="24"/>
-        </ns0:rPr>
-        <ns0:t xml:space="preserve">• </ns0:t>
-      </ns0:r>
-      <ns0:r>
-        <ns0:rPr>
-          <ns0:rFonts ns0:ascii="Times New Roman" ns0:hAnsi="Times New Roman" ns0:eastAsia="宋体"/>
-          <ns0:b ns0:val="0"/>
-          <ns0:color ns0:val="000000"/>
-          <ns0:sz ns0:val="24"/>
-        </ns0:rPr>
-        <ns0:t>疏散门禁联动按“应支持”响应，由授权人员确认后执行，服从既有安全联锁；失败时告警并转人工处置或降级。</ns0:t>
-      </ns0:r>
-    </ns0:p>
-    <ns0:p>
-      <ns0:pPr>
-        <ns0:pStyle ns0:val="a4"/>
-        <ns0:widowControl/>
-      </ns0:pPr>
-      <ns0:r>
-        <ns0:rPr>
-          <ns0:rFonts ns0:ascii="Times New Roman" ns0:hAnsi="Times New Roman" ns0:eastAsia="宋体"/>
-          <ns0:b ns0:val="0"/>
-          <ns0:color ns0:val="000000"/>
-          <ns0:sz ns0:val="24"/>
-        </ns0:rPr>
-        <ns0:t xml:space="preserve">• </ns0:t>
-      </ns0:r>
-      <ns0:r>
-        <ns0:rPr>
-          <ns0:rFonts ns0:ascii="Times New Roman" ns0:hAnsi="Times New Roman" ns0:eastAsia="宋体"/>
-          <ns0:b ns0:val="0"/>
-          <ns0:color ns0:val="000000"/>
-          <ns0:sz ns0:val="24"/>
-        </ns0:rPr>
-        <ns0:t>统一中台的身份、组织、权限、消息、工作流、文件、门户和数据汇聚等通用能力由甲方既有平台提供，乙方不重复建设。</ns0:t>
-      </ns0:r>
-    </ns0:p>
-    <ns0:p>
-      <ns0:pPr>
-        <ns0:widowControl/>
-      </ns0:pPr>
-      <ns0:r>
-        <ns0:rPr>
-          <ns0:rFonts ns0:ascii="Times New Roman" ns0:hAnsi="Times New Roman" ns0:eastAsia="宋体"/>
-          <ns0:b ns0:val="0"/>
-          <ns0:color ns0:val="000000"/>
-          <ns0:sz ns0:val="24"/>
-        </ns0:rPr>
-        <ns0:t>本建议书所称 12 项澄清，均为甲方/招标人（课程模拟）就本课程模拟项目形成的书面裁决。其作用是解决课程模拟中的需求歧义，并作为当前编标基线 的解释依据；这些裁决不代表真实甲方出具的正式法律文件。</ns0:t>
-      </ns0:r>
-    </ns0:p>
-    <ns0:p>
-      <ns0:pPr>
-        <ns0:widowControl/>
-      </ns0:pPr>
-      <ns0:r>
-        <ns0:rPr>
-          <ns0:rFonts ns0:ascii="Times New Roman" ns0:hAnsi="Times New Roman" ns0:eastAsia="宋体"/>
-          <ns0:b ns0:val="0"/>
-          <ns0:color ns0:val="000000"/>
-          <ns0:sz ns0:val="24"/>
-        </ns0:rPr>
-        <ns0:t>以上仅明确已冻结的业务与责任边界，不构成对具体技术产品或实现方式的预先承诺。</ns0:t>
+        </ns0:rPr>
+        <ns0:t>项目具备明确的业务目标、功能范围、验收指标和既有系统融合边界；甲方既有基础系统、私有部署环境、地图与业务数据等外部条件，以及乙方的软件适配、联调和验证责任，均已在基线中明确。实施可行性仍依赖接口资料、账号权限、联调窗口、环境容量与基础数据按计划提供，并应通过后续技术验证、计划与风险管理持续控制。</ns0:t>
       </ns0:r>
     </ns0:p>
     <ns0:p>
       <ns0:pPr>
         <ns0:pStyle ns0:val="1"/>
-      </ns0:pPr>
-      <ns0:r>
-        <ns0:t>4 初步实施思路</ns0:t>
-      </ns0:r>
-    </ns0:p>
-    <ns0:p>
-      <ns0:pPr>
-        <ns0:widowControl/>
-      </ns0:pPr>
-      <ns0:r>
-        <ns0:rPr>
-          <ns0:rFonts ns0:ascii="Times New Roman" ns0:hAnsi="Times New Roman" ns0:eastAsia="宋体"/>
-          <ns0:b ns0:val="0"/>
-          <ns0:color ns0:val="000000"/>
-          <ns0:sz ns0:val="24"/>
-        </ns0:rPr>
-        <ns0:t>项目按原始用户需求书的 M1 需求确认、M2 设计评审、M3 初验、M4 试运行、M5 竣工验收等正式里程碑执行，具体 WBS、资源安排与内部排期由 后续项目计划 展开。</ns0:t>
-      </ns0:r>
-    </ns0:p>
-    <ns0:p>
-      <ns0:pPr>
-        <ns0:widowControl/>
-      </ns0:pPr>
-      <ns0:r>
-        <ns0:rPr>
-          <ns0:rFonts ns0:ascii="Times New Roman" ns0:hAnsi="Times New Roman" ns0:eastAsia="宋体"/>
-          <ns0:b ns0:val="0"/>
-          <ns0:color ns0:val="000000"/>
-          <ns0:sz ns0:val="24"/>
-        </ns0:rPr>
-        <ns0:t>建议在需求确认和设计阶段同步落实接口资料、测试账号、联调环境、地图与基础数据、部署条件等前置资源。视频监控和统一消息通道须在 M2 设计评审前完成连通性验证。数据初始化由甲方提供并确认真实业务源数据，乙方完成模板、映射、清洗、转换、导入和技术校验，最终成果由双方确认。</ns0:t>
-      </ns0:r>
-    </ns0:p>
-    <ns0:p>
-      <ns0:pPr>
-        <ns0:pStyle ns0:val="1"/>
-      </ns0:pPr>
-      <ns0:r>
-        <ns0:t>5 项目价值与可行性分析</ns0:t>
-      </ns0:r>
-    </ns0:p>
-    <ns0:p>
-      <ns0:pPr>
-        <ns0:pStyle ns0:val="2"/>
-      </ns0:pPr>
-      <ns0:r>
-        <ns0:t>5.1 预期业务价值</ns0:t>
-      </ns0:r>
-    </ns0:p>
-    <ns0:p>
-      <ns0:pPr>
-        <ns0:pStyle ns0:val="a4"/>
-        <ns0:widowControl/>
-      </ns0:pPr>
-      <ns0:r>
-        <ns0:rPr>
-          <ns0:rFonts ns0:ascii="Times New Roman" ns0:hAnsi="Times New Roman" ns0:eastAsia="宋体"/>
-          <ns0:b ns0:val="0"/>
-          <ns0:color ns0:val="000000"/>
-          <ns0:sz ns0:val="24"/>
-        </ns0:rPr>
-        <ns0:t xml:space="preserve">• </ns0:t>
-      </ns0:r>
-      <ns0:r>
-        <ns0:rPr>
-          <ns0:rFonts ns0:ascii="Times New Roman" ns0:hAnsi="Times New Roman" ns0:eastAsia="宋体"/>
-          <ns0:b/>
-          <ns0:color ns0:val="000000"/>
-          <ns0:sz ns0:val="24"/>
-        </ns0:rPr>
-        <ns0:t>应急响应价值。</ns0:t>
-      </ns0:r>
-      <ns0:r>
-        <ns0:rPr>
-          <ns0:rFonts ns0:ascii="Times New Roman" ns0:hAnsi="Times New Roman" ns0:eastAsia="宋体"/>
-          <ns0:b ns0:val="0"/>
-          <ns0:color ns0:val="000000"/>
-          <ns0:sz ns0:val="24"/>
-        </ns0:rPr>
-        <ns0:t xml:space="preserve"> 将预案启动、通知、任务下发、现场反馈和关闭评估连成可追踪的流程，降低依赖分散记录和逐级电话协调带来的信息断点。</ns0:t>
-      </ns0:r>
-    </ns0:p>
-    <ns0:p>
-      <ns0:pPr>
-        <ns0:pStyle ns0:val="a4"/>
-        <ns0:widowControl/>
-      </ns0:pPr>
-      <ns0:r>
-        <ns0:rPr>
-          <ns0:rFonts ns0:ascii="Times New Roman" ns0:hAnsi="Times New Roman" ns0:eastAsia="宋体"/>
-          <ns0:b ns0:val="0"/>
-          <ns0:color ns0:val="000000"/>
-          <ns0:sz ns0:val="24"/>
-        </ns0:rPr>
-        <ns0:t xml:space="preserve">• </ns0:t>
-      </ns0:r>
-      <ns0:r>
-        <ns0:rPr>
-          <ns0:rFonts ns0:ascii="Times New Roman" ns0:hAnsi="Times New Roman" ns0:eastAsia="宋体"/>
-          <ns0:b/>
-          <ns0:color ns0:val="000000"/>
-          <ns0:sz ns0:val="24"/>
-        </ns0:rPr>
-        <ns0:t>指挥协同价值。</ns0:t>
-      </ns0:r>
-      <ns0:r>
-        <ns0:rPr>
-          <ns0:rFonts ns0:ascii="Times New Roman" ns0:hAnsi="Times New Roman" ns0:eastAsia="宋体"/>
-          <ns0:b ns0:val="0"/>
-          <ns0:color ns0:val="000000"/>
-          <ns0:sz ns0:val="24"/>
-        </ns0:rPr>
-        <ns0:t xml:space="preserve"> 围绕事件发生地汇聚人员、视频、物资和任务进展，为指挥人员提供统一态势入口，而不改变既有安防系统的建设责任。</ns0:t>
-      </ns0:r>
-    </ns0:p>
-    <ns0:p>
-      <ns0:pPr>
-        <ns0:pStyle ns0:val="a4"/>
-        <ns0:widowControl/>
-      </ns0:pPr>
-      <ns0:r>
-        <ns0:rPr>
-          <ns0:rFonts ns0:ascii="Times New Roman" ns0:hAnsi="Times New Roman" ns0:eastAsia="宋体"/>
-          <ns0:b ns0:val="0"/>
-          <ns0:color ns0:val="000000"/>
-          <ns0:sz ns0:val="24"/>
-        </ns0:rPr>
-        <ns0:t xml:space="preserve">• </ns0:t>
-      </ns0:r>
-      <ns0:r>
-        <ns0:rPr>
-          <ns0:rFonts ns0:ascii="Times New Roman" ns0:hAnsi="Times New Roman" ns0:eastAsia="宋体"/>
-          <ns0:b/>
-          <ns0:color ns0:val="000000"/>
-          <ns0:sz ns0:val="24"/>
-        </ns0:rPr>
-        <ns0:t>平战结合价值。</ns0:t>
-      </ns0:r>
-      <ns0:r>
-        <ns0:rPr>
-          <ns0:rFonts ns0:ascii="Times New Roman" ns0:hAnsi="Times New Roman" ns0:eastAsia="宋体"/>
-          <ns0:b ns0:val="0"/>
-          <ns0:color ns0:val="000000"/>
-          <ns0:sz ns0:val="24"/>
-        </ns0:rPr>
-        <ns0:t xml:space="preserve"> 预案维护、资源台账、值班打卡、演练评估等日常工作持续积累可用于事件处置的基础数据和经验。</ns0:t>
-      </ns0:r>
-    </ns0:p>
-    <ns0:p>
-      <ns0:pPr>
-        <ns0:pStyle ns0:val="a4"/>
-        <ns0:widowControl/>
-      </ns0:pPr>
-      <ns0:r>
-        <ns0:rPr>
-          <ns0:rFonts ns0:ascii="Times New Roman" ns0:hAnsi="Times New Roman" ns0:eastAsia="宋体"/>
-          <ns0:b ns0:val="0"/>
-          <ns0:color ns0:val="000000"/>
-          <ns0:sz ns0:val="24"/>
-        </ns0:rPr>
-        <ns0:t xml:space="preserve">• </ns0:t>
-      </ns0:r>
-      <ns0:r>
-        <ns0:rPr>
-          <ns0:rFonts ns0:ascii="Times New Roman" ns0:hAnsi="Times New Roman" ns0:eastAsia="宋体"/>
-          <ns0:b/>
-          <ns0:color ns0:val="000000"/>
-          <ns0:sz ns0:val="24"/>
-        </ns0:rPr>
-        <ns0:t>管理规范与留痕价值。</ns0:t>
-      </ns0:r>
-      <ns0:r>
-        <ns0:rPr>
-          <ns0:rFonts ns0:ascii="Times New Roman" ns0:hAnsi="Times New Roman" ns0:eastAsia="宋体"/>
-          <ns0:b ns0:val="0"/>
-          <ns0:color ns0:val="000000"/>
-          <ns0:sz ns0:val="24"/>
-        </ns0:rPr>
-        <ns0:t xml:space="preserve"> 事件、任务、审批、反馈、演练、评估与调查的结构化记录，有助于事后复盘、预案修订和持续改进。</ns0:t>
-      </ns0:r>
-    </ns0:p>
-    <ns0:p>
-      <ns0:pPr>
-        <ns0:widowControl/>
-      </ns0:pPr>
-      <ns0:r>
-        <ns0:rPr>
-          <ns0:rFonts ns0:ascii="Times New Roman" ns0:hAnsi="Times New Roman" ns0:eastAsia="宋体"/>
-          <ns0:b ns0:val="0"/>
-          <ns0:color ns0:val="000000"/>
-          <ns0:sz ns0:val="24"/>
-        </ns0:rPr>
-        <ns0:t>本建议书不作无来源的成本节约、效率提升或收益比例承诺。</ns0:t>
-      </ns0:r>
-    </ns0:p>
-    <ns0:p>
-      <ns0:pPr>
-        <ns0:pStyle ns0:val="2"/>
-      </ns0:pPr>
-      <ns0:r>
-        <ns0:t>5.2 可行性基础</ns0:t>
-      </ns0:r>
-    </ns0:p>
-    <ns0:p>
-      <ns0:pPr>
-        <ns0:widowControl/>
-      </ns0:pPr>
-      <ns0:r>
-        <ns0:rPr>
-          <ns0:rFonts ns0:ascii="Times New Roman" ns0:hAnsi="Times New Roman" ns0:eastAsia="宋体"/>
-          <ns0:b ns0:val="0"/>
-          <ns0:color ns0:val="000000"/>
-          <ns0:sz ns0:val="24"/>
-        </ns0:rPr>
-        <ns0:t>项目具备明确的业务目标、功能范围、验收指标和既有系统融合边界；甲方既有基础系统、私有部署环境、地图与业务数据等外部条件，以及乙方的软件适配、联调和验证责任，均已在基线中明确。实施可行性仍依赖接口资料、账号权限、联调窗口、环境容量与基础数据按计划提供，并应通过后续技术验证、计划与风险管理持续控制。</ns0:t>
-      </ns0:r>
-    </ns0:p>
-    <ns0:p>
-      <ns0:pPr>
-        <ns0:pStyle ns0:val="1"/>
-      </ns0:pPr>
-      <ns0:r>
+        <ns0:spacing ns0:before="240" ns0:after="160"/>
+      </ns0:pPr>
+      <ns0:r>
+        <ns0:rPr>
+          <ns0:rFonts ns0:eastAsia="黑体"/>
+        </ns0:rPr>
         <ns0:t>6 主要风险及应对思路</ns0:t>
       </ns0:r>
     </ns0:p>
     <ns0:tbl>
       <ns0:tblPr>
-        <ns0:tblW ns0:type="auto" ns0:w="0"/>
+        <ns0:tblW ns0:type="dxa" ns0:w="9026"/>
         <ns0:jc ns0:val="center"/>
         <ns0:tblLayout ns0:type="fixed"/>
         <ns0:tblLook ns0:firstColumn="1" ns0:firstRow="1" ns0:lastColumn="0" ns0:lastRow="0" ns0:noHBand="0" ns0:noVBand="1" ns0:val="04A0"/>
@@ -3268,14 +3046,16 @@
     </ns0:p>
     <ns0:p>
       <ns0:pPr>
-        <ns0:widowControl/>
-      </ns0:pPr>
-      <ns0:r>
-        <ns0:rPr>
-          <ns0:rFonts ns0:ascii="Times New Roman" ns0:hAnsi="Times New Roman" ns0:eastAsia="宋体"/>
+        <ns0:ind ns0:firstLine="475"/>
+        <ns0:spacing ns0:after="100" ns0:line="360" ns0:lineRule="auto"/>
+      </ns0:pPr>
+      <ns0:r>
+        <ns0:rPr>
           <ns0:b ns0:val="0"/>
+          <ns0:rFonts ns0:eastAsia="宋体"/>
+          <ns0:sz ns0:val="24"/>
+          <ns0:szCs ns0:val="24"/>
           <ns0:color ns0:val="000000"/>
-          <ns0:sz ns0:val="24"/>
         </ns0:rPr>
         <ns0:t>本节为初步风险识别；正式风险登记册由 后续风险管理 建立并维护。</ns0:t>
       </ns0:r>
@@ -3283,31 +3063,38 @@
     <ns0:p>
       <ns0:pPr>
         <ns0:pStyle ns0:val="1"/>
-      </ns0:pPr>
-      <ns0:r>
+        <ns0:spacing ns0:before="240" ns0:after="160"/>
+      </ns0:pPr>
+      <ns0:r>
+        <ns0:rPr>
+          <ns0:rFonts ns0:eastAsia="黑体"/>
+        </ns0:rPr>
         <ns0:t>7 结论与建议</ns0:t>
       </ns0:r>
     </ns0:p>
     <ns0:p>
       <ns0:pPr>
-        <ns0:widowControl/>
-      </ns0:pPr>
-      <ns0:r>
-        <ns0:rPr>
-          <ns0:rFonts ns0:ascii="Times New Roman" ns0:hAnsi="Times New Roman" ns0:eastAsia="宋体"/>
+        <ns0:ind ns0:firstLine="475"/>
+        <ns0:spacing ns0:after="100" ns0:line="360" ns0:lineRule="auto"/>
+      </ns0:pPr>
+      <ns0:r>
+        <ns0:rPr>
           <ns0:b ns0:val="0"/>
+          <ns0:rFonts ns0:eastAsia="宋体"/>
+          <ns0:sz ns0:val="24"/>
+          <ns0:szCs ns0:val="24"/>
           <ns0:color ns0:val="000000"/>
-          <ns0:sz ns0:val="24"/>
         </ns0:rPr>
         <ns0:t>本项目围绕博物馆应急准备、指挥调度、移动处置和事后改进的连续业务链建设软件与接口联动能力，建设范围、范围外边界及甲乙双方责任已由 当前编标基线 冻结；其中 12 项澄清属于甲方/招标人（课程模拟）书面裁决，仅用于解释本课程模拟项目的需求歧义和当前编标基线，不作为真实甲方正式法律文件。总体技术方案 已完成并形成 V0.6 稳定技术结论，建议以冻结基线和该技术结论作为后续编标、项目计划、风险登记册及技术投标书整合的依据。</ns0:t>
       </ns0:r>
     </ns0:p>
     <ns0:sectPr ns0:rsidR="00890094">
       <ns0:footerReference ns0:type="default" ns2:id="rId9"/>
+      <ns0:docGrid ns0:linePitch="360"/>
+      <ns0:headerReference ns0:type="default" ns2:id="rId12"/>
       <ns0:pgSz ns0:w="11906" ns0:h="16838"/>
       <ns0:pgMar ns0:top="1440" ns0:right="1440" ns0:bottom="1440" ns0:left="1440" ns0:header="708" ns0:footer="708" ns0:gutter="0"/>
       <ns0:cols ns0:space="720"/>
-      <ns0:docGrid ns0:linePitch="360"/>
     </ns0:sectPr>
   </ns0:body>
 </ns0:document>
@@ -3340,42 +3127,42 @@
     </ns0:pPr>
     <ns0:r>
       <ns0:rPr>
-        <ns0:color ns0:val="000000"/>
         <ns0:sz ns0:val="18"/>
         <ns0:szCs ns0:val="18"/>
+        <ns0:color ns0:val="000000"/>
       </ns0:rPr>
       <ns0:fldChar ns0:fldCharType="begin"/>
     </ns0:r>
     <ns0:r>
       <ns0:rPr>
-        <ns0:color ns0:val="000000"/>
         <ns0:sz ns0:val="18"/>
         <ns0:szCs ns0:val="18"/>
+        <ns0:color ns0:val="000000"/>
       </ns0:rPr>
       <ns0:instrText>PAGE</ns0:instrText>
     </ns0:r>
     <ns0:r>
       <ns0:rPr>
-        <ns0:color ns0:val="000000"/>
         <ns0:sz ns0:val="18"/>
         <ns0:szCs ns0:val="18"/>
+        <ns0:color ns0:val="000000"/>
       </ns0:rPr>
       <ns0:fldChar ns0:fldCharType="separate"/>
     </ns0:r>
     <ns0:r ns0:rsidR="00EC79DE">
       <ns0:rPr>
         <ns0:noProof/>
-        <ns0:color ns0:val="000000"/>
         <ns0:sz ns0:val="18"/>
         <ns0:szCs ns0:val="18"/>
+        <ns0:color ns0:val="000000"/>
       </ns0:rPr>
       <ns0:t>1</ns0:t>
     </ns0:r>
     <ns0:r>
       <ns0:rPr>
-        <ns0:color ns0:val="000000"/>
         <ns0:sz ns0:val="18"/>
         <ns0:szCs ns0:val="18"/>
+        <ns0:color ns0:val="000000"/>
       </ns0:rPr>
       <ns0:fldChar ns0:fldCharType="end"/>
     </ns0:r>
@@ -3400,6 +3187,16 @@
     </ns0:p>
   </ns0:footnote>
 </ns0:footnotes>
+</file>
+
+<file path=word/header1.xml><?xml version="1.0" encoding="utf-8"?>
+<w:hdr xmlns:m="http://schemas.openxmlformats.org/officeDocument/2006/math" xmlns:mc="http://schemas.openxmlformats.org/markup-compatibility/2006" xmlns:mo="http://schemas.microsoft.com/office/mac/office/2008/main" xmlns:mv="urn:schemas-microsoft-com:mac:vml" xmlns:o="urn:schemas-microsoft-com:office:office" xmlns:r="http://schemas.openxmlformats.org/officeDocument/2006/relationships" xmlns:v="urn:schemas-microsoft-com:vml" xmlns:w10="urn:schemas-microsoft-com:office:word" xmlns:w14="http://schemas.microsoft.com/office/word/2010/wordml" xmlns:w="http://schemas.openxmlformats.org/wordprocessingml/2006/main" xmlns:wne="http://schemas.microsoft.com/office/word/2006/wordml" xmlns:wp14="http://schemas.microsoft.com/office/word/2010/wordprocessingDrawing" xmlns:wp="http://schemas.openxmlformats.org/drawingml/2006/wordprocessingDrawing" xmlns:wpc="http://schemas.microsoft.com/office/word/2010/wordprocessingCanvas" xmlns:wpg="http://schemas.microsoft.com/office/word/2010/wordprocessingGroup" xmlns:wpi="http://schemas.microsoft.com/office/word/2010/wordprocessingInk" xmlns:wps="http://schemas.microsoft.com/office/word/2010/wordprocessingShape" mc:Ignorable="w14 wp14">
+  <w:p>
+    <w:pPr>
+      <w:pStyle w:val="Header"/>
+    </w:pPr>
+  </w:p>
+</w:hdr>
 </file>
 
 <file path=word/numbering.xml><?xml version="1.0" encoding="utf-8"?>
@@ -3900,14 +3697,14 @@
     <ns0:name ns0:val="heading 1"/>
     <ns0:uiPriority ns0:val="9"/>
     <ns0:qFormat/>
+    <ns0:pPr>
+      <ns0:outlineLvl ns0:val="0"/>
+    </ns0:pPr>
     <ns0:rPr>
       <ns0:color ns0:val="000000"/>
       <ns0:sz ns0:val="32"/>
       <ns0:szCs ns0:val="32"/>
     </ns0:rPr>
-    <ns0:pPr>
-      <ns0:outlineLvl ns0:val="0"/>
-    </ns0:pPr>
   </ns0:style>
   <ns0:style ns0:type="paragraph" ns0:styleId="2">
     <ns0:name ns0:val="heading 2"/>
@@ -3915,14 +3712,14 @@
     <ns0:semiHidden/>
     <ns0:unhideWhenUsed/>
     <ns0:qFormat/>
+    <ns0:pPr>
+      <ns0:outlineLvl ns0:val="1"/>
+    </ns0:pPr>
     <ns0:rPr>
       <ns0:color ns0:val="000000"/>
       <ns0:sz ns0:val="26"/>
       <ns0:szCs ns0:val="26"/>
     </ns0:rPr>
-    <ns0:pPr>
-      <ns0:outlineLvl ns0:val="1"/>
-    </ns0:pPr>
   </ns0:style>
   <ns0:style ns0:type="paragraph" ns0:styleId="3">
     <ns0:name ns0:val="heading 3"/>
@@ -3930,14 +3727,14 @@
     <ns0:semiHidden/>
     <ns0:unhideWhenUsed/>
     <ns0:qFormat/>
+    <ns0:pPr>
+      <ns0:outlineLvl ns0:val="2"/>
+    </ns0:pPr>
     <ns0:rPr>
       <ns0:color ns0:val="000000"/>
       <ns0:sz ns0:val="24"/>
       <ns0:szCs ns0:val="24"/>
     </ns0:rPr>
-    <ns0:pPr>
-      <ns0:outlineLvl ns0:val="2"/>
-    </ns0:pPr>
   </ns0:style>
   <ns0:style ns0:type="paragraph" ns0:styleId="4">
     <ns0:name ns0:val="heading 4"/>

</xml_diff>

<commit_message>
docs: resolve deliverable confirmation fields
</commit_message>
<xml_diff>
--- a/docs/deliverables/01-项目建议书.docx
+++ b/docs/deliverables/01-项目建议书.docx
@@ -13,7 +13,7 @@
           <ns0:sz ns0:val="24"/>
           <ns0:color ns0:val="000000"/>
         </ns0:rPr>
-        <ns0:t>文档编号：01　　版本号：V1.2</ns0:t>
+        <ns0:t>文档编号：YJGL-G1-02　　版本号：V1.2</ns0:t>
       </ns0:r>
     </ns0:p>
     <ns0:p>
@@ -77,7 +77,7 @@
           <ns0:sz ns0:val="32"/>
           <ns0:color ns0:val="000000"/>
         </ns0:rPr>
-        <ns0:t>编制单位：项目编制组</ns0:t>
+        <ns0:t>编制单位：020202项目组</ns0:t>
       </ns0:r>
     </ns0:p>
     <ns0:p>

</xml_diff>